<commit_message>
test(layout): save text-and-spacing from Word again, with its headings in Calibri
The committed save had the headings in Calibri Light, which the layout now stops at, so compare-layout failed on its 11
headings and number of pages. All 114 headings of the documents saved from Word are now on Word's page.

Co-Authored-By: Claude Opus 5.5 <noreply@anthropic.com>
Claude-Session: https://claude.ai/code/session_01NijyutGmb3bNR3dNRWJken
</commit_message>
<xml_diff>
--- a/scripts/layout-probes/text-and-spacing.word.docx
+++ b/scripts/layout-probes/text-and-spacing.word.docx
@@ -5,8 +5,9 @@
     <w:sdt>
       <w:sdtPr>
         <w:alias w:val="Contents"/>
-        <w:id w:val="275847299"/>
+        <w:id w:val="-718899007"/>
       </w:sdtPr>
+      <w:sdtEndPr/>
       <w:sdtContent>
         <w:p>
           <w:pPr>
@@ -370,264 +371,2146 @@
           <w:sz w:val="18"/>
           <w:szCs w:val="18"/>
         </w:rPr>
-        <w:t>a described of the ferry valley measurements and the the careful levels of from extraordinarily river times letter seventeen rainfall, crossing a described of the ferry valley measurements and the the careful levels of from extraordinarily river times letter seventeen rainfall, crossing a described of the ferry valley measurements and the the careful levels of from extraordinarily river times letter seventeen rainfall, crossing a described of the ferry valley measurements and the the careful levels of from extraordinarily river times</w:t>
-      </w:r>
-    </w:p>
-    <w:p>
-      <w:r>
-        <w:t>the careful levels of from extraordinarily river times letter seventeen rainfall, crossing a described of the ferry valley measurements and the the careful levels of from extraordinarily river times letter seventeen rainfall, crossing a described of the ferry valley measurements and the the careful levels of from extraordinarily river times letter seventeen rainfall, crossing a described of the ferry valley measurements and the the careful levels of from extraordinarily river times letter seventeen rainfall, crossing a described of the ferry valley measurements and the the careful levels of from extraordinarily river times letter seventeen rainfall, crossing a described of the ferry valley measurements and the the careful levels of from extraordinarily river times letter seventeen rainfall, crossing a described of</w:t>
-      </w:r>
-    </w:p>
-    <w:p>
-      <w:r>
-        <w:rPr>
-          <w:sz w:val="28"/>
-          <w:szCs w:val="28"/>
-        </w:rPr>
-        <w:t xml:space="preserve">seventeen rainfall, crossing a described of the ferry valley measurements and the the careful levels of from extraordinarily river times letter seventeen rainfall, crossing a described of the ferry valley measurements and the the careful levels of from extraordinarily river times letter seventeen rainfall, crossing a described of the ferry valley measurements and the the careful levels of from extraordinarily river times letter seventeen rainfall, crossing a described of the ferry valley measurements and the the careful levels of from extraordinarily river times letter seventeen rainfall, crossing a described of the ferry valley measurements and the the careful levels of from extraordinarily river times letter seventeen rainfall, crossing a described of the ferry valley </w:t>
-      </w:r>
-      <w:r>
-        <w:rPr>
-          <w:sz w:val="28"/>
-          <w:szCs w:val="28"/>
-        </w:rPr>
-        <w:lastRenderedPageBreak/>
-        <w:t>measurements and the the careful levels of from extraordinarily river times letter seventeen rainfall, crossing a described of the ferry valley measurements and the the careful levels of from extraordinarily river times letter seventeen rainfall, crossing a described of the ferry valley measurements and the the</w:t>
-      </w:r>
-    </w:p>
-    <w:p>
-      <w:r>
-        <w:rPr>
-          <w:b/>
-          <w:bCs/>
-        </w:rPr>
-        <w:t>a described of the ferry valley measurements and the the careful levels of from extraordinarily river times letter seventeen rainfall, crossing a described of the ferry valley measurements and the the careful levels of from extraordinarily river times letter seventeen rainfall, crossing a described of the ferry valley measurements and the the careful levels of from extraordinarily river times letter seventeen rainfall, crossing a described of the ferry valley measurements and the the careful levels of from extraordinarily river times letter seventeen rainfall, crossing a described of the ferry valley measurements and the the careful levels of from extraordinarily river</w:t>
-      </w:r>
-    </w:p>
-    <w:p>
-      <w:pPr>
-        <w:pStyle w:val="Heading1"/>
-      </w:pPr>
-      <w:bookmarkStart w:id="1" w:name="_Toc2"/>
-      <w:r>
-        <w:t>Text in Cambria</w:t>
-      </w:r>
-      <w:bookmarkEnd w:id="1"/>
-    </w:p>
-    <w:p>
-      <w:r>
-        <w:rPr>
-          <w:rFonts w:ascii="Cambria" w:eastAsia="Cambria" w:hAnsi="Cambria" w:cs="Cambria"/>
+        <w:t xml:space="preserve">a described of the ferry valley measurements and the </w:t>
+      </w:r>
+      <w:proofErr w:type="spellStart"/>
+      <w:r>
+        <w:rPr>
           <w:sz w:val="18"/>
           <w:szCs w:val="18"/>
         </w:rPr>
-        <w:t>the careful levels of from extraordinarily river times letter seventeen rainfall, crossing a described of the ferry valley measurements and the the careful levels of from extraordinarily river times letter seventeen rainfall, crossing a described of the ferry valley measurements and the the careful levels of from extraordinarily river times letter seventeen rainfall, crossing a described of the ferry valley measurements and the the careful levels of from extraordinarily river times letter seventeen rainfall, crossing a described of the ferry</w:t>
-      </w:r>
-    </w:p>
-    <w:p>
-      <w:r>
-        <w:rPr>
-          <w:rFonts w:ascii="Cambria" w:eastAsia="Cambria" w:hAnsi="Cambria" w:cs="Cambria"/>
-        </w:rPr>
-        <w:t>seventeen rainfall, crossing a described of the ferry valley measurements and the the careful levels of from extraordinarily river times letter seventeen rainfall, crossing a described of the ferry valley measurements and the the careful levels of from extraordinarily river times letter seventeen rainfall, crossing a described of the ferry valley measurements and the the careful levels of from extraordinarily river times letter seventeen rainfall, crossing a described of the ferry valley measurements and the the careful levels of from extraordinarily river times letter seventeen rainfall, crossing a described of the ferry valley measurements and the the careful levels of from extraordinarily river times letter seventeen rainfall, crossing a described of the ferry valley measurements and the the careful levels</w:t>
-      </w:r>
-    </w:p>
-    <w:p>
-      <w:r>
-        <w:rPr>
-          <w:rFonts w:ascii="Cambria" w:eastAsia="Cambria" w:hAnsi="Cambria" w:cs="Cambria"/>
-          <w:sz w:val="28"/>
-          <w:szCs w:val="28"/>
-        </w:rPr>
-        <w:t>measurements and the the careful levels of from extraordinarily river times letter seventeen rainfall, crossing a described of the ferry valley measurements and the the careful levels of from extraordinarily river times letter seventeen rainfall, crossing a described of the ferry valley measurements and the the careful levels of from extraordinarily river times letter seventeen rainfall, crossing a described of the ferry valley measurements and the the careful levels of from extraordinarily river times letter seventeen rainfall, crossing a described of the ferry valley measurements and the the careful levels of from extraordinarily river times letter seventeen rainfall, crossing a described of the ferry valley measurements and the the careful levels of from extraordinarily river times letter seventeen rainfall, crossing a described of the ferry valley measurements and the the careful levels of from extraordinarily river times letter seventeen rainfall, crossing a described of the ferry valley measurements and the the careful levels of from extraordinarily river times letter seventeen</w:t>
-      </w:r>
-    </w:p>
-    <w:p>
-      <w:r>
-        <w:rPr>
-          <w:rFonts w:ascii="Cambria" w:eastAsia="Cambria" w:hAnsi="Cambria" w:cs="Cambria"/>
-          <w:b/>
-          <w:bCs/>
-        </w:rPr>
-        <w:lastRenderedPageBreak/>
-        <w:t>seventeen rainfall, crossing a described of the ferry valley measurements and the the careful levels of from extraordinarily river times letter seventeen rainfall, crossing a described of the ferry valley measurements and the the careful levels of from extraordinarily river times letter seventeen rainfall, crossing a described of the ferry valley measurements and the the careful levels of from extraordinarily river times letter seventeen rainfall, crossing a described of the ferry valley measurements and the the careful levels of from extraordinarily river times letter seventeen rainfall, crossing a described of the ferry valley measurements and the the careful levels of</w:t>
-      </w:r>
-    </w:p>
-    <w:p>
-      <w:pPr>
-        <w:pStyle w:val="Heading1"/>
-      </w:pPr>
-      <w:bookmarkStart w:id="2" w:name="_Toc3"/>
-      <w:r>
-        <w:t>Text in Arial</w:t>
-      </w:r>
-      <w:bookmarkEnd w:id="2"/>
-    </w:p>
-    <w:p>
-      <w:r>
-        <w:rPr>
-          <w:rFonts w:ascii="Arial" w:eastAsia="Arial" w:hAnsi="Arial" w:cs="Arial"/>
+        <w:t>the</w:t>
+      </w:r>
+      <w:proofErr w:type="spellEnd"/>
+      <w:r>
+        <w:rPr>
           <w:sz w:val="18"/>
           <w:szCs w:val="18"/>
         </w:rPr>
-        <w:t>seventeen rainfall, crossing a described of the ferry valley measurements and the the careful levels of from extraordinarily river times letter seventeen rainfall, crossing a described of the ferry valley measurements and the the careful levels of from extraordinarily river times letter seventeen rainfall, crossing a described of the ferry valley measurements and the the careful levels of from extraordinarily river times letter seventeen rainfall, crossing a described of the ferry valley measurements and the the careful levels of from</w:t>
-      </w:r>
-    </w:p>
-    <w:p>
-      <w:r>
-        <w:rPr>
-          <w:rFonts w:ascii="Arial" w:eastAsia="Arial" w:hAnsi="Arial" w:cs="Arial"/>
-        </w:rPr>
-        <w:t>measurements and the the careful levels of from extraordinarily river times letter seventeen rainfall, crossing a described of the ferry valley measurements and the the careful levels of from extraordinarily river times letter seventeen rainfall, crossing a described of the ferry valley measurements and the the careful levels of from extraordinarily river times letter seventeen rainfall, crossing a described of the ferry valley measurements and the the careful levels of from extraordinarily river times letter seventeen rainfall, crossing a described of the ferry valley measurements and the the careful levels of from extraordinarily river times letter seventeen rainfall, crossing a described of the ferry valley measurements and the the careful levels of from extraordinarily river times letter seventeen rainfall, crossing</w:t>
-      </w:r>
-    </w:p>
-    <w:p>
-      <w:r>
-        <w:rPr>
-          <w:rFonts w:ascii="Arial" w:eastAsia="Arial" w:hAnsi="Arial" w:cs="Arial"/>
-          <w:sz w:val="28"/>
-          <w:szCs w:val="28"/>
-        </w:rPr>
-        <w:t>river times letter seventeen rainfall, crossing a described of the ferry valley measurements and the the careful levels of from extraordinarily river times letter seventeen rainfall, crossing a described of the ferry valley measurements and the the careful levels of from extraordinarily river times letter seventeen rainfall, crossing a described of the ferry valley measurements and the the careful levels of from extraordinarily river times letter seventeen rainfall, crossing a described of the ferry valley measurements and the the careful levels of from extraordinarily river times letter seventeen rainfall, crossing a described of the ferry valley measurements and the the careful levels of from extraordinarily river times letter seventeen rainfall, crossing a described of the ferry valley measurements and the the careful levels of from extraordinarily river times letter seventeen rainfall, crossing a described of the ferry valley measurements and the the careful levels of from extraordinarily river times letter seventeen rainfall, crossing a described of the ferry valley measurements</w:t>
-      </w:r>
-    </w:p>
-    <w:p>
-      <w:r>
-        <w:rPr>
-          <w:rFonts w:ascii="Arial" w:eastAsia="Arial" w:hAnsi="Arial" w:cs="Arial"/>
-          <w:b/>
-          <w:bCs/>
-        </w:rPr>
-        <w:t xml:space="preserve">river times letter seventeen rainfall, crossing a described of the ferry valley measurements and the the careful levels of from extraordinarily river times letter seventeen rainfall, crossing a described of the ferry valley measurements and the the careful levels of from extraordinarily river times letter seventeen rainfall, crossing a described of the ferry valley measurements and the the careful levels of from </w:t>
-      </w:r>
-      <w:r>
-        <w:rPr>
-          <w:rFonts w:ascii="Arial" w:eastAsia="Arial" w:hAnsi="Arial" w:cs="Arial"/>
-          <w:b/>
-          <w:bCs/>
-        </w:rPr>
-        <w:lastRenderedPageBreak/>
-        <w:t>extraordinarily river times letter seventeen rainfall, crossing a described of the ferry valley measurements and the the careful levels of from extraordinarily river times letter seventeen rainfall, crossing a described of the ferry valley measurements and the the</w:t>
-      </w:r>
-    </w:p>
-    <w:p>
-      <w:pPr>
-        <w:pStyle w:val="Heading1"/>
-      </w:pPr>
-      <w:bookmarkStart w:id="3" w:name="_Toc4"/>
-      <w:r>
-        <w:t>Text in Times New Roman</w:t>
-      </w:r>
-      <w:bookmarkEnd w:id="3"/>
-    </w:p>
-    <w:p>
-      <w:r>
-        <w:rPr>
-          <w:rFonts w:ascii="Times New Roman" w:eastAsia="Times New Roman" w:hAnsi="Times New Roman" w:cs="Times New Roman"/>
+        <w:t xml:space="preserve"> careful levels of from extraordinarily river times letter seventeen rainfall, crossing a described of the ferry valley measurements and the </w:t>
+      </w:r>
+      <w:proofErr w:type="spellStart"/>
+      <w:r>
+        <w:rPr>
           <w:sz w:val="18"/>
           <w:szCs w:val="18"/>
         </w:rPr>
-        <w:t>measurements and the the careful levels of from extraordinarily river times letter seventeen rainfall, crossing a described of the ferry valley measurements and the the careful levels of from extraordinarily river times letter seventeen rainfall, crossing a described of the ferry valley measurements and the the careful levels of from extraordinarily river times letter seventeen rainfall, crossing a described of the ferry valley measurements and the the careful levels of from extraordinarily river times letter seventeen rainfall, crossing a described</w:t>
-      </w:r>
-    </w:p>
-    <w:p>
-      <w:r>
-        <w:rPr>
-          <w:rFonts w:ascii="Times New Roman" w:eastAsia="Times New Roman" w:hAnsi="Times New Roman" w:cs="Times New Roman"/>
-        </w:rPr>
-        <w:t>river times letter seventeen rainfall, crossing a described of the ferry valley measurements and the the careful levels of from extraordinarily river times letter seventeen rainfall, crossing a described of the ferry valley measurements and the the careful levels of from extraordinarily river times letter seventeen rainfall, crossing a described of the ferry valley measurements and the the careful levels of from extraordinarily river times letter seventeen rainfall, crossing a described of the ferry valley measurements and the the careful levels of from extraordinarily river times letter seventeen rainfall, crossing a described of the ferry valley measurements and the the careful levels of from extraordinarily river times letter seventeen rainfall, crossing a described of the ferry valley measurements and the</w:t>
-      </w:r>
-    </w:p>
-    <w:p>
-      <w:r>
-        <w:rPr>
-          <w:rFonts w:ascii="Times New Roman" w:eastAsia="Times New Roman" w:hAnsi="Times New Roman" w:cs="Times New Roman"/>
-          <w:sz w:val="28"/>
-          <w:szCs w:val="28"/>
-        </w:rPr>
-        <w:t>the ferry valley measurements and the the careful levels of from extraordinarily river times letter seventeen rainfall, crossing a described of the ferry valley measurements and the the careful levels of from extraordinarily river times letter seventeen rainfall, crossing a described of the ferry valley measurements and the the careful levels of from extraordinarily river times letter seventeen rainfall, crossing a described of the ferry valley measurements and the the careful levels of from extraordinarily river times letter seventeen rainfall, crossing a described of the ferry valley measurements and the the careful levels of from extraordinarily river times letter seventeen rainfall, crossing a described of the ferry valley measurements and the the careful levels of from extraordinarily river times letter seventeen rainfall, crossing a described of the ferry valley measurements and the the careful levels of from extraordinarily river times letter seventeen rainfall, crossing a described of the ferry valley measurements and the the careful levels of from extraordinarily river</w:t>
-      </w:r>
-    </w:p>
-    <w:p>
-      <w:r>
-        <w:rPr>
-          <w:rFonts w:ascii="Times New Roman" w:eastAsia="Times New Roman" w:hAnsi="Times New Roman" w:cs="Times New Roman"/>
-          <w:b/>
-          <w:bCs/>
-        </w:rPr>
-        <w:t>of from extraordinarily river times letter seventeen rainfall, crossing a described of the ferry valley measurements and the the careful levels of from extraordinarily river times letter seventeen rainfall, crossing a described of the ferry valley measurements and the the careful levels of from extraordinarily river times letter seventeen rainfall, crossing a described of the ferry valley measurements and the the careful levels of from extraordinarily river times letter seventeen rainfall, crossing a described of the ferry valley measurements and the the careful levels of from extraordinarily river times letter seventeen rainfall, crossing a described of the ferry valley measurements</w:t>
-      </w:r>
-    </w:p>
-    <w:p>
-      <w:pPr>
-        <w:pStyle w:val="Heading1"/>
-      </w:pPr>
-      <w:bookmarkStart w:id="4" w:name="_Toc5"/>
-      <w:r>
-        <w:t>Text in Courier New</w:t>
-      </w:r>
-      <w:bookmarkEnd w:id="4"/>
-    </w:p>
-    <w:p>
-      <w:r>
-        <w:rPr>
-          <w:rFonts w:ascii="Courier New" w:eastAsia="Courier New" w:hAnsi="Courier New" w:cs="Courier New"/>
+        <w:t>the</w:t>
+      </w:r>
+      <w:proofErr w:type="spellEnd"/>
+      <w:r>
+        <w:rPr>
           <w:sz w:val="18"/>
           <w:szCs w:val="18"/>
         </w:rPr>
-        <w:t xml:space="preserve">river times letter seventeen rainfall, crossing a described of the ferry valley measurements and the the careful levels of from extraordinarily river times letter </w:t>
-      </w:r>
-      <w:r>
-        <w:rPr>
-          <w:rFonts w:ascii="Courier New" w:eastAsia="Courier New" w:hAnsi="Courier New" w:cs="Courier New"/>
+        <w:t xml:space="preserve"> careful levels of from extraordinarily river times letter seventeen rainfall, crossing a described of the ferry valley measurements and the </w:t>
+      </w:r>
+      <w:proofErr w:type="spellStart"/>
+      <w:r>
+        <w:rPr>
           <w:sz w:val="18"/>
           <w:szCs w:val="18"/>
         </w:rPr>
+        <w:t>the</w:t>
+      </w:r>
+      <w:proofErr w:type="spellEnd"/>
+      <w:r>
+        <w:rPr>
+          <w:sz w:val="18"/>
+          <w:szCs w:val="18"/>
+        </w:rPr>
+        <w:t xml:space="preserve"> careful levels of from extraordinarily river times letter seventeen rainfall, crossing a described of the ferry valley measurements and the </w:t>
+      </w:r>
+      <w:proofErr w:type="spellStart"/>
+      <w:r>
+        <w:rPr>
+          <w:sz w:val="18"/>
+          <w:szCs w:val="18"/>
+        </w:rPr>
+        <w:t>the</w:t>
+      </w:r>
+      <w:proofErr w:type="spellEnd"/>
+      <w:r>
+        <w:rPr>
+          <w:sz w:val="18"/>
+          <w:szCs w:val="18"/>
+        </w:rPr>
+        <w:t xml:space="preserve"> careful levels of from extraordinarily river times</w:t>
+      </w:r>
+    </w:p>
+    <w:p>
+      <w:r>
+        <w:t xml:space="preserve">the careful levels of from extraordinarily river times letter seventeen rainfall, crossing a described of the ferry valley measurements and the </w:t>
+      </w:r>
+      <w:proofErr w:type="spellStart"/>
+      <w:r>
+        <w:t>the</w:t>
+      </w:r>
+      <w:proofErr w:type="spellEnd"/>
+      <w:r>
+        <w:t xml:space="preserve"> careful levels of from extraordinarily river times letter seventeen rainfall, crossing a described of the ferry valley measurements and the </w:t>
+      </w:r>
+      <w:proofErr w:type="spellStart"/>
+      <w:r>
+        <w:t>the</w:t>
+      </w:r>
+      <w:proofErr w:type="spellEnd"/>
+      <w:r>
+        <w:t xml:space="preserve"> careful levels of from extraordinarily river times letter seventeen rainfall, crossing a described of the ferry valley measurements and the </w:t>
+      </w:r>
+      <w:proofErr w:type="spellStart"/>
+      <w:r>
+        <w:t>the</w:t>
+      </w:r>
+      <w:proofErr w:type="spellEnd"/>
+      <w:r>
+        <w:t xml:space="preserve"> careful levels of from extraordinarily river times letter seventeen rainfall, crossing a described of the ferry valley measurements and the </w:t>
+      </w:r>
+      <w:proofErr w:type="spellStart"/>
+      <w:r>
+        <w:t>the</w:t>
+      </w:r>
+      <w:proofErr w:type="spellEnd"/>
+      <w:r>
+        <w:t xml:space="preserve"> careful levels of from extraordinarily river times letter seventeen rainfall</w:t>
+      </w:r>
+      <w:r>
+        <w:t xml:space="preserve">, crossing a described of the ferry valley measurements and the </w:t>
+      </w:r>
+      <w:proofErr w:type="spellStart"/>
+      <w:r>
+        <w:t>the</w:t>
+      </w:r>
+      <w:proofErr w:type="spellEnd"/>
+      <w:r>
+        <w:t xml:space="preserve"> careful levels of from extraordinarily river times letter seventeen rainfall, crossing a described of</w:t>
+      </w:r>
+    </w:p>
+    <w:p>
+      <w:r>
+        <w:rPr>
+          <w:sz w:val="28"/>
+          <w:szCs w:val="28"/>
+        </w:rPr>
+        <w:t xml:space="preserve">seventeen rainfall, crossing a described of the ferry valley measurements and the </w:t>
+      </w:r>
+      <w:proofErr w:type="spellStart"/>
+      <w:r>
+        <w:rPr>
+          <w:sz w:val="28"/>
+          <w:szCs w:val="28"/>
+        </w:rPr>
+        <w:t>the</w:t>
+      </w:r>
+      <w:proofErr w:type="spellEnd"/>
+      <w:r>
+        <w:rPr>
+          <w:sz w:val="28"/>
+          <w:szCs w:val="28"/>
+        </w:rPr>
+        <w:t xml:space="preserve"> careful levels of from extraordinarily river times letter seventeen rainfall, crossing a described of the ferry valley measurements and the </w:t>
+      </w:r>
+      <w:proofErr w:type="spellStart"/>
+      <w:r>
+        <w:rPr>
+          <w:sz w:val="28"/>
+          <w:szCs w:val="28"/>
+        </w:rPr>
+        <w:t>the</w:t>
+      </w:r>
+      <w:proofErr w:type="spellEnd"/>
+      <w:r>
+        <w:rPr>
+          <w:sz w:val="28"/>
+          <w:szCs w:val="28"/>
+        </w:rPr>
+        <w:t xml:space="preserve"> careful levels of from extraordinarily river times letter seventeen rainfall, crossing a described of the ferry valley measurements and the </w:t>
+      </w:r>
+      <w:proofErr w:type="spellStart"/>
+      <w:r>
+        <w:rPr>
+          <w:sz w:val="28"/>
+          <w:szCs w:val="28"/>
+        </w:rPr>
+        <w:t>the</w:t>
+      </w:r>
+      <w:proofErr w:type="spellEnd"/>
+      <w:r>
+        <w:rPr>
+          <w:sz w:val="28"/>
+          <w:szCs w:val="28"/>
+        </w:rPr>
+        <w:t xml:space="preserve"> careful levels of from extraordinarily river times letter seventeen rainfall, crossing a described of the ferry valley measurements and the </w:t>
+      </w:r>
+      <w:proofErr w:type="spellStart"/>
+      <w:r>
+        <w:rPr>
+          <w:sz w:val="28"/>
+          <w:szCs w:val="28"/>
+        </w:rPr>
+        <w:t>the</w:t>
+      </w:r>
+      <w:proofErr w:type="spellEnd"/>
+      <w:r>
+        <w:rPr>
+          <w:sz w:val="28"/>
+          <w:szCs w:val="28"/>
+        </w:rPr>
+        <w:t xml:space="preserve"> careful levels of from extraordinarily river times letter seventeen rainfall</w:t>
+      </w:r>
+      <w:r>
+        <w:rPr>
+          <w:sz w:val="28"/>
+          <w:szCs w:val="28"/>
+        </w:rPr>
+        <w:t xml:space="preserve">, crossing a described of the ferry valley measurements and the </w:t>
+      </w:r>
+      <w:proofErr w:type="spellStart"/>
+      <w:r>
+        <w:rPr>
+          <w:sz w:val="28"/>
+          <w:szCs w:val="28"/>
+        </w:rPr>
+        <w:t>the</w:t>
+      </w:r>
+      <w:proofErr w:type="spellEnd"/>
+      <w:r>
+        <w:rPr>
+          <w:sz w:val="28"/>
+          <w:szCs w:val="28"/>
+        </w:rPr>
+        <w:t xml:space="preserve"> careful levels of from extraordinarily river times letter seventeen rainfall, crossing a described of the ferry valley </w:t>
+      </w:r>
+      <w:r>
+        <w:rPr>
+          <w:sz w:val="28"/>
+          <w:szCs w:val="28"/>
+        </w:rPr>
         <w:lastRenderedPageBreak/>
-        <w:t>seventeen rainfall, crossing a described of the ferry valley measurements and the the careful levels of from extraordinarily river times letter seventeen rainfall, crossing a described of the ferry valley measurements and the the careful levels of from extraordinarily river times letter seventeen rainfall, crossing a described of the ferry valley measurements and the the careful</w:t>
-      </w:r>
-    </w:p>
-    <w:p>
-      <w:r>
-        <w:rPr>
-          <w:rFonts w:ascii="Courier New" w:eastAsia="Courier New" w:hAnsi="Courier New" w:cs="Courier New"/>
-        </w:rPr>
-        <w:t>the ferry valley measurements and the the careful levels of from extraordinarily river times letter seventeen rainfall, crossing a described of the ferry valley measurements and the the careful levels of from extraordinarily river times letter seventeen rainfall, crossing a described of the ferry valley measurements and the the careful levels of from extraordinarily river times letter seventeen rainfall, crossing a described of the ferry valley measurements and the the careful levels of from extraordinarily river times letter seventeen rainfall, crossing a described of the ferry valley measurements and the the careful levels of from extraordinarily river times letter seventeen rainfall, crossing a described of the ferry valley measurements and the the careful levels of from extraordinarily river times letter</w:t>
-      </w:r>
-    </w:p>
-    <w:p>
-      <w:r>
-        <w:rPr>
-          <w:rFonts w:ascii="Courier New" w:eastAsia="Courier New" w:hAnsi="Courier New" w:cs="Courier New"/>
-          <w:sz w:val="28"/>
-          <w:szCs w:val="28"/>
-        </w:rPr>
-        <w:t>of from extraordinarily river times letter seventeen rainfall, crossing a described of the ferry valley measurements and the the careful levels of from extraordinarily river times letter seventeen rainfall, crossing a described of the ferry valley measurements and the the careful levels of from extraordinarily river times letter seventeen rainfall, crossing a described of the ferry valley measurements and the the careful levels of from extraordinarily river times letter seventeen rainfall, crossing a described of the ferry valley measurements and the the careful levels of from extraordinarily river times letter seventeen rainfall, crossing a described of the ferry valley measurements and the the careful levels of from extraordinarily river times letter seventeen rainfall, crossing a described of the ferry valley measurements and the the careful levels of from extraordinarily river times letter seventeen rainfall, crossing a described of the ferry valley measurements and the the careful levels of from extraordinarily river times letter seventeen rainfall, crossing a described of the</w:t>
-      </w:r>
-    </w:p>
-    <w:p>
-      <w:r>
-        <w:rPr>
-          <w:rFonts w:ascii="Courier New" w:eastAsia="Courier New" w:hAnsi="Courier New" w:cs="Courier New"/>
-          <w:b/>
-          <w:bCs/>
-        </w:rPr>
-        <w:t xml:space="preserve">the careful levels of from extraordinarily river times letter seventeen rainfall, crossing a described of the ferry valley measurements and the the careful levels of from extraordinarily </w:t>
-      </w:r>
-      <w:r>
-        <w:rPr>
-          <w:rFonts w:ascii="Courier New" w:eastAsia="Courier New" w:hAnsi="Courier New" w:cs="Courier New"/>
+        <w:t xml:space="preserve">measurements and the </w:t>
+      </w:r>
+      <w:proofErr w:type="spellStart"/>
+      <w:r>
+        <w:rPr>
+          <w:sz w:val="28"/>
+          <w:szCs w:val="28"/>
+        </w:rPr>
+        <w:t>the</w:t>
+      </w:r>
+      <w:proofErr w:type="spellEnd"/>
+      <w:r>
+        <w:rPr>
+          <w:sz w:val="28"/>
+          <w:szCs w:val="28"/>
+        </w:rPr>
+        <w:t xml:space="preserve"> careful levels of from extraordinarily river times letter seventeen rainfall, crossing a described of the ferry valley measurements and the </w:t>
+      </w:r>
+      <w:proofErr w:type="spellStart"/>
+      <w:r>
+        <w:rPr>
+          <w:sz w:val="28"/>
+          <w:szCs w:val="28"/>
+        </w:rPr>
+        <w:t>the</w:t>
+      </w:r>
+      <w:proofErr w:type="spellEnd"/>
+      <w:r>
+        <w:rPr>
+          <w:sz w:val="28"/>
+          <w:szCs w:val="28"/>
+        </w:rPr>
+        <w:t xml:space="preserve"> careful levels of from extraordinarily river times letter seventeen rainfall, crossing a described of the ferry valley measurements and the </w:t>
+      </w:r>
+      <w:proofErr w:type="spellStart"/>
+      <w:r>
+        <w:rPr>
+          <w:sz w:val="28"/>
+          <w:szCs w:val="28"/>
+        </w:rPr>
+        <w:t>the</w:t>
+      </w:r>
+      <w:proofErr w:type="spellEnd"/>
+    </w:p>
+    <w:p>
+      <w:r>
+        <w:rPr>
+          <w:b/>
+          <w:bCs/>
+        </w:rPr>
+        <w:t xml:space="preserve">a described of the ferry valley measurements and the </w:t>
+      </w:r>
+      <w:proofErr w:type="spellStart"/>
+      <w:r>
+        <w:rPr>
+          <w:b/>
+          <w:bCs/>
+        </w:rPr>
+        <w:t>the</w:t>
+      </w:r>
+      <w:proofErr w:type="spellEnd"/>
+      <w:r>
+        <w:rPr>
+          <w:b/>
+          <w:bCs/>
+        </w:rPr>
+        <w:t xml:space="preserve"> careful levels of from extraordinarily river times letter seventeen rainfall, crossing a described of the ferry valley measurements and the </w:t>
+      </w:r>
+      <w:proofErr w:type="spellStart"/>
+      <w:r>
+        <w:rPr>
+          <w:b/>
+          <w:bCs/>
+        </w:rPr>
+        <w:t>the</w:t>
+      </w:r>
+      <w:proofErr w:type="spellEnd"/>
+      <w:r>
+        <w:rPr>
+          <w:b/>
+          <w:bCs/>
+        </w:rPr>
+        <w:t xml:space="preserve"> careful levels of from extraordinarily river times letter seventeen rainfall, crossing a described of the ferry valley measurements and the </w:t>
+      </w:r>
+      <w:proofErr w:type="spellStart"/>
+      <w:r>
+        <w:rPr>
+          <w:b/>
+          <w:bCs/>
+        </w:rPr>
+        <w:t>the</w:t>
+      </w:r>
+      <w:proofErr w:type="spellEnd"/>
+      <w:r>
+        <w:rPr>
+          <w:b/>
+          <w:bCs/>
+        </w:rPr>
+        <w:t xml:space="preserve"> careful levels of from extraordinarily river times letter seventeen rainfall, crossing a described of the ferry valley measurements and the </w:t>
+      </w:r>
+      <w:proofErr w:type="spellStart"/>
+      <w:r>
+        <w:rPr>
+          <w:b/>
+          <w:bCs/>
+        </w:rPr>
+        <w:t>the</w:t>
+      </w:r>
+      <w:proofErr w:type="spellEnd"/>
+      <w:r>
+        <w:rPr>
+          <w:b/>
+          <w:bCs/>
+        </w:rPr>
+        <w:t xml:space="preserve"> careful levels of from extraordinarily river times letter seventeen rainfall</w:t>
+      </w:r>
+      <w:r>
+        <w:rPr>
+          <w:b/>
+          <w:bCs/>
+        </w:rPr>
+        <w:t xml:space="preserve">, crossing a described of the ferry valley measurements and the </w:t>
+      </w:r>
+      <w:proofErr w:type="spellStart"/>
+      <w:r>
+        <w:rPr>
+          <w:b/>
+          <w:bCs/>
+        </w:rPr>
+        <w:t>the</w:t>
+      </w:r>
+      <w:proofErr w:type="spellEnd"/>
+      <w:r>
+        <w:rPr>
+          <w:b/>
+          <w:bCs/>
+        </w:rPr>
+        <w:t xml:space="preserve"> careful levels of from extraordinarily river</w:t>
+      </w:r>
+    </w:p>
+    <w:p>
+      <w:pPr>
+        <w:pStyle w:val="Heading1"/>
+      </w:pPr>
+      <w:bookmarkStart w:id="1" w:name="_Toc2"/>
+      <w:r>
+        <w:t>Text in Cambria</w:t>
+      </w:r>
+      <w:bookmarkEnd w:id="1"/>
+    </w:p>
+    <w:p>
+      <w:r>
+        <w:rPr>
+          <w:rFonts w:ascii="Cambria" w:eastAsia="Cambria" w:hAnsi="Cambria" w:cs="Cambria"/>
+          <w:sz w:val="18"/>
+          <w:szCs w:val="18"/>
+        </w:rPr>
+        <w:t xml:space="preserve">the careful levels of from extraordinarily river times letter seventeen rainfall, crossing a described of the ferry valley measurements and the </w:t>
+      </w:r>
+      <w:proofErr w:type="spellStart"/>
+      <w:r>
+        <w:rPr>
+          <w:rFonts w:ascii="Cambria" w:eastAsia="Cambria" w:hAnsi="Cambria" w:cs="Cambria"/>
+          <w:sz w:val="18"/>
+          <w:szCs w:val="18"/>
+        </w:rPr>
+        <w:t>the</w:t>
+      </w:r>
+      <w:proofErr w:type="spellEnd"/>
+      <w:r>
+        <w:rPr>
+          <w:rFonts w:ascii="Cambria" w:eastAsia="Cambria" w:hAnsi="Cambria" w:cs="Cambria"/>
+          <w:sz w:val="18"/>
+          <w:szCs w:val="18"/>
+        </w:rPr>
+        <w:t xml:space="preserve"> careful levels of from extraordinarily river times letter seventeen rainfall, crossing a described of the ferry valley measurements and the </w:t>
+      </w:r>
+      <w:proofErr w:type="spellStart"/>
+      <w:r>
+        <w:rPr>
+          <w:rFonts w:ascii="Cambria" w:eastAsia="Cambria" w:hAnsi="Cambria" w:cs="Cambria"/>
+          <w:sz w:val="18"/>
+          <w:szCs w:val="18"/>
+        </w:rPr>
+        <w:t>the</w:t>
+      </w:r>
+      <w:proofErr w:type="spellEnd"/>
+      <w:r>
+        <w:rPr>
+          <w:rFonts w:ascii="Cambria" w:eastAsia="Cambria" w:hAnsi="Cambria" w:cs="Cambria"/>
+          <w:sz w:val="18"/>
+          <w:szCs w:val="18"/>
+        </w:rPr>
+        <w:t xml:space="preserve"> careful levels of from extraordinarily river times letter seventeen rainfall, crossing a described of the ferry valley measurements and the </w:t>
+      </w:r>
+      <w:proofErr w:type="spellStart"/>
+      <w:r>
+        <w:rPr>
+          <w:rFonts w:ascii="Cambria" w:eastAsia="Cambria" w:hAnsi="Cambria" w:cs="Cambria"/>
+          <w:sz w:val="18"/>
+          <w:szCs w:val="18"/>
+        </w:rPr>
+        <w:t>the</w:t>
+      </w:r>
+      <w:proofErr w:type="spellEnd"/>
+      <w:r>
+        <w:rPr>
+          <w:rFonts w:ascii="Cambria" w:eastAsia="Cambria" w:hAnsi="Cambria" w:cs="Cambria"/>
+          <w:sz w:val="18"/>
+          <w:szCs w:val="18"/>
+        </w:rPr>
+        <w:t xml:space="preserve"> careful levels of from extraordinarily river times letter seventeen rainfall, crossing a described of the ferry</w:t>
+      </w:r>
+    </w:p>
+    <w:p>
+      <w:r>
+        <w:rPr>
+          <w:rFonts w:ascii="Cambria" w:eastAsia="Cambria" w:hAnsi="Cambria" w:cs="Cambria"/>
+        </w:rPr>
+        <w:t xml:space="preserve">seventeen rainfall, crossing a described of the ferry valley measurements and the </w:t>
+      </w:r>
+      <w:proofErr w:type="spellStart"/>
+      <w:r>
+        <w:rPr>
+          <w:rFonts w:ascii="Cambria" w:eastAsia="Cambria" w:hAnsi="Cambria" w:cs="Cambria"/>
+        </w:rPr>
+        <w:t>the</w:t>
+      </w:r>
+      <w:proofErr w:type="spellEnd"/>
+      <w:r>
+        <w:rPr>
+          <w:rFonts w:ascii="Cambria" w:eastAsia="Cambria" w:hAnsi="Cambria" w:cs="Cambria"/>
+        </w:rPr>
+        <w:t xml:space="preserve"> careful levels of from extraordinarily river times letter seventeen rainfall, crossing a described of the ferry valley measurements and the </w:t>
+      </w:r>
+      <w:proofErr w:type="spellStart"/>
+      <w:r>
+        <w:rPr>
+          <w:rFonts w:ascii="Cambria" w:eastAsia="Cambria" w:hAnsi="Cambria" w:cs="Cambria"/>
+        </w:rPr>
+        <w:t>the</w:t>
+      </w:r>
+      <w:proofErr w:type="spellEnd"/>
+      <w:r>
+        <w:rPr>
+          <w:rFonts w:ascii="Cambria" w:eastAsia="Cambria" w:hAnsi="Cambria" w:cs="Cambria"/>
+        </w:rPr>
+        <w:t xml:space="preserve"> careful levels of from extraordinarily river times letter seventeen rainfall, crossing a described of the ferry valley measurements and the </w:t>
+      </w:r>
+      <w:proofErr w:type="spellStart"/>
+      <w:r>
+        <w:rPr>
+          <w:rFonts w:ascii="Cambria" w:eastAsia="Cambria" w:hAnsi="Cambria" w:cs="Cambria"/>
+        </w:rPr>
+        <w:t>the</w:t>
+      </w:r>
+      <w:proofErr w:type="spellEnd"/>
+      <w:r>
+        <w:rPr>
+          <w:rFonts w:ascii="Cambria" w:eastAsia="Cambria" w:hAnsi="Cambria" w:cs="Cambria"/>
+        </w:rPr>
+        <w:t xml:space="preserve"> careful levels of from extraordinarily river times letter seventeen rainfall, crossing a described of the ferry valley measurements and the </w:t>
+      </w:r>
+      <w:proofErr w:type="spellStart"/>
+      <w:r>
+        <w:rPr>
+          <w:rFonts w:ascii="Cambria" w:eastAsia="Cambria" w:hAnsi="Cambria" w:cs="Cambria"/>
+        </w:rPr>
+        <w:t>the</w:t>
+      </w:r>
+      <w:proofErr w:type="spellEnd"/>
+      <w:r>
+        <w:rPr>
+          <w:rFonts w:ascii="Cambria" w:eastAsia="Cambria" w:hAnsi="Cambria" w:cs="Cambria"/>
+        </w:rPr>
+        <w:t xml:space="preserve"> careful levels of from extraordinarily river times letter seventeen rainfall</w:t>
+      </w:r>
+      <w:r>
+        <w:rPr>
+          <w:rFonts w:ascii="Cambria" w:eastAsia="Cambria" w:hAnsi="Cambria" w:cs="Cambria"/>
+        </w:rPr>
+        <w:t xml:space="preserve">, crossing a described of the ferry valley measurements and the </w:t>
+      </w:r>
+      <w:proofErr w:type="spellStart"/>
+      <w:r>
+        <w:rPr>
+          <w:rFonts w:ascii="Cambria" w:eastAsia="Cambria" w:hAnsi="Cambria" w:cs="Cambria"/>
+        </w:rPr>
+        <w:t>the</w:t>
+      </w:r>
+      <w:proofErr w:type="spellEnd"/>
+      <w:r>
+        <w:rPr>
+          <w:rFonts w:ascii="Cambria" w:eastAsia="Cambria" w:hAnsi="Cambria" w:cs="Cambria"/>
+        </w:rPr>
+        <w:t xml:space="preserve"> careful levels of from extraordinarily river times letter seventeen rainfall, crossing a described of the ferry valley measurements and the </w:t>
+      </w:r>
+      <w:proofErr w:type="spellStart"/>
+      <w:r>
+        <w:rPr>
+          <w:rFonts w:ascii="Cambria" w:eastAsia="Cambria" w:hAnsi="Cambria" w:cs="Cambria"/>
+        </w:rPr>
+        <w:t>the</w:t>
+      </w:r>
+      <w:proofErr w:type="spellEnd"/>
+      <w:r>
+        <w:rPr>
+          <w:rFonts w:ascii="Cambria" w:eastAsia="Cambria" w:hAnsi="Cambria" w:cs="Cambria"/>
+        </w:rPr>
+        <w:t xml:space="preserve"> careful levels</w:t>
+      </w:r>
+    </w:p>
+    <w:p>
+      <w:r>
+        <w:rPr>
+          <w:rFonts w:ascii="Cambria" w:eastAsia="Cambria" w:hAnsi="Cambria" w:cs="Cambria"/>
+          <w:sz w:val="28"/>
+          <w:szCs w:val="28"/>
+        </w:rPr>
+        <w:t xml:space="preserve">measurements and the </w:t>
+      </w:r>
+      <w:proofErr w:type="spellStart"/>
+      <w:r>
+        <w:rPr>
+          <w:rFonts w:ascii="Cambria" w:eastAsia="Cambria" w:hAnsi="Cambria" w:cs="Cambria"/>
+          <w:sz w:val="28"/>
+          <w:szCs w:val="28"/>
+        </w:rPr>
+        <w:t>the</w:t>
+      </w:r>
+      <w:proofErr w:type="spellEnd"/>
+      <w:r>
+        <w:rPr>
+          <w:rFonts w:ascii="Cambria" w:eastAsia="Cambria" w:hAnsi="Cambria" w:cs="Cambria"/>
+          <w:sz w:val="28"/>
+          <w:szCs w:val="28"/>
+        </w:rPr>
+        <w:t xml:space="preserve"> careful levels of from extraordinarily river times letter seventeen rainfall, crossing a described of the ferry valley measurements and the </w:t>
+      </w:r>
+      <w:proofErr w:type="spellStart"/>
+      <w:r>
+        <w:rPr>
+          <w:rFonts w:ascii="Cambria" w:eastAsia="Cambria" w:hAnsi="Cambria" w:cs="Cambria"/>
+          <w:sz w:val="28"/>
+          <w:szCs w:val="28"/>
+        </w:rPr>
+        <w:t>the</w:t>
+      </w:r>
+      <w:proofErr w:type="spellEnd"/>
+      <w:r>
+        <w:rPr>
+          <w:rFonts w:ascii="Cambria" w:eastAsia="Cambria" w:hAnsi="Cambria" w:cs="Cambria"/>
+          <w:sz w:val="28"/>
+          <w:szCs w:val="28"/>
+        </w:rPr>
+        <w:t xml:space="preserve"> careful levels of from extraordinarily river times letter seventeen rainfall, crossing a described of the ferry valley measurements and the </w:t>
+      </w:r>
+      <w:proofErr w:type="spellStart"/>
+      <w:r>
+        <w:rPr>
+          <w:rFonts w:ascii="Cambria" w:eastAsia="Cambria" w:hAnsi="Cambria" w:cs="Cambria"/>
+          <w:sz w:val="28"/>
+          <w:szCs w:val="28"/>
+        </w:rPr>
+        <w:t>the</w:t>
+      </w:r>
+      <w:proofErr w:type="spellEnd"/>
+      <w:r>
+        <w:rPr>
+          <w:rFonts w:ascii="Cambria" w:eastAsia="Cambria" w:hAnsi="Cambria" w:cs="Cambria"/>
+          <w:sz w:val="28"/>
+          <w:szCs w:val="28"/>
+        </w:rPr>
+        <w:t xml:space="preserve"> careful levels of from extraordinarily river times letter seventeen rainfall, crossing a described of the ferry valley measurements and the </w:t>
+      </w:r>
+      <w:proofErr w:type="spellStart"/>
+      <w:r>
+        <w:rPr>
+          <w:rFonts w:ascii="Cambria" w:eastAsia="Cambria" w:hAnsi="Cambria" w:cs="Cambria"/>
+          <w:sz w:val="28"/>
+          <w:szCs w:val="28"/>
+        </w:rPr>
+        <w:t>the</w:t>
+      </w:r>
+      <w:proofErr w:type="spellEnd"/>
+      <w:r>
+        <w:rPr>
+          <w:rFonts w:ascii="Cambria" w:eastAsia="Cambria" w:hAnsi="Cambria" w:cs="Cambria"/>
+          <w:sz w:val="28"/>
+          <w:szCs w:val="28"/>
+        </w:rPr>
+        <w:t xml:space="preserve"> careful levels of from extraordinarily river times letter seventeen rainfall</w:t>
+      </w:r>
+      <w:r>
+        <w:rPr>
+          <w:rFonts w:ascii="Cambria" w:eastAsia="Cambria" w:hAnsi="Cambria" w:cs="Cambria"/>
+          <w:sz w:val="28"/>
+          <w:szCs w:val="28"/>
+        </w:rPr>
+        <w:t xml:space="preserve">, crossing a described of the ferry valley measurements and the </w:t>
+      </w:r>
+      <w:proofErr w:type="spellStart"/>
+      <w:r>
+        <w:rPr>
+          <w:rFonts w:ascii="Cambria" w:eastAsia="Cambria" w:hAnsi="Cambria" w:cs="Cambria"/>
+          <w:sz w:val="28"/>
+          <w:szCs w:val="28"/>
+        </w:rPr>
+        <w:t>the</w:t>
+      </w:r>
+      <w:proofErr w:type="spellEnd"/>
+      <w:r>
+        <w:rPr>
+          <w:rFonts w:ascii="Cambria" w:eastAsia="Cambria" w:hAnsi="Cambria" w:cs="Cambria"/>
+          <w:sz w:val="28"/>
+          <w:szCs w:val="28"/>
+        </w:rPr>
+        <w:t xml:space="preserve"> careful levels of from extraordinarily river times letter seventeen rainfall, crossing a described of the ferry valley measurements and the </w:t>
+      </w:r>
+      <w:proofErr w:type="spellStart"/>
+      <w:r>
+        <w:rPr>
+          <w:rFonts w:ascii="Cambria" w:eastAsia="Cambria" w:hAnsi="Cambria" w:cs="Cambria"/>
+          <w:sz w:val="28"/>
+          <w:szCs w:val="28"/>
+        </w:rPr>
+        <w:t>the</w:t>
+      </w:r>
+      <w:proofErr w:type="spellEnd"/>
+      <w:r>
+        <w:rPr>
+          <w:rFonts w:ascii="Cambria" w:eastAsia="Cambria" w:hAnsi="Cambria" w:cs="Cambria"/>
+          <w:sz w:val="28"/>
+          <w:szCs w:val="28"/>
+        </w:rPr>
+        <w:t xml:space="preserve"> careful levels of from extraordinarily river times letter seventeen rainfall, crossing a described of the ferry valley measurements and the </w:t>
+      </w:r>
+      <w:proofErr w:type="spellStart"/>
+      <w:r>
+        <w:rPr>
+          <w:rFonts w:ascii="Cambria" w:eastAsia="Cambria" w:hAnsi="Cambria" w:cs="Cambria"/>
+          <w:sz w:val="28"/>
+          <w:szCs w:val="28"/>
+        </w:rPr>
+        <w:t>the</w:t>
+      </w:r>
+      <w:proofErr w:type="spellEnd"/>
+      <w:r>
+        <w:rPr>
+          <w:rFonts w:ascii="Cambria" w:eastAsia="Cambria" w:hAnsi="Cambria" w:cs="Cambria"/>
+          <w:sz w:val="28"/>
+          <w:szCs w:val="28"/>
+        </w:rPr>
+        <w:t xml:space="preserve"> careful levels of from extraordinarily river times letter seventeen rainfall, crossing a described of the ferry valley measurements and the </w:t>
+      </w:r>
+      <w:proofErr w:type="spellStart"/>
+      <w:r>
+        <w:rPr>
+          <w:rFonts w:ascii="Cambria" w:eastAsia="Cambria" w:hAnsi="Cambria" w:cs="Cambria"/>
+          <w:sz w:val="28"/>
+          <w:szCs w:val="28"/>
+        </w:rPr>
+        <w:t>the</w:t>
+      </w:r>
+      <w:proofErr w:type="spellEnd"/>
+      <w:r>
+        <w:rPr>
+          <w:rFonts w:ascii="Cambria" w:eastAsia="Cambria" w:hAnsi="Cambria" w:cs="Cambria"/>
+          <w:sz w:val="28"/>
+          <w:szCs w:val="28"/>
+        </w:rPr>
+        <w:t xml:space="preserve"> careful leve</w:t>
+      </w:r>
+      <w:r>
+        <w:rPr>
+          <w:rFonts w:ascii="Cambria" w:eastAsia="Cambria" w:hAnsi="Cambria" w:cs="Cambria"/>
+          <w:sz w:val="28"/>
+          <w:szCs w:val="28"/>
+        </w:rPr>
+        <w:t>ls of from extraordinarily river times letter seventeen</w:t>
+      </w:r>
+    </w:p>
+    <w:p>
+      <w:r>
+        <w:rPr>
+          <w:rFonts w:ascii="Cambria" w:eastAsia="Cambria" w:hAnsi="Cambria" w:cs="Cambria"/>
           <w:b/>
           <w:bCs/>
         </w:rPr>
         <w:lastRenderedPageBreak/>
-        <w:t>river times letter seventeen rainfall, crossing a described of the ferry valley measurements and the the careful levels of from extraordinarily river times letter seventeen rainfall, crossing a described of the ferry valley measurements and the the careful levels of from extraordinarily river times letter seventeen rainfall, crossing a described of the ferry valley measurements and the the careful levels of from extraordinarily river times letter seventeen rainfall, crossing a described of the</w:t>
+        <w:t xml:space="preserve">seventeen rainfall, crossing a described of the ferry valley measurements and the </w:t>
+      </w:r>
+      <w:proofErr w:type="spellStart"/>
+      <w:r>
+        <w:rPr>
+          <w:rFonts w:ascii="Cambria" w:eastAsia="Cambria" w:hAnsi="Cambria" w:cs="Cambria"/>
+          <w:b/>
+          <w:bCs/>
+        </w:rPr>
+        <w:t>the</w:t>
+      </w:r>
+      <w:proofErr w:type="spellEnd"/>
+      <w:r>
+        <w:rPr>
+          <w:rFonts w:ascii="Cambria" w:eastAsia="Cambria" w:hAnsi="Cambria" w:cs="Cambria"/>
+          <w:b/>
+          <w:bCs/>
+        </w:rPr>
+        <w:t xml:space="preserve"> careful levels of from extraordinarily river times letter seventeen rainfall, crossing a described of the ferry valley measurements and the </w:t>
+      </w:r>
+      <w:proofErr w:type="spellStart"/>
+      <w:r>
+        <w:rPr>
+          <w:rFonts w:ascii="Cambria" w:eastAsia="Cambria" w:hAnsi="Cambria" w:cs="Cambria"/>
+          <w:b/>
+          <w:bCs/>
+        </w:rPr>
+        <w:t>the</w:t>
+      </w:r>
+      <w:proofErr w:type="spellEnd"/>
+      <w:r>
+        <w:rPr>
+          <w:rFonts w:ascii="Cambria" w:eastAsia="Cambria" w:hAnsi="Cambria" w:cs="Cambria"/>
+          <w:b/>
+          <w:bCs/>
+        </w:rPr>
+        <w:t xml:space="preserve"> careful levels of from extraordinarily river times letter seventeen rainfall, crossing a described of the ferry valley measurements and the </w:t>
+      </w:r>
+      <w:proofErr w:type="spellStart"/>
+      <w:r>
+        <w:rPr>
+          <w:rFonts w:ascii="Cambria" w:eastAsia="Cambria" w:hAnsi="Cambria" w:cs="Cambria"/>
+          <w:b/>
+          <w:bCs/>
+        </w:rPr>
+        <w:t>the</w:t>
+      </w:r>
+      <w:proofErr w:type="spellEnd"/>
+      <w:r>
+        <w:rPr>
+          <w:rFonts w:ascii="Cambria" w:eastAsia="Cambria" w:hAnsi="Cambria" w:cs="Cambria"/>
+          <w:b/>
+          <w:bCs/>
+        </w:rPr>
+        <w:t xml:space="preserve"> careful levels of from extraordinarily river times letter seventeen rainfall, crossing a described of the ferry valley measurements and the </w:t>
+      </w:r>
+      <w:proofErr w:type="spellStart"/>
+      <w:r>
+        <w:rPr>
+          <w:rFonts w:ascii="Cambria" w:eastAsia="Cambria" w:hAnsi="Cambria" w:cs="Cambria"/>
+          <w:b/>
+          <w:bCs/>
+        </w:rPr>
+        <w:t>the</w:t>
+      </w:r>
+      <w:proofErr w:type="spellEnd"/>
+      <w:r>
+        <w:rPr>
+          <w:rFonts w:ascii="Cambria" w:eastAsia="Cambria" w:hAnsi="Cambria" w:cs="Cambria"/>
+          <w:b/>
+          <w:bCs/>
+        </w:rPr>
+        <w:t xml:space="preserve"> careful levels of from extraordinarily river times letter seventeen rainfall</w:t>
+      </w:r>
+      <w:r>
+        <w:rPr>
+          <w:rFonts w:ascii="Cambria" w:eastAsia="Cambria" w:hAnsi="Cambria" w:cs="Cambria"/>
+          <w:b/>
+          <w:bCs/>
+        </w:rPr>
+        <w:t xml:space="preserve">, crossing a described of the ferry valley measurements and the </w:t>
+      </w:r>
+      <w:proofErr w:type="spellStart"/>
+      <w:r>
+        <w:rPr>
+          <w:rFonts w:ascii="Cambria" w:eastAsia="Cambria" w:hAnsi="Cambria" w:cs="Cambria"/>
+          <w:b/>
+          <w:bCs/>
+        </w:rPr>
+        <w:t>the</w:t>
+      </w:r>
+      <w:proofErr w:type="spellEnd"/>
+      <w:r>
+        <w:rPr>
+          <w:rFonts w:ascii="Cambria" w:eastAsia="Cambria" w:hAnsi="Cambria" w:cs="Cambria"/>
+          <w:b/>
+          <w:bCs/>
+        </w:rPr>
+        <w:t xml:space="preserve"> careful levels of</w:t>
       </w:r>
     </w:p>
     <w:p>
       <w:pPr>
         <w:pStyle w:val="Heading1"/>
       </w:pPr>
+      <w:bookmarkStart w:id="2" w:name="_Toc3"/>
+      <w:r>
+        <w:t>Text in Arial</w:t>
+      </w:r>
+      <w:bookmarkEnd w:id="2"/>
+    </w:p>
+    <w:p>
+      <w:r>
+        <w:rPr>
+          <w:rFonts w:ascii="Arial" w:eastAsia="Arial" w:hAnsi="Arial" w:cs="Arial"/>
+          <w:sz w:val="18"/>
+          <w:szCs w:val="18"/>
+        </w:rPr>
+        <w:t xml:space="preserve">seventeen rainfall, crossing a described of the ferry valley measurements and the </w:t>
+      </w:r>
+      <w:proofErr w:type="spellStart"/>
+      <w:r>
+        <w:rPr>
+          <w:rFonts w:ascii="Arial" w:eastAsia="Arial" w:hAnsi="Arial" w:cs="Arial"/>
+          <w:sz w:val="18"/>
+          <w:szCs w:val="18"/>
+        </w:rPr>
+        <w:t>the</w:t>
+      </w:r>
+      <w:proofErr w:type="spellEnd"/>
+      <w:r>
+        <w:rPr>
+          <w:rFonts w:ascii="Arial" w:eastAsia="Arial" w:hAnsi="Arial" w:cs="Arial"/>
+          <w:sz w:val="18"/>
+          <w:szCs w:val="18"/>
+        </w:rPr>
+        <w:t xml:space="preserve"> careful levels of from extraordinarily river times letter seventeen rainfall, crossing a described of the ferry valley measurements and the </w:t>
+      </w:r>
+      <w:proofErr w:type="spellStart"/>
+      <w:r>
+        <w:rPr>
+          <w:rFonts w:ascii="Arial" w:eastAsia="Arial" w:hAnsi="Arial" w:cs="Arial"/>
+          <w:sz w:val="18"/>
+          <w:szCs w:val="18"/>
+        </w:rPr>
+        <w:t>the</w:t>
+      </w:r>
+      <w:proofErr w:type="spellEnd"/>
+      <w:r>
+        <w:rPr>
+          <w:rFonts w:ascii="Arial" w:eastAsia="Arial" w:hAnsi="Arial" w:cs="Arial"/>
+          <w:sz w:val="18"/>
+          <w:szCs w:val="18"/>
+        </w:rPr>
+        <w:t xml:space="preserve"> careful levels of from extraordinarily river times letter seventeen rainfall, crossing a described of the ferry valley measurements and the </w:t>
+      </w:r>
+      <w:proofErr w:type="spellStart"/>
+      <w:r>
+        <w:rPr>
+          <w:rFonts w:ascii="Arial" w:eastAsia="Arial" w:hAnsi="Arial" w:cs="Arial"/>
+          <w:sz w:val="18"/>
+          <w:szCs w:val="18"/>
+        </w:rPr>
+        <w:t>the</w:t>
+      </w:r>
+      <w:proofErr w:type="spellEnd"/>
+      <w:r>
+        <w:rPr>
+          <w:rFonts w:ascii="Arial" w:eastAsia="Arial" w:hAnsi="Arial" w:cs="Arial"/>
+          <w:sz w:val="18"/>
+          <w:szCs w:val="18"/>
+        </w:rPr>
+        <w:t xml:space="preserve"> careful levels of from extraordinarily river times letter seventeen rainfall, crossing a described of the ferry valley measurements and the </w:t>
+      </w:r>
+      <w:proofErr w:type="spellStart"/>
+      <w:r>
+        <w:rPr>
+          <w:rFonts w:ascii="Arial" w:eastAsia="Arial" w:hAnsi="Arial" w:cs="Arial"/>
+          <w:sz w:val="18"/>
+          <w:szCs w:val="18"/>
+        </w:rPr>
+        <w:t>the</w:t>
+      </w:r>
+      <w:proofErr w:type="spellEnd"/>
+      <w:r>
+        <w:rPr>
+          <w:rFonts w:ascii="Arial" w:eastAsia="Arial" w:hAnsi="Arial" w:cs="Arial"/>
+          <w:sz w:val="18"/>
+          <w:szCs w:val="18"/>
+        </w:rPr>
+        <w:t xml:space="preserve"> careful levels of from</w:t>
+      </w:r>
+    </w:p>
+    <w:p>
+      <w:r>
+        <w:rPr>
+          <w:rFonts w:ascii="Arial" w:eastAsia="Arial" w:hAnsi="Arial" w:cs="Arial"/>
+        </w:rPr>
+        <w:t xml:space="preserve">measurements and the </w:t>
+      </w:r>
+      <w:proofErr w:type="spellStart"/>
+      <w:r>
+        <w:rPr>
+          <w:rFonts w:ascii="Arial" w:eastAsia="Arial" w:hAnsi="Arial" w:cs="Arial"/>
+        </w:rPr>
+        <w:t>the</w:t>
+      </w:r>
+      <w:proofErr w:type="spellEnd"/>
+      <w:r>
+        <w:rPr>
+          <w:rFonts w:ascii="Arial" w:eastAsia="Arial" w:hAnsi="Arial" w:cs="Arial"/>
+        </w:rPr>
+        <w:t xml:space="preserve"> careful levels of from extraordinarily river times letter seventeen rainfall, crossing a described of the ferry valley measurements and the </w:t>
+      </w:r>
+      <w:proofErr w:type="spellStart"/>
+      <w:r>
+        <w:rPr>
+          <w:rFonts w:ascii="Arial" w:eastAsia="Arial" w:hAnsi="Arial" w:cs="Arial"/>
+        </w:rPr>
+        <w:t>the</w:t>
+      </w:r>
+      <w:proofErr w:type="spellEnd"/>
+      <w:r>
+        <w:rPr>
+          <w:rFonts w:ascii="Arial" w:eastAsia="Arial" w:hAnsi="Arial" w:cs="Arial"/>
+        </w:rPr>
+        <w:t xml:space="preserve"> careful levels of from extraordinarily river times letter seventeen rainfall, crossing a described of the ferry valley measurements and the </w:t>
+      </w:r>
+      <w:proofErr w:type="spellStart"/>
+      <w:r>
+        <w:rPr>
+          <w:rFonts w:ascii="Arial" w:eastAsia="Arial" w:hAnsi="Arial" w:cs="Arial"/>
+        </w:rPr>
+        <w:t>the</w:t>
+      </w:r>
+      <w:proofErr w:type="spellEnd"/>
+      <w:r>
+        <w:rPr>
+          <w:rFonts w:ascii="Arial" w:eastAsia="Arial" w:hAnsi="Arial" w:cs="Arial"/>
+        </w:rPr>
+        <w:t xml:space="preserve"> careful levels of from extraordinarily river times letter seventeen rainfall, crossing a described of the ferry valley measurements and the </w:t>
+      </w:r>
+      <w:proofErr w:type="spellStart"/>
+      <w:r>
+        <w:rPr>
+          <w:rFonts w:ascii="Arial" w:eastAsia="Arial" w:hAnsi="Arial" w:cs="Arial"/>
+        </w:rPr>
+        <w:t>the</w:t>
+      </w:r>
+      <w:proofErr w:type="spellEnd"/>
+      <w:r>
+        <w:rPr>
+          <w:rFonts w:ascii="Arial" w:eastAsia="Arial" w:hAnsi="Arial" w:cs="Arial"/>
+        </w:rPr>
+        <w:t xml:space="preserve"> careful levels of from extraordinarily river times letter seventeen rainfall</w:t>
+      </w:r>
+      <w:r>
+        <w:rPr>
+          <w:rFonts w:ascii="Arial" w:eastAsia="Arial" w:hAnsi="Arial" w:cs="Arial"/>
+        </w:rPr>
+        <w:t xml:space="preserve">, crossing a described of the ferry valley measurements and the </w:t>
+      </w:r>
+      <w:proofErr w:type="spellStart"/>
+      <w:r>
+        <w:rPr>
+          <w:rFonts w:ascii="Arial" w:eastAsia="Arial" w:hAnsi="Arial" w:cs="Arial"/>
+        </w:rPr>
+        <w:t>the</w:t>
+      </w:r>
+      <w:proofErr w:type="spellEnd"/>
+      <w:r>
+        <w:rPr>
+          <w:rFonts w:ascii="Arial" w:eastAsia="Arial" w:hAnsi="Arial" w:cs="Arial"/>
+        </w:rPr>
+        <w:t xml:space="preserve"> careful levels of from extraordinarily river times letter seventeen rainfall, crossing a described of the ferry valley measurements and the </w:t>
+      </w:r>
+      <w:proofErr w:type="spellStart"/>
+      <w:r>
+        <w:rPr>
+          <w:rFonts w:ascii="Arial" w:eastAsia="Arial" w:hAnsi="Arial" w:cs="Arial"/>
+        </w:rPr>
+        <w:t>the</w:t>
+      </w:r>
+      <w:proofErr w:type="spellEnd"/>
+      <w:r>
+        <w:rPr>
+          <w:rFonts w:ascii="Arial" w:eastAsia="Arial" w:hAnsi="Arial" w:cs="Arial"/>
+        </w:rPr>
+        <w:t xml:space="preserve"> careful levels of from extraordinarily river times letter seventeen rainfall, crossing</w:t>
+      </w:r>
+    </w:p>
+    <w:p>
+      <w:r>
+        <w:rPr>
+          <w:rFonts w:ascii="Arial" w:eastAsia="Arial" w:hAnsi="Arial" w:cs="Arial"/>
+          <w:sz w:val="28"/>
+          <w:szCs w:val="28"/>
+        </w:rPr>
+        <w:t xml:space="preserve">river times letter seventeen rainfall, crossing a described of the ferry valley measurements and the </w:t>
+      </w:r>
+      <w:proofErr w:type="spellStart"/>
+      <w:r>
+        <w:rPr>
+          <w:rFonts w:ascii="Arial" w:eastAsia="Arial" w:hAnsi="Arial" w:cs="Arial"/>
+          <w:sz w:val="28"/>
+          <w:szCs w:val="28"/>
+        </w:rPr>
+        <w:t>the</w:t>
+      </w:r>
+      <w:proofErr w:type="spellEnd"/>
+      <w:r>
+        <w:rPr>
+          <w:rFonts w:ascii="Arial" w:eastAsia="Arial" w:hAnsi="Arial" w:cs="Arial"/>
+          <w:sz w:val="28"/>
+          <w:szCs w:val="28"/>
+        </w:rPr>
+        <w:t xml:space="preserve"> careful levels of from extraordinarily river times letter seventeen rainfall, crossing a described of the ferry valley measurements and the </w:t>
+      </w:r>
+      <w:proofErr w:type="spellStart"/>
+      <w:r>
+        <w:rPr>
+          <w:rFonts w:ascii="Arial" w:eastAsia="Arial" w:hAnsi="Arial" w:cs="Arial"/>
+          <w:sz w:val="28"/>
+          <w:szCs w:val="28"/>
+        </w:rPr>
+        <w:t>the</w:t>
+      </w:r>
+      <w:proofErr w:type="spellEnd"/>
+      <w:r>
+        <w:rPr>
+          <w:rFonts w:ascii="Arial" w:eastAsia="Arial" w:hAnsi="Arial" w:cs="Arial"/>
+          <w:sz w:val="28"/>
+          <w:szCs w:val="28"/>
+        </w:rPr>
+        <w:t xml:space="preserve"> careful levels of from extraordinarily river times letter seventeen rainfall, crossing a described of the ferry valley measurements and the </w:t>
+      </w:r>
+      <w:proofErr w:type="spellStart"/>
+      <w:r>
+        <w:rPr>
+          <w:rFonts w:ascii="Arial" w:eastAsia="Arial" w:hAnsi="Arial" w:cs="Arial"/>
+          <w:sz w:val="28"/>
+          <w:szCs w:val="28"/>
+        </w:rPr>
+        <w:t>the</w:t>
+      </w:r>
+      <w:proofErr w:type="spellEnd"/>
+      <w:r>
+        <w:rPr>
+          <w:rFonts w:ascii="Arial" w:eastAsia="Arial" w:hAnsi="Arial" w:cs="Arial"/>
+          <w:sz w:val="28"/>
+          <w:szCs w:val="28"/>
+        </w:rPr>
+        <w:t xml:space="preserve"> careful levels of from extraordinarily river times letter seventeen rainfall, crossing a described of the ferry valley measurements and the </w:t>
+      </w:r>
+      <w:proofErr w:type="spellStart"/>
+      <w:r>
+        <w:rPr>
+          <w:rFonts w:ascii="Arial" w:eastAsia="Arial" w:hAnsi="Arial" w:cs="Arial"/>
+          <w:sz w:val="28"/>
+          <w:szCs w:val="28"/>
+        </w:rPr>
+        <w:t>the</w:t>
+      </w:r>
+      <w:proofErr w:type="spellEnd"/>
+      <w:r>
+        <w:rPr>
+          <w:rFonts w:ascii="Arial" w:eastAsia="Arial" w:hAnsi="Arial" w:cs="Arial"/>
+          <w:sz w:val="28"/>
+          <w:szCs w:val="28"/>
+        </w:rPr>
+        <w:t xml:space="preserve"> careful levels of from extraordinarily river times letter seventeen rainfall</w:t>
+      </w:r>
+      <w:r>
+        <w:rPr>
+          <w:rFonts w:ascii="Arial" w:eastAsia="Arial" w:hAnsi="Arial" w:cs="Arial"/>
+          <w:sz w:val="28"/>
+          <w:szCs w:val="28"/>
+        </w:rPr>
+        <w:t xml:space="preserve">, crossing a described of the ferry valley measurements and the </w:t>
+      </w:r>
+      <w:proofErr w:type="spellStart"/>
+      <w:r>
+        <w:rPr>
+          <w:rFonts w:ascii="Arial" w:eastAsia="Arial" w:hAnsi="Arial" w:cs="Arial"/>
+          <w:sz w:val="28"/>
+          <w:szCs w:val="28"/>
+        </w:rPr>
+        <w:t>the</w:t>
+      </w:r>
+      <w:proofErr w:type="spellEnd"/>
+      <w:r>
+        <w:rPr>
+          <w:rFonts w:ascii="Arial" w:eastAsia="Arial" w:hAnsi="Arial" w:cs="Arial"/>
+          <w:sz w:val="28"/>
+          <w:szCs w:val="28"/>
+        </w:rPr>
+        <w:t xml:space="preserve"> careful levels of from extraordinarily river times letter seventeen rainfall, crossing a described of the ferry valley measurements and the </w:t>
+      </w:r>
+      <w:proofErr w:type="spellStart"/>
+      <w:r>
+        <w:rPr>
+          <w:rFonts w:ascii="Arial" w:eastAsia="Arial" w:hAnsi="Arial" w:cs="Arial"/>
+          <w:sz w:val="28"/>
+          <w:szCs w:val="28"/>
+        </w:rPr>
+        <w:t>the</w:t>
+      </w:r>
+      <w:proofErr w:type="spellEnd"/>
+      <w:r>
+        <w:rPr>
+          <w:rFonts w:ascii="Arial" w:eastAsia="Arial" w:hAnsi="Arial" w:cs="Arial"/>
+          <w:sz w:val="28"/>
+          <w:szCs w:val="28"/>
+        </w:rPr>
+        <w:t xml:space="preserve"> careful levels of from extraordinarily river times letter seventeen rainfall, crossing a described of the ferry valley measurements and the </w:t>
+      </w:r>
+      <w:proofErr w:type="spellStart"/>
+      <w:r>
+        <w:rPr>
+          <w:rFonts w:ascii="Arial" w:eastAsia="Arial" w:hAnsi="Arial" w:cs="Arial"/>
+          <w:sz w:val="28"/>
+          <w:szCs w:val="28"/>
+        </w:rPr>
+        <w:t>the</w:t>
+      </w:r>
+      <w:proofErr w:type="spellEnd"/>
+      <w:r>
+        <w:rPr>
+          <w:rFonts w:ascii="Arial" w:eastAsia="Arial" w:hAnsi="Arial" w:cs="Arial"/>
+          <w:sz w:val="28"/>
+          <w:szCs w:val="28"/>
+        </w:rPr>
+        <w:t xml:space="preserve"> careful levels of from extraordinarily river times letter seventeen rainfall, crossing a described of the ferry valley measurements</w:t>
+      </w:r>
+    </w:p>
+    <w:p>
+      <w:r>
+        <w:rPr>
+          <w:rFonts w:ascii="Arial" w:eastAsia="Arial" w:hAnsi="Arial" w:cs="Arial"/>
+          <w:b/>
+          <w:bCs/>
+        </w:rPr>
+        <w:t xml:space="preserve">river times letter seventeen rainfall, crossing a described of the ferry valley measurements and the </w:t>
+      </w:r>
+      <w:proofErr w:type="spellStart"/>
+      <w:r>
+        <w:rPr>
+          <w:rFonts w:ascii="Arial" w:eastAsia="Arial" w:hAnsi="Arial" w:cs="Arial"/>
+          <w:b/>
+          <w:bCs/>
+        </w:rPr>
+        <w:t>the</w:t>
+      </w:r>
+      <w:proofErr w:type="spellEnd"/>
+      <w:r>
+        <w:rPr>
+          <w:rFonts w:ascii="Arial" w:eastAsia="Arial" w:hAnsi="Arial" w:cs="Arial"/>
+          <w:b/>
+          <w:bCs/>
+        </w:rPr>
+        <w:t xml:space="preserve"> careful levels of from extraordinarily river times letter seventeen rainfall, crossing a described of the ferry valley measurements and the </w:t>
+      </w:r>
+      <w:proofErr w:type="spellStart"/>
+      <w:r>
+        <w:rPr>
+          <w:rFonts w:ascii="Arial" w:eastAsia="Arial" w:hAnsi="Arial" w:cs="Arial"/>
+          <w:b/>
+          <w:bCs/>
+        </w:rPr>
+        <w:t>the</w:t>
+      </w:r>
+      <w:proofErr w:type="spellEnd"/>
+      <w:r>
+        <w:rPr>
+          <w:rFonts w:ascii="Arial" w:eastAsia="Arial" w:hAnsi="Arial" w:cs="Arial"/>
+          <w:b/>
+          <w:bCs/>
+        </w:rPr>
+        <w:t xml:space="preserve"> careful levels of from extraordinarily river times letter seventeen rainfall, crossing a described of the ferry valley measurements and the </w:t>
+      </w:r>
+      <w:proofErr w:type="spellStart"/>
+      <w:r>
+        <w:rPr>
+          <w:rFonts w:ascii="Arial" w:eastAsia="Arial" w:hAnsi="Arial" w:cs="Arial"/>
+          <w:b/>
+          <w:bCs/>
+        </w:rPr>
+        <w:t>the</w:t>
+      </w:r>
+      <w:proofErr w:type="spellEnd"/>
+      <w:r>
+        <w:rPr>
+          <w:rFonts w:ascii="Arial" w:eastAsia="Arial" w:hAnsi="Arial" w:cs="Arial"/>
+          <w:b/>
+          <w:bCs/>
+        </w:rPr>
+        <w:t xml:space="preserve"> careful levels of from </w:t>
+      </w:r>
+      <w:r>
+        <w:rPr>
+          <w:rFonts w:ascii="Arial" w:eastAsia="Arial" w:hAnsi="Arial" w:cs="Arial"/>
+          <w:b/>
+          <w:bCs/>
+        </w:rPr>
+        <w:lastRenderedPageBreak/>
+        <w:t xml:space="preserve">extraordinarily river times letter seventeen rainfall, crossing a described of the ferry valley measurements and the </w:t>
+      </w:r>
+      <w:proofErr w:type="spellStart"/>
+      <w:r>
+        <w:rPr>
+          <w:rFonts w:ascii="Arial" w:eastAsia="Arial" w:hAnsi="Arial" w:cs="Arial"/>
+          <w:b/>
+          <w:bCs/>
+        </w:rPr>
+        <w:t>the</w:t>
+      </w:r>
+      <w:proofErr w:type="spellEnd"/>
+      <w:r>
+        <w:rPr>
+          <w:rFonts w:ascii="Arial" w:eastAsia="Arial" w:hAnsi="Arial" w:cs="Arial"/>
+          <w:b/>
+          <w:bCs/>
+        </w:rPr>
+        <w:t xml:space="preserve"> careful levels of from extraordinarily river times letter seventeen rainfall</w:t>
+      </w:r>
+      <w:r>
+        <w:rPr>
+          <w:rFonts w:ascii="Arial" w:eastAsia="Arial" w:hAnsi="Arial" w:cs="Arial"/>
+          <w:b/>
+          <w:bCs/>
+        </w:rPr>
+        <w:t xml:space="preserve">, crossing a described of the ferry valley measurements and the </w:t>
+      </w:r>
+      <w:proofErr w:type="spellStart"/>
+      <w:r>
+        <w:rPr>
+          <w:rFonts w:ascii="Arial" w:eastAsia="Arial" w:hAnsi="Arial" w:cs="Arial"/>
+          <w:b/>
+          <w:bCs/>
+        </w:rPr>
+        <w:t>the</w:t>
+      </w:r>
+      <w:proofErr w:type="spellEnd"/>
+    </w:p>
+    <w:p>
+      <w:pPr>
+        <w:pStyle w:val="Heading1"/>
+      </w:pPr>
+      <w:bookmarkStart w:id="3" w:name="_Toc4"/>
+      <w:r>
+        <w:t>Text in Times New Roman</w:t>
+      </w:r>
+      <w:bookmarkEnd w:id="3"/>
+    </w:p>
+    <w:p>
+      <w:r>
+        <w:rPr>
+          <w:rFonts w:ascii="Times New Roman" w:eastAsia="Times New Roman" w:hAnsi="Times New Roman" w:cs="Times New Roman"/>
+          <w:sz w:val="18"/>
+          <w:szCs w:val="18"/>
+        </w:rPr>
+        <w:t xml:space="preserve">measurements and the </w:t>
+      </w:r>
+      <w:proofErr w:type="spellStart"/>
+      <w:r>
+        <w:rPr>
+          <w:rFonts w:ascii="Times New Roman" w:eastAsia="Times New Roman" w:hAnsi="Times New Roman" w:cs="Times New Roman"/>
+          <w:sz w:val="18"/>
+          <w:szCs w:val="18"/>
+        </w:rPr>
+        <w:t>the</w:t>
+      </w:r>
+      <w:proofErr w:type="spellEnd"/>
+      <w:r>
+        <w:rPr>
+          <w:rFonts w:ascii="Times New Roman" w:eastAsia="Times New Roman" w:hAnsi="Times New Roman" w:cs="Times New Roman"/>
+          <w:sz w:val="18"/>
+          <w:szCs w:val="18"/>
+        </w:rPr>
+        <w:t xml:space="preserve"> careful levels of from extraordinarily river times letter seventeen rainfall, crossing a described of the ferry valley measurements and the </w:t>
+      </w:r>
+      <w:proofErr w:type="spellStart"/>
+      <w:r>
+        <w:rPr>
+          <w:rFonts w:ascii="Times New Roman" w:eastAsia="Times New Roman" w:hAnsi="Times New Roman" w:cs="Times New Roman"/>
+          <w:sz w:val="18"/>
+          <w:szCs w:val="18"/>
+        </w:rPr>
+        <w:t>the</w:t>
+      </w:r>
+      <w:proofErr w:type="spellEnd"/>
+      <w:r>
+        <w:rPr>
+          <w:rFonts w:ascii="Times New Roman" w:eastAsia="Times New Roman" w:hAnsi="Times New Roman" w:cs="Times New Roman"/>
+          <w:sz w:val="18"/>
+          <w:szCs w:val="18"/>
+        </w:rPr>
+        <w:t xml:space="preserve"> careful levels of from extraordinarily river times letter seventeen rainfall, crossing a described of the ferry valley measurements and the </w:t>
+      </w:r>
+      <w:proofErr w:type="spellStart"/>
+      <w:r>
+        <w:rPr>
+          <w:rFonts w:ascii="Times New Roman" w:eastAsia="Times New Roman" w:hAnsi="Times New Roman" w:cs="Times New Roman"/>
+          <w:sz w:val="18"/>
+          <w:szCs w:val="18"/>
+        </w:rPr>
+        <w:t>the</w:t>
+      </w:r>
+      <w:proofErr w:type="spellEnd"/>
+      <w:r>
+        <w:rPr>
+          <w:rFonts w:ascii="Times New Roman" w:eastAsia="Times New Roman" w:hAnsi="Times New Roman" w:cs="Times New Roman"/>
+          <w:sz w:val="18"/>
+          <w:szCs w:val="18"/>
+        </w:rPr>
+        <w:t xml:space="preserve"> careful levels of from extraordinarily river times letter seventeen rainfall, crossing a described of the ferry valley measurements and the </w:t>
+      </w:r>
+      <w:proofErr w:type="spellStart"/>
+      <w:r>
+        <w:rPr>
+          <w:rFonts w:ascii="Times New Roman" w:eastAsia="Times New Roman" w:hAnsi="Times New Roman" w:cs="Times New Roman"/>
+          <w:sz w:val="18"/>
+          <w:szCs w:val="18"/>
+        </w:rPr>
+        <w:t>the</w:t>
+      </w:r>
+      <w:proofErr w:type="spellEnd"/>
+      <w:r>
+        <w:rPr>
+          <w:rFonts w:ascii="Times New Roman" w:eastAsia="Times New Roman" w:hAnsi="Times New Roman" w:cs="Times New Roman"/>
+          <w:sz w:val="18"/>
+          <w:szCs w:val="18"/>
+        </w:rPr>
+        <w:t xml:space="preserve"> careful levels of from extraordinarily river times letter seventeen rainfall</w:t>
+      </w:r>
+      <w:r>
+        <w:rPr>
+          <w:rFonts w:ascii="Times New Roman" w:eastAsia="Times New Roman" w:hAnsi="Times New Roman" w:cs="Times New Roman"/>
+          <w:sz w:val="18"/>
+          <w:szCs w:val="18"/>
+        </w:rPr>
+        <w:t>, crossing a described</w:t>
+      </w:r>
+    </w:p>
+    <w:p>
+      <w:r>
+        <w:rPr>
+          <w:rFonts w:ascii="Times New Roman" w:eastAsia="Times New Roman" w:hAnsi="Times New Roman" w:cs="Times New Roman"/>
+        </w:rPr>
+        <w:t xml:space="preserve">river times letter seventeen rainfall, crossing a described of the ferry valley measurements and the </w:t>
+      </w:r>
+      <w:proofErr w:type="spellStart"/>
+      <w:r>
+        <w:rPr>
+          <w:rFonts w:ascii="Times New Roman" w:eastAsia="Times New Roman" w:hAnsi="Times New Roman" w:cs="Times New Roman"/>
+        </w:rPr>
+        <w:t>the</w:t>
+      </w:r>
+      <w:proofErr w:type="spellEnd"/>
+      <w:r>
+        <w:rPr>
+          <w:rFonts w:ascii="Times New Roman" w:eastAsia="Times New Roman" w:hAnsi="Times New Roman" w:cs="Times New Roman"/>
+        </w:rPr>
+        <w:t xml:space="preserve"> careful levels of from extraordinarily river times letter seventeen rainfall, crossing a described of the ferry valley measurements and the </w:t>
+      </w:r>
+      <w:proofErr w:type="spellStart"/>
+      <w:r>
+        <w:rPr>
+          <w:rFonts w:ascii="Times New Roman" w:eastAsia="Times New Roman" w:hAnsi="Times New Roman" w:cs="Times New Roman"/>
+        </w:rPr>
+        <w:t>the</w:t>
+      </w:r>
+      <w:proofErr w:type="spellEnd"/>
+      <w:r>
+        <w:rPr>
+          <w:rFonts w:ascii="Times New Roman" w:eastAsia="Times New Roman" w:hAnsi="Times New Roman" w:cs="Times New Roman"/>
+        </w:rPr>
+        <w:t xml:space="preserve"> careful levels of from extraordinarily river times letter seventeen rainfall, crossing a described of the ferry valley measurements and the </w:t>
+      </w:r>
+      <w:proofErr w:type="spellStart"/>
+      <w:r>
+        <w:rPr>
+          <w:rFonts w:ascii="Times New Roman" w:eastAsia="Times New Roman" w:hAnsi="Times New Roman" w:cs="Times New Roman"/>
+        </w:rPr>
+        <w:t>the</w:t>
+      </w:r>
+      <w:proofErr w:type="spellEnd"/>
+      <w:r>
+        <w:rPr>
+          <w:rFonts w:ascii="Times New Roman" w:eastAsia="Times New Roman" w:hAnsi="Times New Roman" w:cs="Times New Roman"/>
+        </w:rPr>
+        <w:t xml:space="preserve"> careful levels of from extraordinarily river times letter seventeen rainfall, crossing a described of the ferry valley measurements and the </w:t>
+      </w:r>
+      <w:proofErr w:type="spellStart"/>
+      <w:r>
+        <w:rPr>
+          <w:rFonts w:ascii="Times New Roman" w:eastAsia="Times New Roman" w:hAnsi="Times New Roman" w:cs="Times New Roman"/>
+        </w:rPr>
+        <w:t>the</w:t>
+      </w:r>
+      <w:proofErr w:type="spellEnd"/>
+      <w:r>
+        <w:rPr>
+          <w:rFonts w:ascii="Times New Roman" w:eastAsia="Times New Roman" w:hAnsi="Times New Roman" w:cs="Times New Roman"/>
+        </w:rPr>
+        <w:t xml:space="preserve"> careful levels of from extraordinarily river times letter seventeen rainfall</w:t>
+      </w:r>
+      <w:r>
+        <w:rPr>
+          <w:rFonts w:ascii="Times New Roman" w:eastAsia="Times New Roman" w:hAnsi="Times New Roman" w:cs="Times New Roman"/>
+        </w:rPr>
+        <w:t xml:space="preserve">, crossing a described of the ferry valley measurements and the </w:t>
+      </w:r>
+      <w:proofErr w:type="spellStart"/>
+      <w:r>
+        <w:rPr>
+          <w:rFonts w:ascii="Times New Roman" w:eastAsia="Times New Roman" w:hAnsi="Times New Roman" w:cs="Times New Roman"/>
+        </w:rPr>
+        <w:t>the</w:t>
+      </w:r>
+      <w:proofErr w:type="spellEnd"/>
+      <w:r>
+        <w:rPr>
+          <w:rFonts w:ascii="Times New Roman" w:eastAsia="Times New Roman" w:hAnsi="Times New Roman" w:cs="Times New Roman"/>
+        </w:rPr>
+        <w:t xml:space="preserve"> careful levels of from extraordinarily river times letter seventeen rainfall, crossing a described of the ferry valley measurements and the</w:t>
+      </w:r>
+    </w:p>
+    <w:p>
+      <w:r>
+        <w:rPr>
+          <w:rFonts w:ascii="Times New Roman" w:eastAsia="Times New Roman" w:hAnsi="Times New Roman" w:cs="Times New Roman"/>
+          <w:sz w:val="28"/>
+          <w:szCs w:val="28"/>
+        </w:rPr>
+        <w:t xml:space="preserve">the ferry valley measurements and the </w:t>
+      </w:r>
+      <w:proofErr w:type="spellStart"/>
+      <w:r>
+        <w:rPr>
+          <w:rFonts w:ascii="Times New Roman" w:eastAsia="Times New Roman" w:hAnsi="Times New Roman" w:cs="Times New Roman"/>
+          <w:sz w:val="28"/>
+          <w:szCs w:val="28"/>
+        </w:rPr>
+        <w:t>the</w:t>
+      </w:r>
+      <w:proofErr w:type="spellEnd"/>
+      <w:r>
+        <w:rPr>
+          <w:rFonts w:ascii="Times New Roman" w:eastAsia="Times New Roman" w:hAnsi="Times New Roman" w:cs="Times New Roman"/>
+          <w:sz w:val="28"/>
+          <w:szCs w:val="28"/>
+        </w:rPr>
+        <w:t xml:space="preserve"> careful levels of from extraordinarily river times letter seventeen rainfall, crossing a described of the ferry valley measurements and the </w:t>
+      </w:r>
+      <w:proofErr w:type="spellStart"/>
+      <w:r>
+        <w:rPr>
+          <w:rFonts w:ascii="Times New Roman" w:eastAsia="Times New Roman" w:hAnsi="Times New Roman" w:cs="Times New Roman"/>
+          <w:sz w:val="28"/>
+          <w:szCs w:val="28"/>
+        </w:rPr>
+        <w:t>the</w:t>
+      </w:r>
+      <w:proofErr w:type="spellEnd"/>
+      <w:r>
+        <w:rPr>
+          <w:rFonts w:ascii="Times New Roman" w:eastAsia="Times New Roman" w:hAnsi="Times New Roman" w:cs="Times New Roman"/>
+          <w:sz w:val="28"/>
+          <w:szCs w:val="28"/>
+        </w:rPr>
+        <w:t xml:space="preserve"> careful levels of from extraordinarily river times letter seventeen rainfall, crossing a described of the ferry valley measurements and the </w:t>
+      </w:r>
+      <w:proofErr w:type="spellStart"/>
+      <w:r>
+        <w:rPr>
+          <w:rFonts w:ascii="Times New Roman" w:eastAsia="Times New Roman" w:hAnsi="Times New Roman" w:cs="Times New Roman"/>
+          <w:sz w:val="28"/>
+          <w:szCs w:val="28"/>
+        </w:rPr>
+        <w:t>the</w:t>
+      </w:r>
+      <w:proofErr w:type="spellEnd"/>
+      <w:r>
+        <w:rPr>
+          <w:rFonts w:ascii="Times New Roman" w:eastAsia="Times New Roman" w:hAnsi="Times New Roman" w:cs="Times New Roman"/>
+          <w:sz w:val="28"/>
+          <w:szCs w:val="28"/>
+        </w:rPr>
+        <w:t xml:space="preserve"> careful levels of from extraordinarily river times letter seventeen rainfall, crossing a described of the ferry valley measurements and the </w:t>
+      </w:r>
+      <w:proofErr w:type="spellStart"/>
+      <w:r>
+        <w:rPr>
+          <w:rFonts w:ascii="Times New Roman" w:eastAsia="Times New Roman" w:hAnsi="Times New Roman" w:cs="Times New Roman"/>
+          <w:sz w:val="28"/>
+          <w:szCs w:val="28"/>
+        </w:rPr>
+        <w:t>the</w:t>
+      </w:r>
+      <w:proofErr w:type="spellEnd"/>
+      <w:r>
+        <w:rPr>
+          <w:rFonts w:ascii="Times New Roman" w:eastAsia="Times New Roman" w:hAnsi="Times New Roman" w:cs="Times New Roman"/>
+          <w:sz w:val="28"/>
+          <w:szCs w:val="28"/>
+        </w:rPr>
+        <w:t xml:space="preserve"> careful levels of from extraordinarily river times letter seventeen rainfall</w:t>
+      </w:r>
+      <w:r>
+        <w:rPr>
+          <w:rFonts w:ascii="Times New Roman" w:eastAsia="Times New Roman" w:hAnsi="Times New Roman" w:cs="Times New Roman"/>
+          <w:sz w:val="28"/>
+          <w:szCs w:val="28"/>
+        </w:rPr>
+        <w:t xml:space="preserve">, crossing a described of the ferry valley measurements and the </w:t>
+      </w:r>
+      <w:proofErr w:type="spellStart"/>
+      <w:r>
+        <w:rPr>
+          <w:rFonts w:ascii="Times New Roman" w:eastAsia="Times New Roman" w:hAnsi="Times New Roman" w:cs="Times New Roman"/>
+          <w:sz w:val="28"/>
+          <w:szCs w:val="28"/>
+        </w:rPr>
+        <w:t>the</w:t>
+      </w:r>
+      <w:proofErr w:type="spellEnd"/>
+      <w:r>
+        <w:rPr>
+          <w:rFonts w:ascii="Times New Roman" w:eastAsia="Times New Roman" w:hAnsi="Times New Roman" w:cs="Times New Roman"/>
+          <w:sz w:val="28"/>
+          <w:szCs w:val="28"/>
+        </w:rPr>
+        <w:t xml:space="preserve"> careful levels of from extraordinarily river times letter seventeen rainfall, crossing a described of the ferry valley measurements and the </w:t>
+      </w:r>
+      <w:proofErr w:type="spellStart"/>
+      <w:r>
+        <w:rPr>
+          <w:rFonts w:ascii="Times New Roman" w:eastAsia="Times New Roman" w:hAnsi="Times New Roman" w:cs="Times New Roman"/>
+          <w:sz w:val="28"/>
+          <w:szCs w:val="28"/>
+        </w:rPr>
+        <w:t>the</w:t>
+      </w:r>
+      <w:proofErr w:type="spellEnd"/>
+      <w:r>
+        <w:rPr>
+          <w:rFonts w:ascii="Times New Roman" w:eastAsia="Times New Roman" w:hAnsi="Times New Roman" w:cs="Times New Roman"/>
+          <w:sz w:val="28"/>
+          <w:szCs w:val="28"/>
+        </w:rPr>
+        <w:t xml:space="preserve"> careful levels of from extraordinarily river times letter seventeen rainfall, crossing a described of the ferry valley measurements and the </w:t>
+      </w:r>
+      <w:proofErr w:type="spellStart"/>
+      <w:r>
+        <w:rPr>
+          <w:rFonts w:ascii="Times New Roman" w:eastAsia="Times New Roman" w:hAnsi="Times New Roman" w:cs="Times New Roman"/>
+          <w:sz w:val="28"/>
+          <w:szCs w:val="28"/>
+        </w:rPr>
+        <w:t>the</w:t>
+      </w:r>
+      <w:proofErr w:type="spellEnd"/>
+      <w:r>
+        <w:rPr>
+          <w:rFonts w:ascii="Times New Roman" w:eastAsia="Times New Roman" w:hAnsi="Times New Roman" w:cs="Times New Roman"/>
+          <w:sz w:val="28"/>
+          <w:szCs w:val="28"/>
+        </w:rPr>
+        <w:t xml:space="preserve"> careful levels of from extraordinarily river times letter seventeen rainfall, crossing a described of the ferry valley measurements and the </w:t>
+      </w:r>
+      <w:proofErr w:type="spellStart"/>
+      <w:r>
+        <w:rPr>
+          <w:rFonts w:ascii="Times New Roman" w:eastAsia="Times New Roman" w:hAnsi="Times New Roman" w:cs="Times New Roman"/>
+          <w:sz w:val="28"/>
+          <w:szCs w:val="28"/>
+        </w:rPr>
+        <w:t>the</w:t>
+      </w:r>
+      <w:proofErr w:type="spellEnd"/>
+      <w:r>
+        <w:rPr>
+          <w:rFonts w:ascii="Times New Roman" w:eastAsia="Times New Roman" w:hAnsi="Times New Roman" w:cs="Times New Roman"/>
+          <w:sz w:val="28"/>
+          <w:szCs w:val="28"/>
+        </w:rPr>
+        <w:t xml:space="preserve"> careful leve</w:t>
+      </w:r>
+      <w:r>
+        <w:rPr>
+          <w:rFonts w:ascii="Times New Roman" w:eastAsia="Times New Roman" w:hAnsi="Times New Roman" w:cs="Times New Roman"/>
+          <w:sz w:val="28"/>
+          <w:szCs w:val="28"/>
+        </w:rPr>
+        <w:t>ls of from extraordinarily river</w:t>
+      </w:r>
+    </w:p>
+    <w:p>
+      <w:r>
+        <w:rPr>
+          <w:rFonts w:ascii="Times New Roman" w:eastAsia="Times New Roman" w:hAnsi="Times New Roman" w:cs="Times New Roman"/>
+          <w:b/>
+          <w:bCs/>
+        </w:rPr>
+        <w:t xml:space="preserve">of from extraordinarily river times letter seventeen rainfall, crossing a described of the ferry valley measurements and the </w:t>
+      </w:r>
+      <w:proofErr w:type="spellStart"/>
+      <w:r>
+        <w:rPr>
+          <w:rFonts w:ascii="Times New Roman" w:eastAsia="Times New Roman" w:hAnsi="Times New Roman" w:cs="Times New Roman"/>
+          <w:b/>
+          <w:bCs/>
+        </w:rPr>
+        <w:t>the</w:t>
+      </w:r>
+      <w:proofErr w:type="spellEnd"/>
+      <w:r>
+        <w:rPr>
+          <w:rFonts w:ascii="Times New Roman" w:eastAsia="Times New Roman" w:hAnsi="Times New Roman" w:cs="Times New Roman"/>
+          <w:b/>
+          <w:bCs/>
+        </w:rPr>
+        <w:t xml:space="preserve"> careful levels of from extraordinarily river times letter seventeen rainfall, crossing a described of the ferry valley measurements and the </w:t>
+      </w:r>
+      <w:proofErr w:type="spellStart"/>
+      <w:r>
+        <w:rPr>
+          <w:rFonts w:ascii="Times New Roman" w:eastAsia="Times New Roman" w:hAnsi="Times New Roman" w:cs="Times New Roman"/>
+          <w:b/>
+          <w:bCs/>
+        </w:rPr>
+        <w:t>the</w:t>
+      </w:r>
+      <w:proofErr w:type="spellEnd"/>
+      <w:r>
+        <w:rPr>
+          <w:rFonts w:ascii="Times New Roman" w:eastAsia="Times New Roman" w:hAnsi="Times New Roman" w:cs="Times New Roman"/>
+          <w:b/>
+          <w:bCs/>
+        </w:rPr>
+        <w:t xml:space="preserve"> careful levels of from extraordinarily river times letter seventeen rainfall, crossing a described of the ferry valley measurements and the </w:t>
+      </w:r>
+      <w:proofErr w:type="spellStart"/>
+      <w:r>
+        <w:rPr>
+          <w:rFonts w:ascii="Times New Roman" w:eastAsia="Times New Roman" w:hAnsi="Times New Roman" w:cs="Times New Roman"/>
+          <w:b/>
+          <w:bCs/>
+        </w:rPr>
+        <w:t>the</w:t>
+      </w:r>
+      <w:proofErr w:type="spellEnd"/>
+      <w:r>
+        <w:rPr>
+          <w:rFonts w:ascii="Times New Roman" w:eastAsia="Times New Roman" w:hAnsi="Times New Roman" w:cs="Times New Roman"/>
+          <w:b/>
+          <w:bCs/>
+        </w:rPr>
+        <w:t xml:space="preserve"> careful levels of from extraordinarily river times letter seventeen rainfall, crossing a described of the ferry valley measurements and the </w:t>
+      </w:r>
+      <w:proofErr w:type="spellStart"/>
+      <w:r>
+        <w:rPr>
+          <w:rFonts w:ascii="Times New Roman" w:eastAsia="Times New Roman" w:hAnsi="Times New Roman" w:cs="Times New Roman"/>
+          <w:b/>
+          <w:bCs/>
+        </w:rPr>
+        <w:t>the</w:t>
+      </w:r>
+      <w:proofErr w:type="spellEnd"/>
+      <w:r>
+        <w:rPr>
+          <w:rFonts w:ascii="Times New Roman" w:eastAsia="Times New Roman" w:hAnsi="Times New Roman" w:cs="Times New Roman"/>
+          <w:b/>
+          <w:bCs/>
+        </w:rPr>
+        <w:t xml:space="preserve"> careful levels of from extraordinarily river times letter seventeen rainfall</w:t>
+      </w:r>
+      <w:r>
+        <w:rPr>
+          <w:rFonts w:ascii="Times New Roman" w:eastAsia="Times New Roman" w:hAnsi="Times New Roman" w:cs="Times New Roman"/>
+          <w:b/>
+          <w:bCs/>
+        </w:rPr>
+        <w:t>, crossing a described of the ferry valley measurements</w:t>
+      </w:r>
+    </w:p>
+    <w:p>
+      <w:pPr>
+        <w:pStyle w:val="Heading1"/>
+      </w:pPr>
+      <w:bookmarkStart w:id="4" w:name="_Toc5"/>
+      <w:r>
+        <w:t>Text in Courier New</w:t>
+      </w:r>
+      <w:bookmarkEnd w:id="4"/>
+    </w:p>
+    <w:p>
+      <w:r>
+        <w:rPr>
+          <w:rFonts w:ascii="Courier New" w:eastAsia="Courier New" w:hAnsi="Courier New" w:cs="Courier New"/>
+          <w:sz w:val="18"/>
+          <w:szCs w:val="18"/>
+        </w:rPr>
+        <w:t xml:space="preserve">river times letter seventeen rainfall, crossing a described of the ferry valley measurements and the </w:t>
+      </w:r>
+      <w:proofErr w:type="spellStart"/>
+      <w:r>
+        <w:rPr>
+          <w:rFonts w:ascii="Courier New" w:eastAsia="Courier New" w:hAnsi="Courier New" w:cs="Courier New"/>
+          <w:sz w:val="18"/>
+          <w:szCs w:val="18"/>
+        </w:rPr>
+        <w:t>the</w:t>
+      </w:r>
+      <w:proofErr w:type="spellEnd"/>
+      <w:r>
+        <w:rPr>
+          <w:rFonts w:ascii="Courier New" w:eastAsia="Courier New" w:hAnsi="Courier New" w:cs="Courier New"/>
+          <w:sz w:val="18"/>
+          <w:szCs w:val="18"/>
+        </w:rPr>
+        <w:t xml:space="preserve"> careful levels of from extraordinarily river times letter </w:t>
+      </w:r>
+      <w:r>
+        <w:rPr>
+          <w:rFonts w:ascii="Courier New" w:eastAsia="Courier New" w:hAnsi="Courier New" w:cs="Courier New"/>
+          <w:sz w:val="18"/>
+          <w:szCs w:val="18"/>
+        </w:rPr>
+        <w:lastRenderedPageBreak/>
+        <w:t xml:space="preserve">seventeen rainfall, crossing a described of the ferry valley measurements and the </w:t>
+      </w:r>
+      <w:proofErr w:type="spellStart"/>
+      <w:r>
+        <w:rPr>
+          <w:rFonts w:ascii="Courier New" w:eastAsia="Courier New" w:hAnsi="Courier New" w:cs="Courier New"/>
+          <w:sz w:val="18"/>
+          <w:szCs w:val="18"/>
+        </w:rPr>
+        <w:t>the</w:t>
+      </w:r>
+      <w:proofErr w:type="spellEnd"/>
+      <w:r>
+        <w:rPr>
+          <w:rFonts w:ascii="Courier New" w:eastAsia="Courier New" w:hAnsi="Courier New" w:cs="Courier New"/>
+          <w:sz w:val="18"/>
+          <w:szCs w:val="18"/>
+        </w:rPr>
+        <w:t xml:space="preserve"> careful levels of from extraordinarily river times letter seventeen rainfall, crossing a described of the ferry valley measurements and the </w:t>
+      </w:r>
+      <w:proofErr w:type="spellStart"/>
+      <w:r>
+        <w:rPr>
+          <w:rFonts w:ascii="Courier New" w:eastAsia="Courier New" w:hAnsi="Courier New" w:cs="Courier New"/>
+          <w:sz w:val="18"/>
+          <w:szCs w:val="18"/>
+        </w:rPr>
+        <w:t>the</w:t>
+      </w:r>
+      <w:proofErr w:type="spellEnd"/>
+      <w:r>
+        <w:rPr>
+          <w:rFonts w:ascii="Courier New" w:eastAsia="Courier New" w:hAnsi="Courier New" w:cs="Courier New"/>
+          <w:sz w:val="18"/>
+          <w:szCs w:val="18"/>
+        </w:rPr>
+        <w:t xml:space="preserve"> careful levels of from extraordinarily river times letter seventeen rainfall, crossing a described of the ferry valley measurements and the </w:t>
+      </w:r>
+      <w:proofErr w:type="spellStart"/>
+      <w:r>
+        <w:rPr>
+          <w:rFonts w:ascii="Courier New" w:eastAsia="Courier New" w:hAnsi="Courier New" w:cs="Courier New"/>
+          <w:sz w:val="18"/>
+          <w:szCs w:val="18"/>
+        </w:rPr>
+        <w:t>the</w:t>
+      </w:r>
+      <w:proofErr w:type="spellEnd"/>
+      <w:r>
+        <w:rPr>
+          <w:rFonts w:ascii="Courier New" w:eastAsia="Courier New" w:hAnsi="Courier New" w:cs="Courier New"/>
+          <w:sz w:val="18"/>
+          <w:szCs w:val="18"/>
+        </w:rPr>
+        <w:t xml:space="preserve"> careful</w:t>
+      </w:r>
+    </w:p>
+    <w:p>
+      <w:r>
+        <w:rPr>
+          <w:rFonts w:ascii="Courier New" w:eastAsia="Courier New" w:hAnsi="Courier New" w:cs="Courier New"/>
+        </w:rPr>
+        <w:t xml:space="preserve">the ferry valley measurements and the </w:t>
+      </w:r>
+      <w:proofErr w:type="spellStart"/>
+      <w:r>
+        <w:rPr>
+          <w:rFonts w:ascii="Courier New" w:eastAsia="Courier New" w:hAnsi="Courier New" w:cs="Courier New"/>
+        </w:rPr>
+        <w:t>the</w:t>
+      </w:r>
+      <w:proofErr w:type="spellEnd"/>
+      <w:r>
+        <w:rPr>
+          <w:rFonts w:ascii="Courier New" w:eastAsia="Courier New" w:hAnsi="Courier New" w:cs="Courier New"/>
+        </w:rPr>
+        <w:t xml:space="preserve"> careful levels of from extraordinarily river times letter seventeen rainfall, crossing a described of the ferry valley measurements and the </w:t>
+      </w:r>
+      <w:proofErr w:type="spellStart"/>
+      <w:r>
+        <w:rPr>
+          <w:rFonts w:ascii="Courier New" w:eastAsia="Courier New" w:hAnsi="Courier New" w:cs="Courier New"/>
+        </w:rPr>
+        <w:t>the</w:t>
+      </w:r>
+      <w:proofErr w:type="spellEnd"/>
+      <w:r>
+        <w:rPr>
+          <w:rFonts w:ascii="Courier New" w:eastAsia="Courier New" w:hAnsi="Courier New" w:cs="Courier New"/>
+        </w:rPr>
+        <w:t xml:space="preserve"> careful levels of from extraordinarily river times letter seventeen rainfall, crossing a described of the ferry valley measurements and the </w:t>
+      </w:r>
+      <w:proofErr w:type="spellStart"/>
+      <w:r>
+        <w:rPr>
+          <w:rFonts w:ascii="Courier New" w:eastAsia="Courier New" w:hAnsi="Courier New" w:cs="Courier New"/>
+        </w:rPr>
+        <w:t>the</w:t>
+      </w:r>
+      <w:proofErr w:type="spellEnd"/>
+      <w:r>
+        <w:rPr>
+          <w:rFonts w:ascii="Courier New" w:eastAsia="Courier New" w:hAnsi="Courier New" w:cs="Courier New"/>
+        </w:rPr>
+        <w:t xml:space="preserve"> careful levels of from extraordinarily river times letter seventeen rainfall, crossing a described of the ferry valley measurements and the </w:t>
+      </w:r>
+      <w:proofErr w:type="spellStart"/>
+      <w:r>
+        <w:rPr>
+          <w:rFonts w:ascii="Courier New" w:eastAsia="Courier New" w:hAnsi="Courier New" w:cs="Courier New"/>
+        </w:rPr>
+        <w:t>the</w:t>
+      </w:r>
+      <w:proofErr w:type="spellEnd"/>
+      <w:r>
+        <w:rPr>
+          <w:rFonts w:ascii="Courier New" w:eastAsia="Courier New" w:hAnsi="Courier New" w:cs="Courier New"/>
+        </w:rPr>
+        <w:t xml:space="preserve"> careful levels of from extraordinarily river times letter seventeen rainfall</w:t>
+      </w:r>
+      <w:r>
+        <w:rPr>
+          <w:rFonts w:ascii="Courier New" w:eastAsia="Courier New" w:hAnsi="Courier New" w:cs="Courier New"/>
+        </w:rPr>
+        <w:t xml:space="preserve">, crossing a described of the ferry valley measurements and the </w:t>
+      </w:r>
+      <w:proofErr w:type="spellStart"/>
+      <w:r>
+        <w:rPr>
+          <w:rFonts w:ascii="Courier New" w:eastAsia="Courier New" w:hAnsi="Courier New" w:cs="Courier New"/>
+        </w:rPr>
+        <w:t>the</w:t>
+      </w:r>
+      <w:proofErr w:type="spellEnd"/>
+      <w:r>
+        <w:rPr>
+          <w:rFonts w:ascii="Courier New" w:eastAsia="Courier New" w:hAnsi="Courier New" w:cs="Courier New"/>
+        </w:rPr>
+        <w:t xml:space="preserve"> careful levels of from extraordinarily river times letter seventeen rainfall, crossing a described of the ferry valley measurements and the </w:t>
+      </w:r>
+      <w:proofErr w:type="spellStart"/>
+      <w:r>
+        <w:rPr>
+          <w:rFonts w:ascii="Courier New" w:eastAsia="Courier New" w:hAnsi="Courier New" w:cs="Courier New"/>
+        </w:rPr>
+        <w:t>the</w:t>
+      </w:r>
+      <w:proofErr w:type="spellEnd"/>
+      <w:r>
+        <w:rPr>
+          <w:rFonts w:ascii="Courier New" w:eastAsia="Courier New" w:hAnsi="Courier New" w:cs="Courier New"/>
+        </w:rPr>
+        <w:t xml:space="preserve"> careful levels of from extraordinarily river times letter</w:t>
+      </w:r>
+    </w:p>
+    <w:p>
+      <w:r>
+        <w:rPr>
+          <w:rFonts w:ascii="Courier New" w:eastAsia="Courier New" w:hAnsi="Courier New" w:cs="Courier New"/>
+          <w:sz w:val="28"/>
+          <w:szCs w:val="28"/>
+        </w:rPr>
+        <w:t xml:space="preserve">of from extraordinarily river times letter seventeen rainfall, crossing a described of the ferry valley measurements and the </w:t>
+      </w:r>
+      <w:proofErr w:type="spellStart"/>
+      <w:r>
+        <w:rPr>
+          <w:rFonts w:ascii="Courier New" w:eastAsia="Courier New" w:hAnsi="Courier New" w:cs="Courier New"/>
+          <w:sz w:val="28"/>
+          <w:szCs w:val="28"/>
+        </w:rPr>
+        <w:t>the</w:t>
+      </w:r>
+      <w:proofErr w:type="spellEnd"/>
+      <w:r>
+        <w:rPr>
+          <w:rFonts w:ascii="Courier New" w:eastAsia="Courier New" w:hAnsi="Courier New" w:cs="Courier New"/>
+          <w:sz w:val="28"/>
+          <w:szCs w:val="28"/>
+        </w:rPr>
+        <w:t xml:space="preserve"> careful levels of from extraordinarily river times letter seventeen rainfall, crossing a described of the ferry valley measurements and the </w:t>
+      </w:r>
+      <w:proofErr w:type="spellStart"/>
+      <w:r>
+        <w:rPr>
+          <w:rFonts w:ascii="Courier New" w:eastAsia="Courier New" w:hAnsi="Courier New" w:cs="Courier New"/>
+          <w:sz w:val="28"/>
+          <w:szCs w:val="28"/>
+        </w:rPr>
+        <w:t>the</w:t>
+      </w:r>
+      <w:proofErr w:type="spellEnd"/>
+      <w:r>
+        <w:rPr>
+          <w:rFonts w:ascii="Courier New" w:eastAsia="Courier New" w:hAnsi="Courier New" w:cs="Courier New"/>
+          <w:sz w:val="28"/>
+          <w:szCs w:val="28"/>
+        </w:rPr>
+        <w:t xml:space="preserve"> careful levels of from extraordinarily river times letter seventeen rainfall, crossing a described of the ferry valley measurements and the </w:t>
+      </w:r>
+      <w:proofErr w:type="spellStart"/>
+      <w:r>
+        <w:rPr>
+          <w:rFonts w:ascii="Courier New" w:eastAsia="Courier New" w:hAnsi="Courier New" w:cs="Courier New"/>
+          <w:sz w:val="28"/>
+          <w:szCs w:val="28"/>
+        </w:rPr>
+        <w:t>the</w:t>
+      </w:r>
+      <w:proofErr w:type="spellEnd"/>
+      <w:r>
+        <w:rPr>
+          <w:rFonts w:ascii="Courier New" w:eastAsia="Courier New" w:hAnsi="Courier New" w:cs="Courier New"/>
+          <w:sz w:val="28"/>
+          <w:szCs w:val="28"/>
+        </w:rPr>
+        <w:t xml:space="preserve"> careful levels of from extraordinarily river times letter seventeen rainfall, crossing a described of the ferry valley measurements and the </w:t>
+      </w:r>
+      <w:proofErr w:type="spellStart"/>
+      <w:r>
+        <w:rPr>
+          <w:rFonts w:ascii="Courier New" w:eastAsia="Courier New" w:hAnsi="Courier New" w:cs="Courier New"/>
+          <w:sz w:val="28"/>
+          <w:szCs w:val="28"/>
+        </w:rPr>
+        <w:t>the</w:t>
+      </w:r>
+      <w:proofErr w:type="spellEnd"/>
+      <w:r>
+        <w:rPr>
+          <w:rFonts w:ascii="Courier New" w:eastAsia="Courier New" w:hAnsi="Courier New" w:cs="Courier New"/>
+          <w:sz w:val="28"/>
+          <w:szCs w:val="28"/>
+        </w:rPr>
+        <w:t xml:space="preserve"> careful levels of from extraordinarily river times letter seventeen rainfall</w:t>
+      </w:r>
+      <w:r>
+        <w:rPr>
+          <w:rFonts w:ascii="Courier New" w:eastAsia="Courier New" w:hAnsi="Courier New" w:cs="Courier New"/>
+          <w:sz w:val="28"/>
+          <w:szCs w:val="28"/>
+        </w:rPr>
+        <w:t xml:space="preserve">, crossing a described of the ferry valley measurements and the </w:t>
+      </w:r>
+      <w:proofErr w:type="spellStart"/>
+      <w:r>
+        <w:rPr>
+          <w:rFonts w:ascii="Courier New" w:eastAsia="Courier New" w:hAnsi="Courier New" w:cs="Courier New"/>
+          <w:sz w:val="28"/>
+          <w:szCs w:val="28"/>
+        </w:rPr>
+        <w:t>the</w:t>
+      </w:r>
+      <w:proofErr w:type="spellEnd"/>
+      <w:r>
+        <w:rPr>
+          <w:rFonts w:ascii="Courier New" w:eastAsia="Courier New" w:hAnsi="Courier New" w:cs="Courier New"/>
+          <w:sz w:val="28"/>
+          <w:szCs w:val="28"/>
+        </w:rPr>
+        <w:t xml:space="preserve"> careful levels of from extraordinarily river times letter seventeen rainfall, crossing a described of the ferry valley measurements and the </w:t>
+      </w:r>
+      <w:proofErr w:type="spellStart"/>
+      <w:r>
+        <w:rPr>
+          <w:rFonts w:ascii="Courier New" w:eastAsia="Courier New" w:hAnsi="Courier New" w:cs="Courier New"/>
+          <w:sz w:val="28"/>
+          <w:szCs w:val="28"/>
+        </w:rPr>
+        <w:t>the</w:t>
+      </w:r>
+      <w:proofErr w:type="spellEnd"/>
+      <w:r>
+        <w:rPr>
+          <w:rFonts w:ascii="Courier New" w:eastAsia="Courier New" w:hAnsi="Courier New" w:cs="Courier New"/>
+          <w:sz w:val="28"/>
+          <w:szCs w:val="28"/>
+        </w:rPr>
+        <w:t xml:space="preserve"> careful levels of from extraordinarily river times letter seventeen rainfall, crossing a described of the ferry valley measurements and the </w:t>
+      </w:r>
+      <w:proofErr w:type="spellStart"/>
+      <w:r>
+        <w:rPr>
+          <w:rFonts w:ascii="Courier New" w:eastAsia="Courier New" w:hAnsi="Courier New" w:cs="Courier New"/>
+          <w:sz w:val="28"/>
+          <w:szCs w:val="28"/>
+        </w:rPr>
+        <w:t>the</w:t>
+      </w:r>
+      <w:proofErr w:type="spellEnd"/>
+      <w:r>
+        <w:rPr>
+          <w:rFonts w:ascii="Courier New" w:eastAsia="Courier New" w:hAnsi="Courier New" w:cs="Courier New"/>
+          <w:sz w:val="28"/>
+          <w:szCs w:val="28"/>
+        </w:rPr>
+        <w:t xml:space="preserve"> careful levels of from extraordinarily river times letter seventeen rainfall, crossing a described of the</w:t>
+      </w:r>
+    </w:p>
+    <w:p>
+      <w:r>
+        <w:rPr>
+          <w:rFonts w:ascii="Courier New" w:eastAsia="Courier New" w:hAnsi="Courier New" w:cs="Courier New"/>
+          <w:b/>
+          <w:bCs/>
+        </w:rPr>
+        <w:t xml:space="preserve">the careful levels of from extraordinarily river times letter seventeen rainfall, crossing a described of the ferry valley measurements and the </w:t>
+      </w:r>
+      <w:proofErr w:type="spellStart"/>
+      <w:r>
+        <w:rPr>
+          <w:rFonts w:ascii="Courier New" w:eastAsia="Courier New" w:hAnsi="Courier New" w:cs="Courier New"/>
+          <w:b/>
+          <w:bCs/>
+        </w:rPr>
+        <w:t>the</w:t>
+      </w:r>
+      <w:proofErr w:type="spellEnd"/>
+      <w:r>
+        <w:rPr>
+          <w:rFonts w:ascii="Courier New" w:eastAsia="Courier New" w:hAnsi="Courier New" w:cs="Courier New"/>
+          <w:b/>
+          <w:bCs/>
+        </w:rPr>
+        <w:t xml:space="preserve"> careful levels of from extraordinarily </w:t>
+      </w:r>
+      <w:r>
+        <w:rPr>
+          <w:rFonts w:ascii="Courier New" w:eastAsia="Courier New" w:hAnsi="Courier New" w:cs="Courier New"/>
+          <w:b/>
+          <w:bCs/>
+        </w:rPr>
+        <w:lastRenderedPageBreak/>
+        <w:t xml:space="preserve">river times letter seventeen rainfall, crossing a described of the ferry valley measurements and the </w:t>
+      </w:r>
+      <w:proofErr w:type="spellStart"/>
+      <w:r>
+        <w:rPr>
+          <w:rFonts w:ascii="Courier New" w:eastAsia="Courier New" w:hAnsi="Courier New" w:cs="Courier New"/>
+          <w:b/>
+          <w:bCs/>
+        </w:rPr>
+        <w:t>the</w:t>
+      </w:r>
+      <w:proofErr w:type="spellEnd"/>
+      <w:r>
+        <w:rPr>
+          <w:rFonts w:ascii="Courier New" w:eastAsia="Courier New" w:hAnsi="Courier New" w:cs="Courier New"/>
+          <w:b/>
+          <w:bCs/>
+        </w:rPr>
+        <w:t xml:space="preserve"> careful levels of from extraordinarily river times letter seventeen rainfall, crossing a described of the ferry valley measurements and the </w:t>
+      </w:r>
+      <w:proofErr w:type="spellStart"/>
+      <w:r>
+        <w:rPr>
+          <w:rFonts w:ascii="Courier New" w:eastAsia="Courier New" w:hAnsi="Courier New" w:cs="Courier New"/>
+          <w:b/>
+          <w:bCs/>
+        </w:rPr>
+        <w:t>the</w:t>
+      </w:r>
+      <w:proofErr w:type="spellEnd"/>
+      <w:r>
+        <w:rPr>
+          <w:rFonts w:ascii="Courier New" w:eastAsia="Courier New" w:hAnsi="Courier New" w:cs="Courier New"/>
+          <w:b/>
+          <w:bCs/>
+        </w:rPr>
+        <w:t xml:space="preserve"> careful levels of from extraordinarily river times letter seventeen rainfall, crossing a described of the ferry valley measurements and the </w:t>
+      </w:r>
+      <w:proofErr w:type="spellStart"/>
+      <w:r>
+        <w:rPr>
+          <w:rFonts w:ascii="Courier New" w:eastAsia="Courier New" w:hAnsi="Courier New" w:cs="Courier New"/>
+          <w:b/>
+          <w:bCs/>
+        </w:rPr>
+        <w:t>the</w:t>
+      </w:r>
+      <w:proofErr w:type="spellEnd"/>
+      <w:r>
+        <w:rPr>
+          <w:rFonts w:ascii="Courier New" w:eastAsia="Courier New" w:hAnsi="Courier New" w:cs="Courier New"/>
+          <w:b/>
+          <w:bCs/>
+        </w:rPr>
+        <w:t xml:space="preserve"> careful levels of from extraordinarily river times letter seventeen rainfall</w:t>
+      </w:r>
+      <w:r>
+        <w:rPr>
+          <w:rFonts w:ascii="Courier New" w:eastAsia="Courier New" w:hAnsi="Courier New" w:cs="Courier New"/>
+          <w:b/>
+          <w:bCs/>
+        </w:rPr>
+        <w:t>, crossing a described of the</w:t>
+      </w:r>
+    </w:p>
+    <w:p>
+      <w:pPr>
+        <w:pStyle w:val="Heading1"/>
+      </w:pPr>
       <w:bookmarkStart w:id="5" w:name="_Toc6"/>
       <w:r>
         <w:t>Line spacing</w:t>
@@ -639,7 +2522,66 @@
         <w:spacing w:line="360" w:lineRule="auto"/>
       </w:pPr>
       <w:r>
-        <w:t>the careful levels of from extraordinarily river times letter seventeen rainfall, crossing a described of the ferry valley measurements and the the careful levels of from extraordinarily river times letter seventeen rainfall, crossing a described of the ferry valley measurements and the the careful levels of from extraordinarily river times letter seventeen rainfall, crossing a described of the ferry valley measurements and the the careful levels of from extraordinarily river times letter seventeen rainfall, crossing a described of the ferry valley measurements and the the careful levels of from extraordinarily river times letter seventeen rainfall, crossing a described of the ferry valley measurements and the the careful levels of from extraordinarily river times letter seventeen rainfall, crossing a described of the ferry valley measurements and the the careful levels of from extraordinarily river times letter seventeen rainfall, crossing a described of the ferry valley measurements and the the careful levels of from extraordinarily river times letter seventeen rainfall, crossing a</w:t>
+        <w:t xml:space="preserve">the careful levels of from extraordinarily river times letter seventeen rainfall, crossing a described of the ferry valley measurements and the </w:t>
+      </w:r>
+      <w:proofErr w:type="spellStart"/>
+      <w:r>
+        <w:t>the</w:t>
+      </w:r>
+      <w:proofErr w:type="spellEnd"/>
+      <w:r>
+        <w:t xml:space="preserve"> careful levels of from extraordinarily river times letter seventeen rainfall, crossing a described of the ferry valley measurements and the </w:t>
+      </w:r>
+      <w:proofErr w:type="spellStart"/>
+      <w:r>
+        <w:t>the</w:t>
+      </w:r>
+      <w:proofErr w:type="spellEnd"/>
+      <w:r>
+        <w:t xml:space="preserve"> careful levels of from extraordinarily river times letter seventeen rainfall, crossing a described of the ferry valley measurements and the </w:t>
+      </w:r>
+      <w:proofErr w:type="spellStart"/>
+      <w:r>
+        <w:t>the</w:t>
+      </w:r>
+      <w:proofErr w:type="spellEnd"/>
+      <w:r>
+        <w:t xml:space="preserve"> careful levels of from extraordinarily river times letter seventeen rainfall, crossing a described of the ferry valley measurements and the </w:t>
+      </w:r>
+      <w:proofErr w:type="spellStart"/>
+      <w:r>
+        <w:t>the</w:t>
+      </w:r>
+      <w:proofErr w:type="spellEnd"/>
+      <w:r>
+        <w:t xml:space="preserve"> careful levels of from extraordinarily river times letter seventeen rainfall</w:t>
+      </w:r>
+      <w:r>
+        <w:t xml:space="preserve">, crossing a described of the ferry valley measurements and the </w:t>
+      </w:r>
+      <w:proofErr w:type="spellStart"/>
+      <w:r>
+        <w:t>the</w:t>
+      </w:r>
+      <w:proofErr w:type="spellEnd"/>
+      <w:r>
+        <w:t xml:space="preserve"> careful levels of from extraordinarily river times letter seventeen rainfall, crossing a described of the ferry valley measurements and the </w:t>
+      </w:r>
+      <w:proofErr w:type="spellStart"/>
+      <w:r>
+        <w:t>the</w:t>
+      </w:r>
+      <w:proofErr w:type="spellEnd"/>
+      <w:r>
+        <w:t xml:space="preserve"> careful levels of from extraordinarily river times letter seventeen rainfall, crossing a described of the ferry valley measurements and the </w:t>
+      </w:r>
+      <w:proofErr w:type="spellStart"/>
+      <w:r>
+        <w:t>the</w:t>
+      </w:r>
+      <w:proofErr w:type="spellEnd"/>
+      <w:r>
+        <w:t xml:space="preserve"> careful levels of from extraordinarily river times letter seventeen rainfall, crossing a</w:t>
       </w:r>
     </w:p>
     <w:p>
@@ -647,7 +2589,58 @@
         <w:spacing w:line="480" w:lineRule="auto"/>
       </w:pPr>
       <w:r>
-        <w:t>seventeen rainfall, crossing a described of the ferry valley measurements and the the careful levels of from extraordinarily river times letter seventeen rainfall, crossing a described of the ferry valley measurements and the the careful levels of from extraordinarily river times letter seventeen rainfall, crossing a described of the ferry valley measurements and the the careful levels of from extraordinarily river times letter seventeen rainfall, crossing a described of the ferry valley measurements and the the careful levels of from extraordinarily river times letter seventeen rainfall, crossing a described of the ferry valley measurements and the the careful levels of from extraordinarily river times letter seventeen rainfall, crossing a described of the ferry valley measurements and the the careful levels</w:t>
+        <w:t xml:space="preserve">seventeen rainfall, crossing a described of the ferry valley measurements and the </w:t>
+      </w:r>
+      <w:proofErr w:type="spellStart"/>
+      <w:r>
+        <w:t>the</w:t>
+      </w:r>
+      <w:proofErr w:type="spellEnd"/>
+      <w:r>
+        <w:t xml:space="preserve"> careful levels of from extraordinarily river times letter seventeen rainfall, crossing a described of the ferry valley measurements and the </w:t>
+      </w:r>
+      <w:proofErr w:type="spellStart"/>
+      <w:r>
+        <w:t>the</w:t>
+      </w:r>
+      <w:proofErr w:type="spellEnd"/>
+      <w:r>
+        <w:t xml:space="preserve"> careful levels of from extraordinarily river times letter seventeen rainfall, crossing a described of the ferry valley measurements and the </w:t>
+      </w:r>
+      <w:proofErr w:type="spellStart"/>
+      <w:r>
+        <w:t>the</w:t>
+      </w:r>
+      <w:proofErr w:type="spellEnd"/>
+      <w:r>
+        <w:t xml:space="preserve"> careful levels of from extraordinarily river times letter seventeen rainfall, crossing a described of the ferry valley measurements and the </w:t>
+      </w:r>
+      <w:proofErr w:type="spellStart"/>
+      <w:r>
+        <w:t>the</w:t>
+      </w:r>
+      <w:proofErr w:type="spellEnd"/>
+      <w:r>
+        <w:t xml:space="preserve"> careful levels of from extraordinarily river times letter seventeen rainfall</w:t>
+      </w:r>
+      <w:r>
+        <w:t xml:space="preserve">, crossing a described of the ferry valley measurements and the </w:t>
+      </w:r>
+      <w:proofErr w:type="spellStart"/>
+      <w:r>
+        <w:t>the</w:t>
+      </w:r>
+      <w:proofErr w:type="spellEnd"/>
+      <w:r>
+        <w:t xml:space="preserve"> careful levels of from extraordinarily river times letter seventeen rainfall, crossing a described of the ferry valley measurements and the </w:t>
+      </w:r>
+      <w:proofErr w:type="spellStart"/>
+      <w:r>
+        <w:t>the</w:t>
+      </w:r>
+      <w:proofErr w:type="spellEnd"/>
+      <w:r>
+        <w:t xml:space="preserve"> careful levels</w:t>
       </w:r>
     </w:p>
     <w:p>
@@ -655,11 +2648,70 @@
         <w:spacing w:line="300" w:lineRule="exact"/>
       </w:pPr>
       <w:r>
-        <w:t xml:space="preserve">measurements and the the careful levels of from extraordinarily river times letter seventeen rainfall, crossing a described of the ferry valley measurements and the the careful levels of from extraordinarily river times letter seventeen rainfall, crossing a described of the ferry valley </w:t>
+        <w:t xml:space="preserve">measurements and the </w:t>
+      </w:r>
+      <w:proofErr w:type="spellStart"/>
+      <w:r>
+        <w:t>the</w:t>
+      </w:r>
+      <w:proofErr w:type="spellEnd"/>
+      <w:r>
+        <w:t xml:space="preserve"> careful levels of from extraordinarily river times letter seventeen rainfall, crossing a described of the ferry valley measurements and the </w:t>
+      </w:r>
+      <w:proofErr w:type="spellStart"/>
+      <w:r>
+        <w:t>the</w:t>
+      </w:r>
+      <w:proofErr w:type="spellEnd"/>
+      <w:r>
+        <w:t xml:space="preserve"> careful levels of from extraordinarily river times letter seventeen rainfall, crossing a described of the ferry valley </w:t>
       </w:r>
       <w:r>
         <w:lastRenderedPageBreak/>
-        <w:t>measurements and the the careful levels of from extraordinarily river times letter seventeen rainfall, crossing a described of the ferry valley measurements and the the careful levels of from extraordinarily river times letter seventeen rainfall, crossing a described of the ferry valley measurements and the the careful levels of from extraordinarily river times letter seventeen rainfall, crossing a described of the ferry valley measurements and the the careful levels of from extraordinarily river times letter seventeen rainfall, crossing a described of the ferry valley measurements and the the careful levels of from extraordinarily river times letter seventeen rainfall,</w:t>
+        <w:t xml:space="preserve">measurements and the </w:t>
+      </w:r>
+      <w:proofErr w:type="spellStart"/>
+      <w:r>
+        <w:t>the</w:t>
+      </w:r>
+      <w:proofErr w:type="spellEnd"/>
+      <w:r>
+        <w:t xml:space="preserve"> careful levels of from extraordinarily river times letter seventeen rainfall, crossing a described of the ferry valley measurements and the </w:t>
+      </w:r>
+      <w:proofErr w:type="spellStart"/>
+      <w:r>
+        <w:t>the</w:t>
+      </w:r>
+      <w:proofErr w:type="spellEnd"/>
+      <w:r>
+        <w:t xml:space="preserve"> careful levels of from extraordinarily river times letter seventeen rainfall</w:t>
+      </w:r>
+      <w:r>
+        <w:t xml:space="preserve">, crossing a described of the ferry valley measurements and the </w:t>
+      </w:r>
+      <w:proofErr w:type="spellStart"/>
+      <w:r>
+        <w:t>the</w:t>
+      </w:r>
+      <w:proofErr w:type="spellEnd"/>
+      <w:r>
+        <w:t xml:space="preserve"> careful levels of from extraordinarily river times letter seventeen rainfall, crossing a described of the ferry valley measurements and the </w:t>
+      </w:r>
+      <w:proofErr w:type="spellStart"/>
+      <w:r>
+        <w:t>the</w:t>
+      </w:r>
+      <w:proofErr w:type="spellEnd"/>
+      <w:r>
+        <w:t xml:space="preserve"> careful levels of from extraordinarily river times letter seventeen rainfall, crossing a described of the ferry valley measurements and the </w:t>
+      </w:r>
+      <w:proofErr w:type="spellStart"/>
+      <w:r>
+        <w:t>the</w:t>
+      </w:r>
+      <w:proofErr w:type="spellEnd"/>
+      <w:r>
+        <w:t xml:space="preserve"> careful levels of from extraordinarily river times letter seventeen rainfall,</w:t>
       </w:r>
     </w:p>
     <w:p>
@@ -667,7 +2719,58 @@
         <w:spacing w:line="400" w:lineRule="atLeast"/>
       </w:pPr>
       <w:r>
-        <w:t>river times letter seventeen rainfall, crossing a described of the ferry valley measurements and the the careful levels of from extraordinarily river times letter seventeen rainfall, crossing a described of the ferry valley measurements and the the careful levels of from extraordinarily river times letter seventeen rainfall, crossing a described of the ferry valley measurements and the the careful levels of from extraordinarily river times letter seventeen rainfall, crossing a described of the ferry valley measurements and the the careful levels of from extraordinarily river times letter seventeen rainfall, crossing a described of the ferry valley measurements and the the careful levels of from extraordinarily river times letter seventeen rainfall, crossing a described of the ferry valley measurements and the the careful levels of from extraordinarily river times letter seventeen rainfall, crossing a described of the ferry valley measurements and</w:t>
+        <w:t xml:space="preserve">river times letter seventeen rainfall, crossing a described of the ferry valley measurements and the </w:t>
+      </w:r>
+      <w:proofErr w:type="spellStart"/>
+      <w:r>
+        <w:t>the</w:t>
+      </w:r>
+      <w:proofErr w:type="spellEnd"/>
+      <w:r>
+        <w:t xml:space="preserve"> careful levels of from extraordinarily river times letter seventeen rainfall, crossing a described of the ferry valley measurements and the </w:t>
+      </w:r>
+      <w:proofErr w:type="spellStart"/>
+      <w:r>
+        <w:t>the</w:t>
+      </w:r>
+      <w:proofErr w:type="spellEnd"/>
+      <w:r>
+        <w:t xml:space="preserve"> careful levels of from extraordinarily river times letter seventeen rainfall, crossing a described of the ferry valley measurements and the </w:t>
+      </w:r>
+      <w:proofErr w:type="spellStart"/>
+      <w:r>
+        <w:t>the</w:t>
+      </w:r>
+      <w:proofErr w:type="spellEnd"/>
+      <w:r>
+        <w:t xml:space="preserve"> careful levels of from extraordinarily river times letter seventeen rainfall, crossing a described of the ferry valley measurements and the </w:t>
+      </w:r>
+      <w:proofErr w:type="spellStart"/>
+      <w:r>
+        <w:t>the</w:t>
+      </w:r>
+      <w:proofErr w:type="spellEnd"/>
+      <w:r>
+        <w:t xml:space="preserve"> careful levels of from extraordinarily river times letter seventeen rainfall</w:t>
+      </w:r>
+      <w:r>
+        <w:t xml:space="preserve">, crossing a described of the ferry valley measurements and the </w:t>
+      </w:r>
+      <w:proofErr w:type="spellStart"/>
+      <w:r>
+        <w:t>the</w:t>
+      </w:r>
+      <w:proofErr w:type="spellEnd"/>
+      <w:r>
+        <w:t xml:space="preserve"> careful levels of from extraordinarily river times letter seventeen rainfall, crossing a described of the ferry valley measurements and the </w:t>
+      </w:r>
+      <w:proofErr w:type="spellStart"/>
+      <w:r>
+        <w:t>the</w:t>
+      </w:r>
+      <w:proofErr w:type="spellEnd"/>
+      <w:r>
+        <w:t xml:space="preserve"> careful levels of from extraordinarily river times letter seventeen rainfall, crossing a described of the ferry valley measurements and</w:t>
       </w:r>
     </w:p>
     <w:p>
@@ -685,7 +2788,15 @@
         <w:spacing w:after="240"/>
       </w:pPr>
       <w:r>
-        <w:t>a described of the ferry valley measurements and the the careful levels of from extraordinarily river times letter seventeen rainfall, crossing a described of the ferry valley measurements and the</w:t>
+        <w:t xml:space="preserve">a described of the ferry valley measurements and the </w:t>
+      </w:r>
+      <w:proofErr w:type="spellStart"/>
+      <w:r>
+        <w:t>the</w:t>
+      </w:r>
+      <w:proofErr w:type="spellEnd"/>
+      <w:r>
+        <w:t xml:space="preserve"> careful levels of from extraordinarily river times letter seventeen rainfall, crossing a described of the ferry valley measurements and the</w:t>
       </w:r>
     </w:p>
     <w:p>
@@ -693,7 +2804,23 @@
         <w:spacing w:before="60" w:after="220"/>
       </w:pPr>
       <w:r>
-        <w:t>the careful levels of from extraordinarily river times letter seventeen rainfall, crossing a described of the ferry valley measurements and the the careful levels of from extraordinarily river times letter seventeen rainfall, crossing a described of the ferry valley measurements and the the careful levels</w:t>
+        <w:t xml:space="preserve">the careful levels of from extraordinarily river times letter seventeen rainfall, crossing a described of the ferry valley measurements and the </w:t>
+      </w:r>
+      <w:proofErr w:type="spellStart"/>
+      <w:r>
+        <w:t>the</w:t>
+      </w:r>
+      <w:proofErr w:type="spellEnd"/>
+      <w:r>
+        <w:t xml:space="preserve"> careful levels of from extraordinarily river times letter seventeen rainfall, crossing a described of the ferry valley measurements and the </w:t>
+      </w:r>
+      <w:proofErr w:type="spellStart"/>
+      <w:r>
+        <w:t>the</w:t>
+      </w:r>
+      <w:proofErr w:type="spellEnd"/>
+      <w:r>
+        <w:t xml:space="preserve"> careful levels</w:t>
       </w:r>
     </w:p>
     <w:p>
@@ -701,7 +2828,39 @@
         <w:spacing w:before="120" w:after="200"/>
       </w:pPr>
       <w:r>
-        <w:t>seventeen rainfall, crossing a described of the ferry valley measurements and the the careful levels of from extraordinarily river times letter seventeen rainfall, crossing a described of the ferry valley measurements and the the careful levels of from extraordinarily river times letter seventeen rainfall, crossing a described of the ferry valley measurements and the the careful levels of from extraordinarily</w:t>
+        <w:t xml:space="preserve">seventeen </w:t>
+      </w:r>
+      <w:proofErr w:type="gramStart"/>
+      <w:r>
+        <w:t>rainfall</w:t>
+      </w:r>
+      <w:proofErr w:type="gramEnd"/>
+      <w:r>
+        <w:t xml:space="preserve">, crossing a described of the ferry valley measurements and the </w:t>
+      </w:r>
+      <w:proofErr w:type="spellStart"/>
+      <w:r>
+        <w:t>the</w:t>
+      </w:r>
+      <w:proofErr w:type="spellEnd"/>
+      <w:r>
+        <w:t xml:space="preserve"> careful levels of from extraordinarily river times letter seventeen rainfall, crossing a described of the ferry valley measurements and the </w:t>
+      </w:r>
+      <w:proofErr w:type="spellStart"/>
+      <w:r>
+        <w:t>the</w:t>
+      </w:r>
+      <w:proofErr w:type="spellEnd"/>
+      <w:r>
+        <w:t xml:space="preserve"> careful levels of from extraordinarily river times letter seventeen rainfall, crossing a described of the ferry valley measurements and the </w:t>
+      </w:r>
+      <w:proofErr w:type="spellStart"/>
+      <w:r>
+        <w:t>the</w:t>
+      </w:r>
+      <w:proofErr w:type="spellEnd"/>
+      <w:r>
+        <w:t xml:space="preserve"> careful levels of from extraordinarily</w:t>
       </w:r>
     </w:p>
     <w:p>
@@ -709,7 +2868,39 @@
         <w:spacing w:before="180" w:after="180"/>
       </w:pPr>
       <w:r>
-        <w:t>measurements and the the careful levels of from extraordinarily river times letter seventeen rainfall, crossing a described of the ferry valley measurements and the the careful levels of from extraordinarily river times letter seventeen rainfall, crossing a described of the ferry valley measurements and the the careful levels of from extraordinarily river times letter seventeen rainfall, crossing a described of the ferry valley measurements and the the careful levels of from extraordinarily river times letter</w:t>
+        <w:t xml:space="preserve">measurements and the </w:t>
+      </w:r>
+      <w:proofErr w:type="spellStart"/>
+      <w:r>
+        <w:t>the</w:t>
+      </w:r>
+      <w:proofErr w:type="spellEnd"/>
+      <w:r>
+        <w:t xml:space="preserve"> careful levels of from extraordinarily river times letter seventeen rainfall, crossing a described of the ferry valley measurements and the </w:t>
+      </w:r>
+      <w:proofErr w:type="spellStart"/>
+      <w:r>
+        <w:t>the</w:t>
+      </w:r>
+      <w:proofErr w:type="spellEnd"/>
+      <w:r>
+        <w:t xml:space="preserve"> careful levels of from extraordinarily river times letter seventeen rainfall, crossing a described of the ferry valley measurements and the </w:t>
+      </w:r>
+      <w:proofErr w:type="spellStart"/>
+      <w:r>
+        <w:t>the</w:t>
+      </w:r>
+      <w:proofErr w:type="spellEnd"/>
+      <w:r>
+        <w:t xml:space="preserve"> careful levels of from extraordinarily river times letter seventeen rainfall, crossing a described of the ferry valley measurements and the </w:t>
+      </w:r>
+      <w:proofErr w:type="spellStart"/>
+      <w:r>
+        <w:t>the</w:t>
+      </w:r>
+      <w:proofErr w:type="spellEnd"/>
+      <w:r>
+        <w:t xml:space="preserve"> careful levels of from extraordinarily river times letter</w:t>
       </w:r>
     </w:p>
     <w:p>
@@ -717,11 +2908,46 @@
         <w:spacing w:before="240"/>
       </w:pPr>
       <w:r>
-        <w:t xml:space="preserve">river times letter seventeen rainfall, crossing a described of the ferry valley measurements and the the careful levels of from extraordinarily river times letter seventeen rainfall, crossing a described of the ferry valley measurements and the the careful levels of from extraordinarily river times letter seventeen rainfall, crossing a described of the ferry valley measurements and the the careful levels of from extraordinarily river times letter seventeen rainfall, crossing a described of the ferry valley </w:t>
+        <w:t xml:space="preserve">river times letter seventeen rainfall, crossing a described of the ferry valley measurements and the </w:t>
+      </w:r>
+      <w:proofErr w:type="spellStart"/>
+      <w:r>
+        <w:t>the</w:t>
+      </w:r>
+      <w:proofErr w:type="spellEnd"/>
+      <w:r>
+        <w:t xml:space="preserve"> careful levels of from extraordinarily river times letter seventeen rainfall, crossing a described of the ferry valley measurements and the </w:t>
+      </w:r>
+      <w:proofErr w:type="spellStart"/>
+      <w:r>
+        <w:t>the</w:t>
+      </w:r>
+      <w:proofErr w:type="spellEnd"/>
+      <w:r>
+        <w:t xml:space="preserve"> careful levels of from extraordinarily river times letter seventeen rainfall, crossing a described of the ferry valley measurements and the </w:t>
+      </w:r>
+      <w:proofErr w:type="spellStart"/>
+      <w:r>
+        <w:t>the</w:t>
+      </w:r>
+      <w:proofErr w:type="spellEnd"/>
+      <w:r>
+        <w:t xml:space="preserve"> careful levels of from extraordinarily river times letter seventeen rainfall, crossing a described of the ferry valley </w:t>
       </w:r>
       <w:r>
         <w:lastRenderedPageBreak/>
-        <w:t>measurements and the the careful levels of from extraordinarily river times letter seventeen rainfall, crossing</w:t>
+        <w:t xml:space="preserve">measurements and the </w:t>
+      </w:r>
+      <w:proofErr w:type="spellStart"/>
+      <w:r>
+        <w:t>the</w:t>
+      </w:r>
+      <w:proofErr w:type="spellEnd"/>
+      <w:r>
+        <w:t xml:space="preserve"> careful levels of from extraordinarily river times letter seventeen rainfall</w:t>
+      </w:r>
+      <w:r>
+        <w:t>, crossing</w:t>
       </w:r>
     </w:p>
     <w:p>
@@ -729,7 +2955,50 @@
         <w:spacing w:before="300" w:after="140"/>
       </w:pPr>
       <w:r>
-        <w:t>the ferry valley measurements and the the careful levels of from extraordinarily river times letter seventeen rainfall, crossing a described of the ferry valley measurements and the the careful levels of from extraordinarily river times letter seventeen rainfall, crossing a described of the ferry valley measurements and the the careful levels of from extraordinarily river times letter seventeen rainfall, crossing a described of the ferry valley measurements and the the careful levels of from extraordinarily river times letter seventeen rainfall, crossing a described of the ferry valley measurements and the the careful levels of from extraordinarily river times letter seventeen rainfall, crossing a described of</w:t>
+        <w:t xml:space="preserve">the ferry valley measurements and the </w:t>
+      </w:r>
+      <w:proofErr w:type="spellStart"/>
+      <w:r>
+        <w:t>the</w:t>
+      </w:r>
+      <w:proofErr w:type="spellEnd"/>
+      <w:r>
+        <w:t xml:space="preserve"> careful levels of from extraordinarily river times letter seventeen rainfall, crossing a described of the ferry valley measurements and the </w:t>
+      </w:r>
+      <w:proofErr w:type="spellStart"/>
+      <w:r>
+        <w:t>the</w:t>
+      </w:r>
+      <w:proofErr w:type="spellEnd"/>
+      <w:r>
+        <w:t xml:space="preserve"> careful levels of from extraordinarily river times letter seventeen rainfall, crossing a described of the ferry valley measurements and the </w:t>
+      </w:r>
+      <w:proofErr w:type="spellStart"/>
+      <w:r>
+        <w:t>the</w:t>
+      </w:r>
+      <w:proofErr w:type="spellEnd"/>
+      <w:r>
+        <w:t xml:space="preserve"> careful levels of from extraordinarily river times letter seventeen rainfall, crossing a described of the ferry valley measurements and the </w:t>
+      </w:r>
+      <w:proofErr w:type="spellStart"/>
+      <w:r>
+        <w:t>the</w:t>
+      </w:r>
+      <w:proofErr w:type="spellEnd"/>
+      <w:r>
+        <w:t xml:space="preserve"> careful levels of from extraordinarily river times letter seventeen rainfall</w:t>
+      </w:r>
+      <w:r>
+        <w:t xml:space="preserve">, crossing a described of the ferry valley measurements and the </w:t>
+      </w:r>
+      <w:proofErr w:type="spellStart"/>
+      <w:r>
+        <w:t>the</w:t>
+      </w:r>
+      <w:proofErr w:type="spellEnd"/>
+      <w:r>
+        <w:t xml:space="preserve"> careful levels of from extraordinarily river times letter seventeen rainfall, crossing a described of</w:t>
       </w:r>
     </w:p>
     <w:p>
@@ -737,7 +3006,50 @@
         <w:spacing w:before="360" w:after="120"/>
       </w:pPr>
       <w:r>
-        <w:t>of from extraordinarily river times letter seventeen rainfall, crossing a described of the ferry valley measurements and the the careful levels of from extraordinarily river times letter seventeen rainfall, crossing a described of the ferry valley measurements and the the careful levels of from extraordinarily river times letter seventeen rainfall, crossing a described of the ferry valley measurements and the the careful levels of from extraordinarily river times letter seventeen rainfall, crossing a described of the ferry valley measurements and the the careful levels of from extraordinarily river times letter seventeen rainfall, crossing a described of the ferry valley measurements and the the careful levels of from extraordinarily river times letter seventeen rainfall, crossing a described of the ferry valley</w:t>
+        <w:t xml:space="preserve">of from extraordinarily river times letter seventeen rainfall, crossing a described of the ferry valley measurements and the </w:t>
+      </w:r>
+      <w:proofErr w:type="spellStart"/>
+      <w:r>
+        <w:t>the</w:t>
+      </w:r>
+      <w:proofErr w:type="spellEnd"/>
+      <w:r>
+        <w:t xml:space="preserve"> careful levels of from extraordinarily river times letter seventeen rainfall, crossing a described of the ferry valley measurements and the </w:t>
+      </w:r>
+      <w:proofErr w:type="spellStart"/>
+      <w:r>
+        <w:t>the</w:t>
+      </w:r>
+      <w:proofErr w:type="spellEnd"/>
+      <w:r>
+        <w:t xml:space="preserve"> careful levels of from extraordinarily river times letter seventeen rainfall, crossing a described of the ferry valley measurements and the </w:t>
+      </w:r>
+      <w:proofErr w:type="spellStart"/>
+      <w:r>
+        <w:t>the</w:t>
+      </w:r>
+      <w:proofErr w:type="spellEnd"/>
+      <w:r>
+        <w:t xml:space="preserve"> careful levels of from extraordinarily river times letter seventeen rainfall, crossing a described of the ferry valley measurements and the </w:t>
+      </w:r>
+      <w:proofErr w:type="spellStart"/>
+      <w:r>
+        <w:t>the</w:t>
+      </w:r>
+      <w:proofErr w:type="spellEnd"/>
+      <w:r>
+        <w:t xml:space="preserve"> careful levels of from extraordinarily river times letter seventeen rainfall</w:t>
+      </w:r>
+      <w:r>
+        <w:t xml:space="preserve">, crossing a described of the ferry valley measurements and the </w:t>
+      </w:r>
+      <w:proofErr w:type="spellStart"/>
+      <w:r>
+        <w:t>the</w:t>
+      </w:r>
+      <w:proofErr w:type="spellEnd"/>
+      <w:r>
+        <w:t xml:space="preserve"> careful levels of from extraordinarily river times letter seventeen rainfall, crossing a described of the ferry valley</w:t>
       </w:r>
     </w:p>
     <w:p>
@@ -745,7 +3057,58 @@
         <w:spacing w:before="420" w:after="100"/>
       </w:pPr>
       <w:r>
-        <w:t>a described of the ferry valley measurements and the the careful levels of from extraordinarily river times letter seventeen rainfall, crossing a described of the ferry valley measurements and the the careful levels of from extraordinarily river times letter seventeen rainfall, crossing a described of the ferry valley measurements and the the careful levels of from extraordinarily river times letter seventeen rainfall, crossing a described of the ferry valley measurements and the the careful levels of from extraordinarily river times letter seventeen rainfall, crossing a described of the ferry valley measurements and the the careful levels of from extraordinarily river times letter seventeen rainfall, crossing a described of the ferry valley measurements and the the careful levels of from extraordinarily river times letter seventeen rainfall, crossing a described of the ferry valley measurements and the</w:t>
+        <w:t xml:space="preserve">a described of the ferry valley measurements and the </w:t>
+      </w:r>
+      <w:proofErr w:type="spellStart"/>
+      <w:r>
+        <w:t>the</w:t>
+      </w:r>
+      <w:proofErr w:type="spellEnd"/>
+      <w:r>
+        <w:t xml:space="preserve"> careful levels of from extraordinarily river times letter seventeen rainfall, crossing a described of the ferry valley measurements and the </w:t>
+      </w:r>
+      <w:proofErr w:type="spellStart"/>
+      <w:r>
+        <w:t>the</w:t>
+      </w:r>
+      <w:proofErr w:type="spellEnd"/>
+      <w:r>
+        <w:t xml:space="preserve"> careful levels of from extraordinarily river times letter seventeen rainfall, crossing a described of the ferry valley measurements and the </w:t>
+      </w:r>
+      <w:proofErr w:type="spellStart"/>
+      <w:r>
+        <w:t>the</w:t>
+      </w:r>
+      <w:proofErr w:type="spellEnd"/>
+      <w:r>
+        <w:t xml:space="preserve"> careful levels of from extraordinarily river times letter seventeen rainfall, crossing a described of the ferry valley measurements and the </w:t>
+      </w:r>
+      <w:proofErr w:type="spellStart"/>
+      <w:r>
+        <w:t>the</w:t>
+      </w:r>
+      <w:proofErr w:type="spellEnd"/>
+      <w:r>
+        <w:t xml:space="preserve"> careful levels of from extraordinarily river times letter seventeen rainfall</w:t>
+      </w:r>
+      <w:r>
+        <w:t xml:space="preserve">, crossing a described of the ferry valley measurements and the </w:t>
+      </w:r>
+      <w:proofErr w:type="spellStart"/>
+      <w:r>
+        <w:t>the</w:t>
+      </w:r>
+      <w:proofErr w:type="spellEnd"/>
+      <w:r>
+        <w:t xml:space="preserve"> careful levels of from extraordinarily river times letter seventeen rainfall, crossing a described of the ferry valley measurements and the </w:t>
+      </w:r>
+      <w:proofErr w:type="spellStart"/>
+      <w:r>
+        <w:t>the</w:t>
+      </w:r>
+      <w:proofErr w:type="spellEnd"/>
+      <w:r>
+        <w:t xml:space="preserve"> careful levels of from extraordinarily river times letter seventeen rainfall, crossing a described of the ferry valley measurements and the</w:t>
       </w:r>
     </w:p>
     <w:p>
@@ -755,7 +3118,15 @@
         <w:contextualSpacing/>
       </w:pPr>
       <w:r>
-        <w:t>a described of the ferry valley measurements and the the careful levels of from extraordinarily river times letter seventeen rainfall,</w:t>
+        <w:t xml:space="preserve">a described of the ferry valley measurements and the </w:t>
+      </w:r>
+      <w:proofErr w:type="spellStart"/>
+      <w:r>
+        <w:t>the</w:t>
+      </w:r>
+      <w:proofErr w:type="spellEnd"/>
+      <w:r>
+        <w:t xml:space="preserve"> careful levels of from extraordinarily river times letter seventeen rainfall,</w:t>
       </w:r>
     </w:p>
     <w:p>
@@ -765,7 +3136,15 @@
         <w:contextualSpacing/>
       </w:pPr>
       <w:r>
-        <w:t>the careful levels of from extraordinarily river times letter seventeen rainfall, crossing a described of the ferry valley measurements and the the careful levels of from extraordinarily river times letter</w:t>
+        <w:t xml:space="preserve">the careful levels of from extraordinarily river times letter seventeen rainfall, crossing a described of the ferry valley measurements and the </w:t>
+      </w:r>
+      <w:proofErr w:type="spellStart"/>
+      <w:r>
+        <w:t>the</w:t>
+      </w:r>
+      <w:proofErr w:type="spellEnd"/>
+      <w:r>
+        <w:t xml:space="preserve"> careful levels of from extraordinarily river times letter</w:t>
       </w:r>
     </w:p>
     <w:p>
@@ -775,7 +3154,31 @@
         <w:contextualSpacing/>
       </w:pPr>
       <w:r>
-        <w:t>seventeen rainfall, crossing a described of the ferry valley measurements and the the careful levels of from extraordinarily river times letter seventeen rainfall, crossing a described of the ferry valley measurements and the the careful levels of from extraordinarily river</w:t>
+        <w:t xml:space="preserve">seventeen </w:t>
+      </w:r>
+      <w:proofErr w:type="gramStart"/>
+      <w:r>
+        <w:t>rainfall</w:t>
+      </w:r>
+      <w:proofErr w:type="gramEnd"/>
+      <w:r>
+        <w:t xml:space="preserve">, crossing a described of the ferry valley measurements and the </w:t>
+      </w:r>
+      <w:proofErr w:type="spellStart"/>
+      <w:r>
+        <w:t>the</w:t>
+      </w:r>
+      <w:proofErr w:type="spellEnd"/>
+      <w:r>
+        <w:t xml:space="preserve"> careful levels of from extraordinarily river times letter seventeen rainfall, crossing a described of the ferry valley measurements and the </w:t>
+      </w:r>
+      <w:proofErr w:type="spellStart"/>
+      <w:r>
+        <w:t>the</w:t>
+      </w:r>
+      <w:proofErr w:type="spellEnd"/>
+      <w:r>
+        <w:t xml:space="preserve"> careful levels of from extraordinarily river</w:t>
       </w:r>
     </w:p>
     <w:p>
@@ -785,7 +3188,31 @@
         <w:contextualSpacing/>
       </w:pPr>
       <w:r>
-        <w:t>measurements and the the careful levels of from extraordinarily river times letter seventeen rainfall, crossing a described of the ferry valley measurements and the the careful levels of from extraordinarily river times letter seventeen rainfall, crossing a described of the ferry valley measurements and the the careful levels of from</w:t>
+        <w:t xml:space="preserve">measurements and the </w:t>
+      </w:r>
+      <w:proofErr w:type="spellStart"/>
+      <w:r>
+        <w:t>the</w:t>
+      </w:r>
+      <w:proofErr w:type="spellEnd"/>
+      <w:r>
+        <w:t xml:space="preserve"> careful levels of from extraordinarily river times letter seventeen rainfall, crossing a described of the ferry valley measurements and the </w:t>
+      </w:r>
+      <w:proofErr w:type="spellStart"/>
+      <w:r>
+        <w:t>the</w:t>
+      </w:r>
+      <w:proofErr w:type="spellEnd"/>
+      <w:r>
+        <w:t xml:space="preserve"> careful levels of from extraordinarily river times letter seventeen rainfall, crossing a described of the ferry valley measurements and the </w:t>
+      </w:r>
+      <w:proofErr w:type="spellStart"/>
+      <w:r>
+        <w:t>the</w:t>
+      </w:r>
+      <w:proofErr w:type="spellEnd"/>
+      <w:r>
+        <w:t xml:space="preserve"> careful levels of from</w:t>
       </w:r>
     </w:p>
     <w:p>
@@ -795,7 +3222,31 @@
         <w:contextualSpacing/>
       </w:pPr>
       <w:r>
-        <w:t>river times letter seventeen rainfall, crossing a described of the ferry valley measurements and the the careful levels of from extraordinarily river times letter seventeen rainfall, crossing a described of the ferry valley measurements and the the careful levels of from extraordinarily river times letter seventeen rainfall, crossing a described of the ferry valley measurements and the the careful levels</w:t>
+        <w:t xml:space="preserve">river times letter seventeen rainfall, crossing a described of the ferry valley measurements and the </w:t>
+      </w:r>
+      <w:proofErr w:type="spellStart"/>
+      <w:r>
+        <w:t>the</w:t>
+      </w:r>
+      <w:proofErr w:type="spellEnd"/>
+      <w:r>
+        <w:t xml:space="preserve"> careful levels of from extraordinarily river times letter seventeen rainfall, crossing a described of the ferry valley measurements and the </w:t>
+      </w:r>
+      <w:proofErr w:type="spellStart"/>
+      <w:r>
+        <w:t>the</w:t>
+      </w:r>
+      <w:proofErr w:type="spellEnd"/>
+      <w:r>
+        <w:t xml:space="preserve"> careful levels of from extraordinarily river times letter seventeen rainfall, crossing a described of the ferry valley measurements and the </w:t>
+      </w:r>
+      <w:proofErr w:type="spellStart"/>
+      <w:r>
+        <w:t>the</w:t>
+      </w:r>
+      <w:proofErr w:type="spellEnd"/>
+      <w:r>
+        <w:t xml:space="preserve"> careful levels</w:t>
       </w:r>
     </w:p>
     <w:p>
@@ -806,8 +3257,37 @@
       </w:pPr>
       <w:r>
         <w:lastRenderedPageBreak/>
-        <w:t>the ferry valley measurements and the the careful levels of from extraordinarily river times letter seventeen rainfall, crossing a described of the ferry valley measurements and the the careful levels of from extraordinarily river times letter seventeen rainfall, crossing a described of the ferry valley measurements and the the careful levels of from extraordinarily river times letter seventeen rainfall, crossing a described of the ferry valley measurements and the the</w:t>
-      </w:r>
+        <w:t xml:space="preserve">the ferry valley measurements and the </w:t>
+      </w:r>
+      <w:proofErr w:type="spellStart"/>
+      <w:r>
+        <w:t>the</w:t>
+      </w:r>
+      <w:proofErr w:type="spellEnd"/>
+      <w:r>
+        <w:t xml:space="preserve"> careful levels of from extraordinarily river times letter seventeen rainfall, crossing a described of the ferry valley measurements and the </w:t>
+      </w:r>
+      <w:proofErr w:type="spellStart"/>
+      <w:r>
+        <w:t>the</w:t>
+      </w:r>
+      <w:proofErr w:type="spellEnd"/>
+      <w:r>
+        <w:t xml:space="preserve"> careful levels of from extraordinarily river times letter seventeen rainfall, crossing a described of the ferry valley measurements and the </w:t>
+      </w:r>
+      <w:proofErr w:type="spellStart"/>
+      <w:r>
+        <w:t>the</w:t>
+      </w:r>
+      <w:proofErr w:type="spellEnd"/>
+      <w:r>
+        <w:t xml:space="preserve"> careful levels of from extraordinarily river times letter seventeen rainfall, crossing a described of the ferry valley measurements and the </w:t>
+      </w:r>
+      <w:proofErr w:type="spellStart"/>
+      <w:r>
+        <w:t>the</w:t>
+      </w:r>
+      <w:proofErr w:type="spellEnd"/>
     </w:p>
     <w:p>
       <w:pPr>
@@ -824,7 +3304,58 @@
         <w:ind w:left="1440"/>
       </w:pPr>
       <w:r>
-        <w:t>the ferry valley measurements and the the careful levels of from extraordinarily river times letter seventeen rainfall, crossing a described of the ferry valley measurements and the the careful levels of from extraordinarily river times letter seventeen rainfall, crossing a described of the ferry valley measurements and the the careful levels of from extraordinarily river times letter seventeen rainfall, crossing a described of the ferry valley measurements and the the careful levels of from extraordinarily river times letter seventeen rainfall, crossing a described of the ferry valley measurements and the the careful levels of from extraordinarily river times letter seventeen rainfall, crossing a described of the ferry valley measurements and the the careful levels of from extraordinarily river times letter</w:t>
+        <w:t xml:space="preserve">the ferry valley measurements and the </w:t>
+      </w:r>
+      <w:proofErr w:type="spellStart"/>
+      <w:r>
+        <w:t>the</w:t>
+      </w:r>
+      <w:proofErr w:type="spellEnd"/>
+      <w:r>
+        <w:t xml:space="preserve"> careful levels of from extraordinarily river times letter seventeen rainfall, crossing a described of the ferry valley measurements and the </w:t>
+      </w:r>
+      <w:proofErr w:type="spellStart"/>
+      <w:r>
+        <w:t>the</w:t>
+      </w:r>
+      <w:proofErr w:type="spellEnd"/>
+      <w:r>
+        <w:t xml:space="preserve"> careful levels of from extraordinarily river times letter seventeen rainfall, crossing a described of the ferry valley measurements and the </w:t>
+      </w:r>
+      <w:proofErr w:type="spellStart"/>
+      <w:r>
+        <w:t>the</w:t>
+      </w:r>
+      <w:proofErr w:type="spellEnd"/>
+      <w:r>
+        <w:t xml:space="preserve"> careful levels of from extraordinarily river times letter seventeen rainfall, crossing a described of the ferry valley measurements and the </w:t>
+      </w:r>
+      <w:proofErr w:type="spellStart"/>
+      <w:r>
+        <w:t>the</w:t>
+      </w:r>
+      <w:proofErr w:type="spellEnd"/>
+      <w:r>
+        <w:t xml:space="preserve"> careful levels of from extraordinarily river times letter seventeen rainfall</w:t>
+      </w:r>
+      <w:r>
+        <w:t xml:space="preserve">, crossing a described of the ferry valley measurements and the </w:t>
+      </w:r>
+      <w:proofErr w:type="spellStart"/>
+      <w:r>
+        <w:t>the</w:t>
+      </w:r>
+      <w:proofErr w:type="spellEnd"/>
+      <w:r>
+        <w:t xml:space="preserve"> careful levels of from extraordinarily river times letter seventeen rainfall, crossing a described of the ferry valley measurements and the </w:t>
+      </w:r>
+      <w:proofErr w:type="spellStart"/>
+      <w:r>
+        <w:t>the</w:t>
+      </w:r>
+      <w:proofErr w:type="spellEnd"/>
+      <w:r>
+        <w:t xml:space="preserve"> careful levels of from extraordinarily river times letter</w:t>
       </w:r>
     </w:p>
     <w:p>
@@ -832,7 +3363,50 @@
         <w:ind w:left="720" w:right="1440"/>
       </w:pPr>
       <w:r>
-        <w:t>of from extraordinarily river times letter seventeen rainfall, crossing a described of the ferry valley measurements and the the careful levels of from extraordinarily river times letter seventeen rainfall, crossing a described of the ferry valley measurements and the the careful levels of from extraordinarily river times letter seventeen rainfall, crossing a described of the ferry valley measurements and the the careful levels of from extraordinarily river times letter seventeen rainfall, crossing a described of the ferry valley measurements and the the careful levels of from extraordinarily river times letter seventeen rainfall, crossing a described of the ferry valley measurements and the the careful levels of from extraordinarily river times letter seventeen rainfall, crossing a described of the ferry valley</w:t>
+        <w:t xml:space="preserve">of from extraordinarily river times letter seventeen rainfall, crossing a described of the ferry valley measurements and the </w:t>
+      </w:r>
+      <w:proofErr w:type="spellStart"/>
+      <w:r>
+        <w:t>the</w:t>
+      </w:r>
+      <w:proofErr w:type="spellEnd"/>
+      <w:r>
+        <w:t xml:space="preserve"> careful levels of from extraordinarily river times letter seventeen rainfall, crossing a described of the ferry valley measurements and the </w:t>
+      </w:r>
+      <w:proofErr w:type="spellStart"/>
+      <w:r>
+        <w:t>the</w:t>
+      </w:r>
+      <w:proofErr w:type="spellEnd"/>
+      <w:r>
+        <w:t xml:space="preserve"> careful levels of from extraordinarily river times letter seventeen rainfall, crossing a described of the ferry valley measurements and the </w:t>
+      </w:r>
+      <w:proofErr w:type="spellStart"/>
+      <w:r>
+        <w:t>the</w:t>
+      </w:r>
+      <w:proofErr w:type="spellEnd"/>
+      <w:r>
+        <w:t xml:space="preserve"> careful levels of from extraordinarily river times letter seventeen rainfall, crossing a described of the ferry valley measurements and the </w:t>
+      </w:r>
+      <w:proofErr w:type="spellStart"/>
+      <w:r>
+        <w:t>the</w:t>
+      </w:r>
+      <w:proofErr w:type="spellEnd"/>
+      <w:r>
+        <w:t xml:space="preserve"> careful levels of from extraordinarily river times letter seventeen rainfall</w:t>
+      </w:r>
+      <w:r>
+        <w:t xml:space="preserve">, crossing a described of the ferry valley measurements and the </w:t>
+      </w:r>
+      <w:proofErr w:type="spellStart"/>
+      <w:r>
+        <w:t>the</w:t>
+      </w:r>
+      <w:proofErr w:type="spellEnd"/>
+      <w:r>
+        <w:t xml:space="preserve"> careful levels of from extraordinarily river times letter seventeen rainfall, crossing a described of the ferry valley</w:t>
       </w:r>
     </w:p>
     <w:p>
@@ -840,7 +3414,58 @@
         <w:ind w:firstLine="720"/>
       </w:pPr>
       <w:r>
-        <w:t>a described of the ferry valley measurements and the the careful levels of from extraordinarily river times letter seventeen rainfall, crossing a described of the ferry valley measurements and the the careful levels of from extraordinarily river times letter seventeen rainfall, crossing a described of the ferry valley measurements and the the careful levels of from extraordinarily river times letter seventeen rainfall, crossing a described of the ferry valley measurements and the the careful levels of from extraordinarily river times letter seventeen rainfall, crossing a described of the ferry valley measurements and the the careful levels of from extraordinarily river times letter seventeen rainfall, crossing a described of the ferry valley measurements and the the careful levels of from extraordinarily</w:t>
+        <w:t xml:space="preserve">a described of the ferry valley measurements and the </w:t>
+      </w:r>
+      <w:proofErr w:type="spellStart"/>
+      <w:r>
+        <w:t>the</w:t>
+      </w:r>
+      <w:proofErr w:type="spellEnd"/>
+      <w:r>
+        <w:t xml:space="preserve"> careful levels of from extraordinarily river times letter seventeen rainfall, crossing a described of the ferry valley measurements and the </w:t>
+      </w:r>
+      <w:proofErr w:type="spellStart"/>
+      <w:r>
+        <w:t>the</w:t>
+      </w:r>
+      <w:proofErr w:type="spellEnd"/>
+      <w:r>
+        <w:t xml:space="preserve"> careful levels of from extraordinarily river times letter seventeen rainfall, crossing a described of the ferry valley measurements and the </w:t>
+      </w:r>
+      <w:proofErr w:type="spellStart"/>
+      <w:r>
+        <w:t>the</w:t>
+      </w:r>
+      <w:proofErr w:type="spellEnd"/>
+      <w:r>
+        <w:t xml:space="preserve"> careful levels of from extraordinarily river times letter seventeen rainfall, crossing a described of the ferry valley measurements and the </w:t>
+      </w:r>
+      <w:proofErr w:type="spellStart"/>
+      <w:r>
+        <w:t>the</w:t>
+      </w:r>
+      <w:proofErr w:type="spellEnd"/>
+      <w:r>
+        <w:t xml:space="preserve"> careful levels of from extraordinarily river times letter seventeen rainfall</w:t>
+      </w:r>
+      <w:r>
+        <w:t xml:space="preserve">, crossing a described of the ferry valley measurements and the </w:t>
+      </w:r>
+      <w:proofErr w:type="spellStart"/>
+      <w:r>
+        <w:t>the</w:t>
+      </w:r>
+      <w:proofErr w:type="spellEnd"/>
+      <w:r>
+        <w:t xml:space="preserve"> careful levels of from extraordinarily river times letter seventeen rainfall, crossing a described of the ferry valley measurements and the </w:t>
+      </w:r>
+      <w:proofErr w:type="spellStart"/>
+      <w:r>
+        <w:t>the</w:t>
+      </w:r>
+      <w:proofErr w:type="spellEnd"/>
+      <w:r>
+        <w:t xml:space="preserve"> careful levels of from extraordinarily</w:t>
       </w:r>
     </w:p>
     <w:p>
@@ -852,7 +3477,42 @@
       </w:r>
       <w:r>
         <w:tab/>
-        <w:t>the careful levels of from extraordinarily river times letter seventeen rainfall, crossing a described of the ferry valley measurements and the the careful levels of from extraordinarily river times letter seventeen rainfall, crossing a described of the ferry valley measurements and the the careful levels of from extraordinarily river times letter seventeen rainfall, crossing a described of the ferry valley measurements and the the careful levels of from extraordinarily river times letter seventeen rainfall, crossing a described of the ferry valley measurements and the the careful levels of from extraordinarily</w:t>
+        <w:t xml:space="preserve">the careful levels of from extraordinarily river times letter seventeen rainfall, crossing a described of the ferry valley measurements and the </w:t>
+      </w:r>
+      <w:proofErr w:type="spellStart"/>
+      <w:r>
+        <w:t>the</w:t>
+      </w:r>
+      <w:proofErr w:type="spellEnd"/>
+      <w:r>
+        <w:t xml:space="preserve"> careful levels of from extraordinarily river times letter seventeen rainfall, crossing a described of the ferry valley measurements and the </w:t>
+      </w:r>
+      <w:proofErr w:type="spellStart"/>
+      <w:r>
+        <w:t>the</w:t>
+      </w:r>
+      <w:proofErr w:type="spellEnd"/>
+      <w:r>
+        <w:t xml:space="preserve"> careful levels of from extraordinarily river times letter seventeen rainfall, crossing a described of the ferry valley measurements and the </w:t>
+      </w:r>
+      <w:proofErr w:type="spellStart"/>
+      <w:r>
+        <w:t>the</w:t>
+      </w:r>
+      <w:proofErr w:type="spellEnd"/>
+      <w:r>
+        <w:t xml:space="preserve"> careful levels of from extraordinarily river times letter seventeen rainfal</w:t>
+      </w:r>
+      <w:r>
+        <w:t xml:space="preserve">l, crossing a described of the ferry valley measurements and the </w:t>
+      </w:r>
+      <w:proofErr w:type="spellStart"/>
+      <w:r>
+        <w:t>the</w:t>
+      </w:r>
+      <w:proofErr w:type="spellEnd"/>
+      <w:r>
+        <w:t xml:space="preserve"> careful levels of from extraordinarily</w:t>
       </w:r>
     </w:p>
     <w:p>
@@ -935,7 +3595,15 @@
       </w:r>
       <w:r>
         <w:tab/>
-        <w:t>measurements and the the careful levels</w:t>
+        <w:t xml:space="preserve">measurements and the </w:t>
+      </w:r>
+      <w:proofErr w:type="spellStart"/>
+      <w:r>
+        <w:t>the</w:t>
+      </w:r>
+      <w:proofErr w:type="spellEnd"/>
+      <w:r>
+        <w:t xml:space="preserve"> careful levels</w:t>
       </w:r>
       <w:r>
         <w:tab/>
@@ -1068,7 +3736,15 @@
       </w:r>
       <w:r>
         <w:tab/>
-        <w:t>measurements and the the careful</w:t>
+        <w:t xml:space="preserve">measurements and the </w:t>
+      </w:r>
+      <w:proofErr w:type="spellStart"/>
+      <w:r>
+        <w:t>the</w:t>
+      </w:r>
+      <w:proofErr w:type="spellEnd"/>
+      <w:r>
+        <w:t xml:space="preserve"> careful</w:t>
       </w:r>
       <w:r>
         <w:tab/>
@@ -1106,7 +3782,58 @@
     </w:p>
     <w:p>
       <w:r>
-        <w:t>seventeen rainfall, crossing a described of the ferry valley measurements and the the careful levels of from extraordinarily river times extraordinarilyextraordinarilyextraordinarilyextraordinarilyextraordinarilyextraordinarily measurements and the the careful levels of from extraordinarily river times letter seventeen rainfall, crossing a described of the ferry valley measurements and the the careful levels of from extraordinarily river times letter seventeen rainfall, crossing a described of the well-known well-kept long-running river times letter seventeen rainfall, crossing a described of the ferry valley measurements and the the careful levels of from extraordinarily river times letter seventeen rainfall, crossing a described of the ferry valley measurements and the the careful levels of from extraordinarily river times letter seventeen rainfall, crossing a described of the ferry valley measurements and the the careful levels</w:t>
+        <w:t xml:space="preserve">seventeen rainfall, crossing a described of the ferry valley measurements and the </w:t>
+      </w:r>
+      <w:proofErr w:type="spellStart"/>
+      <w:r>
+        <w:t>the</w:t>
+      </w:r>
+      <w:proofErr w:type="spellEnd"/>
+      <w:r>
+        <w:t xml:space="preserve"> careful levels of from extraordinarily river times extraordinarilyextraordinarilyextraordinarilyextraordinarilyextraordinarilyextraordinarily measurements and the </w:t>
+      </w:r>
+      <w:proofErr w:type="spellStart"/>
+      <w:r>
+        <w:t>the</w:t>
+      </w:r>
+      <w:proofErr w:type="spellEnd"/>
+      <w:r>
+        <w:t xml:space="preserve"> careful levels of from extraordinarily river times letter seventeen rainfall, crossing a described of the ferry valley measurements and the </w:t>
+      </w:r>
+      <w:proofErr w:type="spellStart"/>
+      <w:r>
+        <w:t>the</w:t>
+      </w:r>
+      <w:proofErr w:type="spellEnd"/>
+      <w:r>
+        <w:t xml:space="preserve"> careful levels of from extraordinarily river times letter seventeen rainfall, crossing a described of the well-known well-kept long-running river times letter seventeen rainfall, crossing a describ</w:t>
+      </w:r>
+      <w:r>
+        <w:t xml:space="preserve">ed of the ferry valley measurements and the </w:t>
+      </w:r>
+      <w:proofErr w:type="spellStart"/>
+      <w:r>
+        <w:t>the</w:t>
+      </w:r>
+      <w:proofErr w:type="spellEnd"/>
+      <w:r>
+        <w:t xml:space="preserve"> careful levels of from extraordinarily river times letter seventeen rainfall, crossing a described of the ferry valley measurements and the </w:t>
+      </w:r>
+      <w:proofErr w:type="spellStart"/>
+      <w:r>
+        <w:t>the</w:t>
+      </w:r>
+      <w:proofErr w:type="spellEnd"/>
+      <w:r>
+        <w:t xml:space="preserve"> careful levels of from extraordinarily river times letter seventeen rainfall, crossing a described of the ferry valley measurements and the </w:t>
+      </w:r>
+      <w:proofErr w:type="spellStart"/>
+      <w:r>
+        <w:t>the</w:t>
+      </w:r>
+      <w:proofErr w:type="spellEnd"/>
+      <w:r>
+        <w:t xml:space="preserve"> careful levels</w:t>
       </w:r>
     </w:p>
     <w:p>
@@ -1121,7 +3848,31 @@
     </w:p>
     <w:p>
       <w:r>
-        <w:t>the ferry valley measurements and the the careful levels of from extraordinarily river times letter seventeen rainfall, crossing a described of the ferry valley measurements and the the careful levels of from extraordinarily river times letter seventeen rainfall, crossing a described of the ferry valley measurements and the the careful levels of from extraordinarily river times letter seventeen rainfall, crossing</w:t>
+        <w:t xml:space="preserve">the ferry valley measurements and the </w:t>
+      </w:r>
+      <w:proofErr w:type="spellStart"/>
+      <w:r>
+        <w:t>the</w:t>
+      </w:r>
+      <w:proofErr w:type="spellEnd"/>
+      <w:r>
+        <w:t xml:space="preserve"> careful levels of from extraordinarily river times letter seventeen rainfall, crossing a described of the ferry valley measurements and the </w:t>
+      </w:r>
+      <w:proofErr w:type="spellStart"/>
+      <w:r>
+        <w:t>the</w:t>
+      </w:r>
+      <w:proofErr w:type="spellEnd"/>
+      <w:r>
+        <w:t xml:space="preserve"> careful levels of from extraordinarily river times letter seventeen rainfall, crossing a described of the ferry valley measurements and the </w:t>
+      </w:r>
+      <w:proofErr w:type="spellStart"/>
+      <w:r>
+        <w:t>the</w:t>
+      </w:r>
+      <w:proofErr w:type="spellEnd"/>
+      <w:r>
+        <w:t xml:space="preserve"> careful levels of from extraordinarily river times letter seventeen rainfall, crossing</w:t>
       </w:r>
     </w:p>
     <w:sectPr>
@@ -1137,10 +3888,10 @@
 <file path=word/numbering.xml><?xml version="1.0" encoding="utf-8"?>
 <w:numbering xmlns:wpc="http://schemas.microsoft.com/office/word/2010/wordprocessingCanvas" xmlns:cx="http://schemas.microsoft.com/office/drawing/2014/chartex" xmlns:cx1="http://schemas.microsoft.com/office/drawing/2015/9/8/chartex" xmlns:cx2="http://schemas.microsoft.com/office/drawing/2015/10/21/chartex" xmlns:cx3="http://schemas.microsoft.com/office/drawing/2016/5/9/chartex" xmlns:cx4="http://schemas.microsoft.com/office/drawing/2016/5/10/chartex" xmlns:cx5="http://schemas.microsoft.com/office/drawing/2016/5/11/chartex" xmlns:cx6="http://schemas.microsoft.com/office/drawing/2016/5/12/chartex" xmlns:cx7="http://schemas.microsoft.com/office/drawing/2016/5/13/chartex" xmlns:cx8="http://schemas.microsoft.com/office/drawing/2016/5/14/chartex" xmlns:mc="http://schemas.openxmlformats.org/markup-compatibility/2006" xmlns:m="http://schemas.openxmlformats.org/officeDocument/2006/math" xmlns:aink="http://schemas.microsoft.com/office/drawing/2016/ink" xmlns:am3d="http://schemas.microsoft.com/office/drawing/2017/model3d" xmlns:oel="http://schemas.microsoft.com/office/2019/extlst" xmlns:r="http://schemas.openxmlformats.org/officeDocument/2006/relationships" xmlns:wp14="http://schemas.microsoft.com/office/word/2010/wordprocessingDrawing" xmlns:wp="http://schemas.openxmlformats.org/drawingml/2006/wordprocessingDrawing" xmlns:wpg="http://schemas.microsoft.com/office/word/2010/wordprocessingGroup" xmlns:wpi="http://schemas.microsoft.com/office/word/2010/wordprocessingInk" xmlns:wps="http://schemas.microsoft.com/office/word/2010/wordprocessingShape" xmlns:o="urn:schemas-microsoft-com:office:office" xmlns:v="urn:schemas-microsoft-com:vml" xmlns:w10="urn:schemas-microsoft-com:office:word" xmlns:w="http://schemas.openxmlformats.org/wordprocessingml/2006/main" xmlns:w14="http://schemas.microsoft.com/office/word/2010/wordml" xmlns:w15="http://schemas.microsoft.com/office/word/2012/wordml" xmlns:w16cex="http://schemas.microsoft.com/office/word/2018/wordml/cex" xmlns:w16cid="http://schemas.microsoft.com/office/word/2016/wordml/cid" xmlns:w16="http://schemas.microsoft.com/office/word/2018/wordml" xmlns:w16sdtdh="http://schemas.microsoft.com/office/word/2020/wordml/sdtdatahash" xmlns:w16sdtfl="http://schemas.microsoft.com/office/word/2024/wordml/sdtformatlock" xmlns:w16se="http://schemas.microsoft.com/office/word/2015/wordml/symex" xmlns:w16du="http://schemas.microsoft.com/office/word/2023/wordml/word16du" xmlns:wne="http://schemas.microsoft.com/office/word/2006/wordml" mc:Ignorable="w14 w15 w16se w16cid w16 w16cex w16sdtdh w16sdtfl w16du wp14">
   <w:abstractNum w:abstractNumId="0" w15:restartNumberingAfterBreak="0">
-    <w:nsid w:val="7237669F"/>
+    <w:nsid w:val="739732AA"/>
     <w:multiLevelType w:val="hybridMultilevel"/>
-    <w:tmpl w:val="7868B7B0"/>
-    <w:lvl w:ilvl="0" w:tplc="72E42D7E" w:tentative="1">
+    <w:tmpl w:val="A0DCBB70"/>
+    <w:lvl w:ilvl="0" w:tplc="35A44898" w:tentative="1">
       <w:start w:val="1"/>
       <w:numFmt w:val="bullet"/>
       <w:lvlText w:val="●"/>
@@ -1149,7 +3900,7 @@
         <w:ind w:left="720" w:hanging="360"/>
       </w:pPr>
     </w:lvl>
-    <w:lvl w:ilvl="1" w:tplc="C1C06674" w:tentative="1">
+    <w:lvl w:ilvl="1" w:tplc="5E2C3CA8" w:tentative="1">
       <w:start w:val="1"/>
       <w:numFmt w:val="bullet"/>
       <w:lvlText w:val="○"/>
@@ -1158,7 +3909,7 @@
         <w:ind w:left="1440" w:hanging="360"/>
       </w:pPr>
     </w:lvl>
-    <w:lvl w:ilvl="2" w:tplc="E87EA7AE" w:tentative="1">
+    <w:lvl w:ilvl="2" w:tplc="884E8502" w:tentative="1">
       <w:start w:val="1"/>
       <w:numFmt w:val="bullet"/>
       <w:lvlText w:val="■"/>
@@ -1167,7 +3918,7 @@
         <w:ind w:left="2160" w:hanging="360"/>
       </w:pPr>
     </w:lvl>
-    <w:lvl w:ilvl="3" w:tplc="323ECED0" w:tentative="1">
+    <w:lvl w:ilvl="3" w:tplc="16EE1082" w:tentative="1">
       <w:start w:val="1"/>
       <w:numFmt w:val="bullet"/>
       <w:lvlText w:val="●"/>
@@ -1176,7 +3927,7 @@
         <w:ind w:left="2880" w:hanging="360"/>
       </w:pPr>
     </w:lvl>
-    <w:lvl w:ilvl="4" w:tplc="77A203CA" w:tentative="1">
+    <w:lvl w:ilvl="4" w:tplc="B46073FE" w:tentative="1">
       <w:start w:val="1"/>
       <w:numFmt w:val="bullet"/>
       <w:lvlText w:val="○"/>
@@ -1185,7 +3936,7 @@
         <w:ind w:left="3600" w:hanging="360"/>
       </w:pPr>
     </w:lvl>
-    <w:lvl w:ilvl="5" w:tplc="A260DDE6" w:tentative="1">
+    <w:lvl w:ilvl="5" w:tplc="49604A1E" w:tentative="1">
       <w:start w:val="1"/>
       <w:numFmt w:val="bullet"/>
       <w:lvlText w:val="■"/>
@@ -1194,7 +3945,7 @@
         <w:ind w:left="4320" w:hanging="360"/>
       </w:pPr>
     </w:lvl>
-    <w:lvl w:ilvl="6" w:tplc="45E85DB2" w:tentative="1">
+    <w:lvl w:ilvl="6" w:tplc="F508DD00" w:tentative="1">
       <w:start w:val="1"/>
       <w:numFmt w:val="bullet"/>
       <w:lvlText w:val="●"/>
@@ -1203,7 +3954,7 @@
         <w:ind w:left="5040" w:hanging="360"/>
       </w:pPr>
     </w:lvl>
-    <w:lvl w:ilvl="7" w:tplc="0332F62C" w:tentative="1">
+    <w:lvl w:ilvl="7" w:tplc="C7B2AE9E" w:tentative="1">
       <w:start w:val="1"/>
       <w:numFmt w:val="bullet"/>
       <w:lvlText w:val="●"/>
@@ -1212,7 +3963,7 @@
         <w:ind w:left="5760" w:hanging="360"/>
       </w:pPr>
     </w:lvl>
-    <w:lvl w:ilvl="8" w:tplc="AB5A381C" w:tentative="1">
+    <w:lvl w:ilvl="8" w:tplc="8DCC6D10" w:tentative="1">
       <w:start w:val="1"/>
       <w:numFmt w:val="bullet"/>
       <w:lvlText w:val="●"/>
@@ -1222,7 +3973,7 @@
       </w:pPr>
     </w:lvl>
   </w:abstractNum>
-  <w:num w:numId="1" w16cid:durableId="669604258">
+  <w:num w:numId="1" w16cid:durableId="86535234">
     <w:abstractNumId w:val="0"/>
     <w:lvlOverride w:ilvl="0">
       <w:startOverride w:val="1"/>
@@ -1642,7 +4393,6 @@
       <w:outlineLvl w:val="0"/>
     </w:pPr>
     <w:rPr>
-      <w:rFonts w:ascii="Calibri Light" w:eastAsia="Calibri Light" w:hAnsi="Calibri Light" w:cs="Calibri Light"/>
       <w:color w:val="2F5496"/>
       <w:sz w:val="32"/>
       <w:szCs w:val="32"/>

</xml_diff>

<commit_message>
feat(layout): stop at fonts not in the width tables, and measure the fonts a document embeds from their files, as Word draws them (#3639)
</commit_message>
<xml_diff>
--- a/scripts/layout-probes/text-and-spacing.word.docx
+++ b/scripts/layout-probes/text-and-spacing.word.docx
@@ -5,8 +5,9 @@
     <w:sdt>
       <w:sdtPr>
         <w:alias w:val="Contents"/>
-        <w:id w:val="275847299"/>
+        <w:id w:val="-718899007"/>
       </w:sdtPr>
+      <w:sdtEndPr/>
       <w:sdtContent>
         <w:p>
           <w:pPr>
@@ -370,264 +371,2146 @@
           <w:sz w:val="18"/>
           <w:szCs w:val="18"/>
         </w:rPr>
-        <w:t>a described of the ferry valley measurements and the the careful levels of from extraordinarily river times letter seventeen rainfall, crossing a described of the ferry valley measurements and the the careful levels of from extraordinarily river times letter seventeen rainfall, crossing a described of the ferry valley measurements and the the careful levels of from extraordinarily river times letter seventeen rainfall, crossing a described of the ferry valley measurements and the the careful levels of from extraordinarily river times</w:t>
-      </w:r>
-    </w:p>
-    <w:p>
-      <w:r>
-        <w:t>the careful levels of from extraordinarily river times letter seventeen rainfall, crossing a described of the ferry valley measurements and the the careful levels of from extraordinarily river times letter seventeen rainfall, crossing a described of the ferry valley measurements and the the careful levels of from extraordinarily river times letter seventeen rainfall, crossing a described of the ferry valley measurements and the the careful levels of from extraordinarily river times letter seventeen rainfall, crossing a described of the ferry valley measurements and the the careful levels of from extraordinarily river times letter seventeen rainfall, crossing a described of the ferry valley measurements and the the careful levels of from extraordinarily river times letter seventeen rainfall, crossing a described of</w:t>
-      </w:r>
-    </w:p>
-    <w:p>
-      <w:r>
-        <w:rPr>
-          <w:sz w:val="28"/>
-          <w:szCs w:val="28"/>
-        </w:rPr>
-        <w:t xml:space="preserve">seventeen rainfall, crossing a described of the ferry valley measurements and the the careful levels of from extraordinarily river times letter seventeen rainfall, crossing a described of the ferry valley measurements and the the careful levels of from extraordinarily river times letter seventeen rainfall, crossing a described of the ferry valley measurements and the the careful levels of from extraordinarily river times letter seventeen rainfall, crossing a described of the ferry valley measurements and the the careful levels of from extraordinarily river times letter seventeen rainfall, crossing a described of the ferry valley measurements and the the careful levels of from extraordinarily river times letter seventeen rainfall, crossing a described of the ferry valley </w:t>
-      </w:r>
-      <w:r>
-        <w:rPr>
-          <w:sz w:val="28"/>
-          <w:szCs w:val="28"/>
-        </w:rPr>
-        <w:lastRenderedPageBreak/>
-        <w:t>measurements and the the careful levels of from extraordinarily river times letter seventeen rainfall, crossing a described of the ferry valley measurements and the the careful levels of from extraordinarily river times letter seventeen rainfall, crossing a described of the ferry valley measurements and the the</w:t>
-      </w:r>
-    </w:p>
-    <w:p>
-      <w:r>
-        <w:rPr>
-          <w:b/>
-          <w:bCs/>
-        </w:rPr>
-        <w:t>a described of the ferry valley measurements and the the careful levels of from extraordinarily river times letter seventeen rainfall, crossing a described of the ferry valley measurements and the the careful levels of from extraordinarily river times letter seventeen rainfall, crossing a described of the ferry valley measurements and the the careful levels of from extraordinarily river times letter seventeen rainfall, crossing a described of the ferry valley measurements and the the careful levels of from extraordinarily river times letter seventeen rainfall, crossing a described of the ferry valley measurements and the the careful levels of from extraordinarily river</w:t>
-      </w:r>
-    </w:p>
-    <w:p>
-      <w:pPr>
-        <w:pStyle w:val="Heading1"/>
-      </w:pPr>
-      <w:bookmarkStart w:id="1" w:name="_Toc2"/>
-      <w:r>
-        <w:t>Text in Cambria</w:t>
-      </w:r>
-      <w:bookmarkEnd w:id="1"/>
-    </w:p>
-    <w:p>
-      <w:r>
-        <w:rPr>
-          <w:rFonts w:ascii="Cambria" w:eastAsia="Cambria" w:hAnsi="Cambria" w:cs="Cambria"/>
+        <w:t xml:space="preserve">a described of the ferry valley measurements and the </w:t>
+      </w:r>
+      <w:proofErr w:type="spellStart"/>
+      <w:r>
+        <w:rPr>
           <w:sz w:val="18"/>
           <w:szCs w:val="18"/>
         </w:rPr>
-        <w:t>the careful levels of from extraordinarily river times letter seventeen rainfall, crossing a described of the ferry valley measurements and the the careful levels of from extraordinarily river times letter seventeen rainfall, crossing a described of the ferry valley measurements and the the careful levels of from extraordinarily river times letter seventeen rainfall, crossing a described of the ferry valley measurements and the the careful levels of from extraordinarily river times letter seventeen rainfall, crossing a described of the ferry</w:t>
-      </w:r>
-    </w:p>
-    <w:p>
-      <w:r>
-        <w:rPr>
-          <w:rFonts w:ascii="Cambria" w:eastAsia="Cambria" w:hAnsi="Cambria" w:cs="Cambria"/>
-        </w:rPr>
-        <w:t>seventeen rainfall, crossing a described of the ferry valley measurements and the the careful levels of from extraordinarily river times letter seventeen rainfall, crossing a described of the ferry valley measurements and the the careful levels of from extraordinarily river times letter seventeen rainfall, crossing a described of the ferry valley measurements and the the careful levels of from extraordinarily river times letter seventeen rainfall, crossing a described of the ferry valley measurements and the the careful levels of from extraordinarily river times letter seventeen rainfall, crossing a described of the ferry valley measurements and the the careful levels of from extraordinarily river times letter seventeen rainfall, crossing a described of the ferry valley measurements and the the careful levels</w:t>
-      </w:r>
-    </w:p>
-    <w:p>
-      <w:r>
-        <w:rPr>
-          <w:rFonts w:ascii="Cambria" w:eastAsia="Cambria" w:hAnsi="Cambria" w:cs="Cambria"/>
-          <w:sz w:val="28"/>
-          <w:szCs w:val="28"/>
-        </w:rPr>
-        <w:t>measurements and the the careful levels of from extraordinarily river times letter seventeen rainfall, crossing a described of the ferry valley measurements and the the careful levels of from extraordinarily river times letter seventeen rainfall, crossing a described of the ferry valley measurements and the the careful levels of from extraordinarily river times letter seventeen rainfall, crossing a described of the ferry valley measurements and the the careful levels of from extraordinarily river times letter seventeen rainfall, crossing a described of the ferry valley measurements and the the careful levels of from extraordinarily river times letter seventeen rainfall, crossing a described of the ferry valley measurements and the the careful levels of from extraordinarily river times letter seventeen rainfall, crossing a described of the ferry valley measurements and the the careful levels of from extraordinarily river times letter seventeen rainfall, crossing a described of the ferry valley measurements and the the careful levels of from extraordinarily river times letter seventeen</w:t>
-      </w:r>
-    </w:p>
-    <w:p>
-      <w:r>
-        <w:rPr>
-          <w:rFonts w:ascii="Cambria" w:eastAsia="Cambria" w:hAnsi="Cambria" w:cs="Cambria"/>
-          <w:b/>
-          <w:bCs/>
-        </w:rPr>
-        <w:lastRenderedPageBreak/>
-        <w:t>seventeen rainfall, crossing a described of the ferry valley measurements and the the careful levels of from extraordinarily river times letter seventeen rainfall, crossing a described of the ferry valley measurements and the the careful levels of from extraordinarily river times letter seventeen rainfall, crossing a described of the ferry valley measurements and the the careful levels of from extraordinarily river times letter seventeen rainfall, crossing a described of the ferry valley measurements and the the careful levels of from extraordinarily river times letter seventeen rainfall, crossing a described of the ferry valley measurements and the the careful levels of</w:t>
-      </w:r>
-    </w:p>
-    <w:p>
-      <w:pPr>
-        <w:pStyle w:val="Heading1"/>
-      </w:pPr>
-      <w:bookmarkStart w:id="2" w:name="_Toc3"/>
-      <w:r>
-        <w:t>Text in Arial</w:t>
-      </w:r>
-      <w:bookmarkEnd w:id="2"/>
-    </w:p>
-    <w:p>
-      <w:r>
-        <w:rPr>
-          <w:rFonts w:ascii="Arial" w:eastAsia="Arial" w:hAnsi="Arial" w:cs="Arial"/>
+        <w:t>the</w:t>
+      </w:r>
+      <w:proofErr w:type="spellEnd"/>
+      <w:r>
+        <w:rPr>
           <w:sz w:val="18"/>
           <w:szCs w:val="18"/>
         </w:rPr>
-        <w:t>seventeen rainfall, crossing a described of the ferry valley measurements and the the careful levels of from extraordinarily river times letter seventeen rainfall, crossing a described of the ferry valley measurements and the the careful levels of from extraordinarily river times letter seventeen rainfall, crossing a described of the ferry valley measurements and the the careful levels of from extraordinarily river times letter seventeen rainfall, crossing a described of the ferry valley measurements and the the careful levels of from</w:t>
-      </w:r>
-    </w:p>
-    <w:p>
-      <w:r>
-        <w:rPr>
-          <w:rFonts w:ascii="Arial" w:eastAsia="Arial" w:hAnsi="Arial" w:cs="Arial"/>
-        </w:rPr>
-        <w:t>measurements and the the careful levels of from extraordinarily river times letter seventeen rainfall, crossing a described of the ferry valley measurements and the the careful levels of from extraordinarily river times letter seventeen rainfall, crossing a described of the ferry valley measurements and the the careful levels of from extraordinarily river times letter seventeen rainfall, crossing a described of the ferry valley measurements and the the careful levels of from extraordinarily river times letter seventeen rainfall, crossing a described of the ferry valley measurements and the the careful levels of from extraordinarily river times letter seventeen rainfall, crossing a described of the ferry valley measurements and the the careful levels of from extraordinarily river times letter seventeen rainfall, crossing</w:t>
-      </w:r>
-    </w:p>
-    <w:p>
-      <w:r>
-        <w:rPr>
-          <w:rFonts w:ascii="Arial" w:eastAsia="Arial" w:hAnsi="Arial" w:cs="Arial"/>
-          <w:sz w:val="28"/>
-          <w:szCs w:val="28"/>
-        </w:rPr>
-        <w:t>river times letter seventeen rainfall, crossing a described of the ferry valley measurements and the the careful levels of from extraordinarily river times letter seventeen rainfall, crossing a described of the ferry valley measurements and the the careful levels of from extraordinarily river times letter seventeen rainfall, crossing a described of the ferry valley measurements and the the careful levels of from extraordinarily river times letter seventeen rainfall, crossing a described of the ferry valley measurements and the the careful levels of from extraordinarily river times letter seventeen rainfall, crossing a described of the ferry valley measurements and the the careful levels of from extraordinarily river times letter seventeen rainfall, crossing a described of the ferry valley measurements and the the careful levels of from extraordinarily river times letter seventeen rainfall, crossing a described of the ferry valley measurements and the the careful levels of from extraordinarily river times letter seventeen rainfall, crossing a described of the ferry valley measurements</w:t>
-      </w:r>
-    </w:p>
-    <w:p>
-      <w:r>
-        <w:rPr>
-          <w:rFonts w:ascii="Arial" w:eastAsia="Arial" w:hAnsi="Arial" w:cs="Arial"/>
-          <w:b/>
-          <w:bCs/>
-        </w:rPr>
-        <w:t xml:space="preserve">river times letter seventeen rainfall, crossing a described of the ferry valley measurements and the the careful levels of from extraordinarily river times letter seventeen rainfall, crossing a described of the ferry valley measurements and the the careful levels of from extraordinarily river times letter seventeen rainfall, crossing a described of the ferry valley measurements and the the careful levels of from </w:t>
-      </w:r>
-      <w:r>
-        <w:rPr>
-          <w:rFonts w:ascii="Arial" w:eastAsia="Arial" w:hAnsi="Arial" w:cs="Arial"/>
-          <w:b/>
-          <w:bCs/>
-        </w:rPr>
-        <w:lastRenderedPageBreak/>
-        <w:t>extraordinarily river times letter seventeen rainfall, crossing a described of the ferry valley measurements and the the careful levels of from extraordinarily river times letter seventeen rainfall, crossing a described of the ferry valley measurements and the the</w:t>
-      </w:r>
-    </w:p>
-    <w:p>
-      <w:pPr>
-        <w:pStyle w:val="Heading1"/>
-      </w:pPr>
-      <w:bookmarkStart w:id="3" w:name="_Toc4"/>
-      <w:r>
-        <w:t>Text in Times New Roman</w:t>
-      </w:r>
-      <w:bookmarkEnd w:id="3"/>
-    </w:p>
-    <w:p>
-      <w:r>
-        <w:rPr>
-          <w:rFonts w:ascii="Times New Roman" w:eastAsia="Times New Roman" w:hAnsi="Times New Roman" w:cs="Times New Roman"/>
+        <w:t xml:space="preserve"> careful levels of from extraordinarily river times letter seventeen rainfall, crossing a described of the ferry valley measurements and the </w:t>
+      </w:r>
+      <w:proofErr w:type="spellStart"/>
+      <w:r>
+        <w:rPr>
           <w:sz w:val="18"/>
           <w:szCs w:val="18"/>
         </w:rPr>
-        <w:t>measurements and the the careful levels of from extraordinarily river times letter seventeen rainfall, crossing a described of the ferry valley measurements and the the careful levels of from extraordinarily river times letter seventeen rainfall, crossing a described of the ferry valley measurements and the the careful levels of from extraordinarily river times letter seventeen rainfall, crossing a described of the ferry valley measurements and the the careful levels of from extraordinarily river times letter seventeen rainfall, crossing a described</w:t>
-      </w:r>
-    </w:p>
-    <w:p>
-      <w:r>
-        <w:rPr>
-          <w:rFonts w:ascii="Times New Roman" w:eastAsia="Times New Roman" w:hAnsi="Times New Roman" w:cs="Times New Roman"/>
-        </w:rPr>
-        <w:t>river times letter seventeen rainfall, crossing a described of the ferry valley measurements and the the careful levels of from extraordinarily river times letter seventeen rainfall, crossing a described of the ferry valley measurements and the the careful levels of from extraordinarily river times letter seventeen rainfall, crossing a described of the ferry valley measurements and the the careful levels of from extraordinarily river times letter seventeen rainfall, crossing a described of the ferry valley measurements and the the careful levels of from extraordinarily river times letter seventeen rainfall, crossing a described of the ferry valley measurements and the the careful levels of from extraordinarily river times letter seventeen rainfall, crossing a described of the ferry valley measurements and the</w:t>
-      </w:r>
-    </w:p>
-    <w:p>
-      <w:r>
-        <w:rPr>
-          <w:rFonts w:ascii="Times New Roman" w:eastAsia="Times New Roman" w:hAnsi="Times New Roman" w:cs="Times New Roman"/>
-          <w:sz w:val="28"/>
-          <w:szCs w:val="28"/>
-        </w:rPr>
-        <w:t>the ferry valley measurements and the the careful levels of from extraordinarily river times letter seventeen rainfall, crossing a described of the ferry valley measurements and the the careful levels of from extraordinarily river times letter seventeen rainfall, crossing a described of the ferry valley measurements and the the careful levels of from extraordinarily river times letter seventeen rainfall, crossing a described of the ferry valley measurements and the the careful levels of from extraordinarily river times letter seventeen rainfall, crossing a described of the ferry valley measurements and the the careful levels of from extraordinarily river times letter seventeen rainfall, crossing a described of the ferry valley measurements and the the careful levels of from extraordinarily river times letter seventeen rainfall, crossing a described of the ferry valley measurements and the the careful levels of from extraordinarily river times letter seventeen rainfall, crossing a described of the ferry valley measurements and the the careful levels of from extraordinarily river</w:t>
-      </w:r>
-    </w:p>
-    <w:p>
-      <w:r>
-        <w:rPr>
-          <w:rFonts w:ascii="Times New Roman" w:eastAsia="Times New Roman" w:hAnsi="Times New Roman" w:cs="Times New Roman"/>
-          <w:b/>
-          <w:bCs/>
-        </w:rPr>
-        <w:t>of from extraordinarily river times letter seventeen rainfall, crossing a described of the ferry valley measurements and the the careful levels of from extraordinarily river times letter seventeen rainfall, crossing a described of the ferry valley measurements and the the careful levels of from extraordinarily river times letter seventeen rainfall, crossing a described of the ferry valley measurements and the the careful levels of from extraordinarily river times letter seventeen rainfall, crossing a described of the ferry valley measurements and the the careful levels of from extraordinarily river times letter seventeen rainfall, crossing a described of the ferry valley measurements</w:t>
-      </w:r>
-    </w:p>
-    <w:p>
-      <w:pPr>
-        <w:pStyle w:val="Heading1"/>
-      </w:pPr>
-      <w:bookmarkStart w:id="4" w:name="_Toc5"/>
-      <w:r>
-        <w:t>Text in Courier New</w:t>
-      </w:r>
-      <w:bookmarkEnd w:id="4"/>
-    </w:p>
-    <w:p>
-      <w:r>
-        <w:rPr>
-          <w:rFonts w:ascii="Courier New" w:eastAsia="Courier New" w:hAnsi="Courier New" w:cs="Courier New"/>
+        <w:t>the</w:t>
+      </w:r>
+      <w:proofErr w:type="spellEnd"/>
+      <w:r>
+        <w:rPr>
           <w:sz w:val="18"/>
           <w:szCs w:val="18"/>
         </w:rPr>
-        <w:t xml:space="preserve">river times letter seventeen rainfall, crossing a described of the ferry valley measurements and the the careful levels of from extraordinarily river times letter </w:t>
-      </w:r>
-      <w:r>
-        <w:rPr>
-          <w:rFonts w:ascii="Courier New" w:eastAsia="Courier New" w:hAnsi="Courier New" w:cs="Courier New"/>
+        <w:t xml:space="preserve"> careful levels of from extraordinarily river times letter seventeen rainfall, crossing a described of the ferry valley measurements and the </w:t>
+      </w:r>
+      <w:proofErr w:type="spellStart"/>
+      <w:r>
+        <w:rPr>
           <w:sz w:val="18"/>
           <w:szCs w:val="18"/>
         </w:rPr>
+        <w:t>the</w:t>
+      </w:r>
+      <w:proofErr w:type="spellEnd"/>
+      <w:r>
+        <w:rPr>
+          <w:sz w:val="18"/>
+          <w:szCs w:val="18"/>
+        </w:rPr>
+        <w:t xml:space="preserve"> careful levels of from extraordinarily river times letter seventeen rainfall, crossing a described of the ferry valley measurements and the </w:t>
+      </w:r>
+      <w:proofErr w:type="spellStart"/>
+      <w:r>
+        <w:rPr>
+          <w:sz w:val="18"/>
+          <w:szCs w:val="18"/>
+        </w:rPr>
+        <w:t>the</w:t>
+      </w:r>
+      <w:proofErr w:type="spellEnd"/>
+      <w:r>
+        <w:rPr>
+          <w:sz w:val="18"/>
+          <w:szCs w:val="18"/>
+        </w:rPr>
+        <w:t xml:space="preserve"> careful levels of from extraordinarily river times</w:t>
+      </w:r>
+    </w:p>
+    <w:p>
+      <w:r>
+        <w:t xml:space="preserve">the careful levels of from extraordinarily river times letter seventeen rainfall, crossing a described of the ferry valley measurements and the </w:t>
+      </w:r>
+      <w:proofErr w:type="spellStart"/>
+      <w:r>
+        <w:t>the</w:t>
+      </w:r>
+      <w:proofErr w:type="spellEnd"/>
+      <w:r>
+        <w:t xml:space="preserve"> careful levels of from extraordinarily river times letter seventeen rainfall, crossing a described of the ferry valley measurements and the </w:t>
+      </w:r>
+      <w:proofErr w:type="spellStart"/>
+      <w:r>
+        <w:t>the</w:t>
+      </w:r>
+      <w:proofErr w:type="spellEnd"/>
+      <w:r>
+        <w:t xml:space="preserve"> careful levels of from extraordinarily river times letter seventeen rainfall, crossing a described of the ferry valley measurements and the </w:t>
+      </w:r>
+      <w:proofErr w:type="spellStart"/>
+      <w:r>
+        <w:t>the</w:t>
+      </w:r>
+      <w:proofErr w:type="spellEnd"/>
+      <w:r>
+        <w:t xml:space="preserve"> careful levels of from extraordinarily river times letter seventeen rainfall, crossing a described of the ferry valley measurements and the </w:t>
+      </w:r>
+      <w:proofErr w:type="spellStart"/>
+      <w:r>
+        <w:t>the</w:t>
+      </w:r>
+      <w:proofErr w:type="spellEnd"/>
+      <w:r>
+        <w:t xml:space="preserve"> careful levels of from extraordinarily river times letter seventeen rainfall</w:t>
+      </w:r>
+      <w:r>
+        <w:t xml:space="preserve">, crossing a described of the ferry valley measurements and the </w:t>
+      </w:r>
+      <w:proofErr w:type="spellStart"/>
+      <w:r>
+        <w:t>the</w:t>
+      </w:r>
+      <w:proofErr w:type="spellEnd"/>
+      <w:r>
+        <w:t xml:space="preserve"> careful levels of from extraordinarily river times letter seventeen rainfall, crossing a described of</w:t>
+      </w:r>
+    </w:p>
+    <w:p>
+      <w:r>
+        <w:rPr>
+          <w:sz w:val="28"/>
+          <w:szCs w:val="28"/>
+        </w:rPr>
+        <w:t xml:space="preserve">seventeen rainfall, crossing a described of the ferry valley measurements and the </w:t>
+      </w:r>
+      <w:proofErr w:type="spellStart"/>
+      <w:r>
+        <w:rPr>
+          <w:sz w:val="28"/>
+          <w:szCs w:val="28"/>
+        </w:rPr>
+        <w:t>the</w:t>
+      </w:r>
+      <w:proofErr w:type="spellEnd"/>
+      <w:r>
+        <w:rPr>
+          <w:sz w:val="28"/>
+          <w:szCs w:val="28"/>
+        </w:rPr>
+        <w:t xml:space="preserve"> careful levels of from extraordinarily river times letter seventeen rainfall, crossing a described of the ferry valley measurements and the </w:t>
+      </w:r>
+      <w:proofErr w:type="spellStart"/>
+      <w:r>
+        <w:rPr>
+          <w:sz w:val="28"/>
+          <w:szCs w:val="28"/>
+        </w:rPr>
+        <w:t>the</w:t>
+      </w:r>
+      <w:proofErr w:type="spellEnd"/>
+      <w:r>
+        <w:rPr>
+          <w:sz w:val="28"/>
+          <w:szCs w:val="28"/>
+        </w:rPr>
+        <w:t xml:space="preserve"> careful levels of from extraordinarily river times letter seventeen rainfall, crossing a described of the ferry valley measurements and the </w:t>
+      </w:r>
+      <w:proofErr w:type="spellStart"/>
+      <w:r>
+        <w:rPr>
+          <w:sz w:val="28"/>
+          <w:szCs w:val="28"/>
+        </w:rPr>
+        <w:t>the</w:t>
+      </w:r>
+      <w:proofErr w:type="spellEnd"/>
+      <w:r>
+        <w:rPr>
+          <w:sz w:val="28"/>
+          <w:szCs w:val="28"/>
+        </w:rPr>
+        <w:t xml:space="preserve"> careful levels of from extraordinarily river times letter seventeen rainfall, crossing a described of the ferry valley measurements and the </w:t>
+      </w:r>
+      <w:proofErr w:type="spellStart"/>
+      <w:r>
+        <w:rPr>
+          <w:sz w:val="28"/>
+          <w:szCs w:val="28"/>
+        </w:rPr>
+        <w:t>the</w:t>
+      </w:r>
+      <w:proofErr w:type="spellEnd"/>
+      <w:r>
+        <w:rPr>
+          <w:sz w:val="28"/>
+          <w:szCs w:val="28"/>
+        </w:rPr>
+        <w:t xml:space="preserve"> careful levels of from extraordinarily river times letter seventeen rainfall</w:t>
+      </w:r>
+      <w:r>
+        <w:rPr>
+          <w:sz w:val="28"/>
+          <w:szCs w:val="28"/>
+        </w:rPr>
+        <w:t xml:space="preserve">, crossing a described of the ferry valley measurements and the </w:t>
+      </w:r>
+      <w:proofErr w:type="spellStart"/>
+      <w:r>
+        <w:rPr>
+          <w:sz w:val="28"/>
+          <w:szCs w:val="28"/>
+        </w:rPr>
+        <w:t>the</w:t>
+      </w:r>
+      <w:proofErr w:type="spellEnd"/>
+      <w:r>
+        <w:rPr>
+          <w:sz w:val="28"/>
+          <w:szCs w:val="28"/>
+        </w:rPr>
+        <w:t xml:space="preserve"> careful levels of from extraordinarily river times letter seventeen rainfall, crossing a described of the ferry valley </w:t>
+      </w:r>
+      <w:r>
+        <w:rPr>
+          <w:sz w:val="28"/>
+          <w:szCs w:val="28"/>
+        </w:rPr>
         <w:lastRenderedPageBreak/>
-        <w:t>seventeen rainfall, crossing a described of the ferry valley measurements and the the careful levels of from extraordinarily river times letter seventeen rainfall, crossing a described of the ferry valley measurements and the the careful levels of from extraordinarily river times letter seventeen rainfall, crossing a described of the ferry valley measurements and the the careful</w:t>
-      </w:r>
-    </w:p>
-    <w:p>
-      <w:r>
-        <w:rPr>
-          <w:rFonts w:ascii="Courier New" w:eastAsia="Courier New" w:hAnsi="Courier New" w:cs="Courier New"/>
-        </w:rPr>
-        <w:t>the ferry valley measurements and the the careful levels of from extraordinarily river times letter seventeen rainfall, crossing a described of the ferry valley measurements and the the careful levels of from extraordinarily river times letter seventeen rainfall, crossing a described of the ferry valley measurements and the the careful levels of from extraordinarily river times letter seventeen rainfall, crossing a described of the ferry valley measurements and the the careful levels of from extraordinarily river times letter seventeen rainfall, crossing a described of the ferry valley measurements and the the careful levels of from extraordinarily river times letter seventeen rainfall, crossing a described of the ferry valley measurements and the the careful levels of from extraordinarily river times letter</w:t>
-      </w:r>
-    </w:p>
-    <w:p>
-      <w:r>
-        <w:rPr>
-          <w:rFonts w:ascii="Courier New" w:eastAsia="Courier New" w:hAnsi="Courier New" w:cs="Courier New"/>
-          <w:sz w:val="28"/>
-          <w:szCs w:val="28"/>
-        </w:rPr>
-        <w:t>of from extraordinarily river times letter seventeen rainfall, crossing a described of the ferry valley measurements and the the careful levels of from extraordinarily river times letter seventeen rainfall, crossing a described of the ferry valley measurements and the the careful levels of from extraordinarily river times letter seventeen rainfall, crossing a described of the ferry valley measurements and the the careful levels of from extraordinarily river times letter seventeen rainfall, crossing a described of the ferry valley measurements and the the careful levels of from extraordinarily river times letter seventeen rainfall, crossing a described of the ferry valley measurements and the the careful levels of from extraordinarily river times letter seventeen rainfall, crossing a described of the ferry valley measurements and the the careful levels of from extraordinarily river times letter seventeen rainfall, crossing a described of the ferry valley measurements and the the careful levels of from extraordinarily river times letter seventeen rainfall, crossing a described of the</w:t>
-      </w:r>
-    </w:p>
-    <w:p>
-      <w:r>
-        <w:rPr>
-          <w:rFonts w:ascii="Courier New" w:eastAsia="Courier New" w:hAnsi="Courier New" w:cs="Courier New"/>
-          <w:b/>
-          <w:bCs/>
-        </w:rPr>
-        <w:t xml:space="preserve">the careful levels of from extraordinarily river times letter seventeen rainfall, crossing a described of the ferry valley measurements and the the careful levels of from extraordinarily </w:t>
-      </w:r>
-      <w:r>
-        <w:rPr>
-          <w:rFonts w:ascii="Courier New" w:eastAsia="Courier New" w:hAnsi="Courier New" w:cs="Courier New"/>
+        <w:t xml:space="preserve">measurements and the </w:t>
+      </w:r>
+      <w:proofErr w:type="spellStart"/>
+      <w:r>
+        <w:rPr>
+          <w:sz w:val="28"/>
+          <w:szCs w:val="28"/>
+        </w:rPr>
+        <w:t>the</w:t>
+      </w:r>
+      <w:proofErr w:type="spellEnd"/>
+      <w:r>
+        <w:rPr>
+          <w:sz w:val="28"/>
+          <w:szCs w:val="28"/>
+        </w:rPr>
+        <w:t xml:space="preserve"> careful levels of from extraordinarily river times letter seventeen rainfall, crossing a described of the ferry valley measurements and the </w:t>
+      </w:r>
+      <w:proofErr w:type="spellStart"/>
+      <w:r>
+        <w:rPr>
+          <w:sz w:val="28"/>
+          <w:szCs w:val="28"/>
+        </w:rPr>
+        <w:t>the</w:t>
+      </w:r>
+      <w:proofErr w:type="spellEnd"/>
+      <w:r>
+        <w:rPr>
+          <w:sz w:val="28"/>
+          <w:szCs w:val="28"/>
+        </w:rPr>
+        <w:t xml:space="preserve"> careful levels of from extraordinarily river times letter seventeen rainfall, crossing a described of the ferry valley measurements and the </w:t>
+      </w:r>
+      <w:proofErr w:type="spellStart"/>
+      <w:r>
+        <w:rPr>
+          <w:sz w:val="28"/>
+          <w:szCs w:val="28"/>
+        </w:rPr>
+        <w:t>the</w:t>
+      </w:r>
+      <w:proofErr w:type="spellEnd"/>
+    </w:p>
+    <w:p>
+      <w:r>
+        <w:rPr>
+          <w:b/>
+          <w:bCs/>
+        </w:rPr>
+        <w:t xml:space="preserve">a described of the ferry valley measurements and the </w:t>
+      </w:r>
+      <w:proofErr w:type="spellStart"/>
+      <w:r>
+        <w:rPr>
+          <w:b/>
+          <w:bCs/>
+        </w:rPr>
+        <w:t>the</w:t>
+      </w:r>
+      <w:proofErr w:type="spellEnd"/>
+      <w:r>
+        <w:rPr>
+          <w:b/>
+          <w:bCs/>
+        </w:rPr>
+        <w:t xml:space="preserve"> careful levels of from extraordinarily river times letter seventeen rainfall, crossing a described of the ferry valley measurements and the </w:t>
+      </w:r>
+      <w:proofErr w:type="spellStart"/>
+      <w:r>
+        <w:rPr>
+          <w:b/>
+          <w:bCs/>
+        </w:rPr>
+        <w:t>the</w:t>
+      </w:r>
+      <w:proofErr w:type="spellEnd"/>
+      <w:r>
+        <w:rPr>
+          <w:b/>
+          <w:bCs/>
+        </w:rPr>
+        <w:t xml:space="preserve"> careful levels of from extraordinarily river times letter seventeen rainfall, crossing a described of the ferry valley measurements and the </w:t>
+      </w:r>
+      <w:proofErr w:type="spellStart"/>
+      <w:r>
+        <w:rPr>
+          <w:b/>
+          <w:bCs/>
+        </w:rPr>
+        <w:t>the</w:t>
+      </w:r>
+      <w:proofErr w:type="spellEnd"/>
+      <w:r>
+        <w:rPr>
+          <w:b/>
+          <w:bCs/>
+        </w:rPr>
+        <w:t xml:space="preserve"> careful levels of from extraordinarily river times letter seventeen rainfall, crossing a described of the ferry valley measurements and the </w:t>
+      </w:r>
+      <w:proofErr w:type="spellStart"/>
+      <w:r>
+        <w:rPr>
+          <w:b/>
+          <w:bCs/>
+        </w:rPr>
+        <w:t>the</w:t>
+      </w:r>
+      <w:proofErr w:type="spellEnd"/>
+      <w:r>
+        <w:rPr>
+          <w:b/>
+          <w:bCs/>
+        </w:rPr>
+        <w:t xml:space="preserve"> careful levels of from extraordinarily river times letter seventeen rainfall</w:t>
+      </w:r>
+      <w:r>
+        <w:rPr>
+          <w:b/>
+          <w:bCs/>
+        </w:rPr>
+        <w:t xml:space="preserve">, crossing a described of the ferry valley measurements and the </w:t>
+      </w:r>
+      <w:proofErr w:type="spellStart"/>
+      <w:r>
+        <w:rPr>
+          <w:b/>
+          <w:bCs/>
+        </w:rPr>
+        <w:t>the</w:t>
+      </w:r>
+      <w:proofErr w:type="spellEnd"/>
+      <w:r>
+        <w:rPr>
+          <w:b/>
+          <w:bCs/>
+        </w:rPr>
+        <w:t xml:space="preserve"> careful levels of from extraordinarily river</w:t>
+      </w:r>
+    </w:p>
+    <w:p>
+      <w:pPr>
+        <w:pStyle w:val="Heading1"/>
+      </w:pPr>
+      <w:bookmarkStart w:id="1" w:name="_Toc2"/>
+      <w:r>
+        <w:t>Text in Cambria</w:t>
+      </w:r>
+      <w:bookmarkEnd w:id="1"/>
+    </w:p>
+    <w:p>
+      <w:r>
+        <w:rPr>
+          <w:rFonts w:ascii="Cambria" w:eastAsia="Cambria" w:hAnsi="Cambria" w:cs="Cambria"/>
+          <w:sz w:val="18"/>
+          <w:szCs w:val="18"/>
+        </w:rPr>
+        <w:t xml:space="preserve">the careful levels of from extraordinarily river times letter seventeen rainfall, crossing a described of the ferry valley measurements and the </w:t>
+      </w:r>
+      <w:proofErr w:type="spellStart"/>
+      <w:r>
+        <w:rPr>
+          <w:rFonts w:ascii="Cambria" w:eastAsia="Cambria" w:hAnsi="Cambria" w:cs="Cambria"/>
+          <w:sz w:val="18"/>
+          <w:szCs w:val="18"/>
+        </w:rPr>
+        <w:t>the</w:t>
+      </w:r>
+      <w:proofErr w:type="spellEnd"/>
+      <w:r>
+        <w:rPr>
+          <w:rFonts w:ascii="Cambria" w:eastAsia="Cambria" w:hAnsi="Cambria" w:cs="Cambria"/>
+          <w:sz w:val="18"/>
+          <w:szCs w:val="18"/>
+        </w:rPr>
+        <w:t xml:space="preserve"> careful levels of from extraordinarily river times letter seventeen rainfall, crossing a described of the ferry valley measurements and the </w:t>
+      </w:r>
+      <w:proofErr w:type="spellStart"/>
+      <w:r>
+        <w:rPr>
+          <w:rFonts w:ascii="Cambria" w:eastAsia="Cambria" w:hAnsi="Cambria" w:cs="Cambria"/>
+          <w:sz w:val="18"/>
+          <w:szCs w:val="18"/>
+        </w:rPr>
+        <w:t>the</w:t>
+      </w:r>
+      <w:proofErr w:type="spellEnd"/>
+      <w:r>
+        <w:rPr>
+          <w:rFonts w:ascii="Cambria" w:eastAsia="Cambria" w:hAnsi="Cambria" w:cs="Cambria"/>
+          <w:sz w:val="18"/>
+          <w:szCs w:val="18"/>
+        </w:rPr>
+        <w:t xml:space="preserve"> careful levels of from extraordinarily river times letter seventeen rainfall, crossing a described of the ferry valley measurements and the </w:t>
+      </w:r>
+      <w:proofErr w:type="spellStart"/>
+      <w:r>
+        <w:rPr>
+          <w:rFonts w:ascii="Cambria" w:eastAsia="Cambria" w:hAnsi="Cambria" w:cs="Cambria"/>
+          <w:sz w:val="18"/>
+          <w:szCs w:val="18"/>
+        </w:rPr>
+        <w:t>the</w:t>
+      </w:r>
+      <w:proofErr w:type="spellEnd"/>
+      <w:r>
+        <w:rPr>
+          <w:rFonts w:ascii="Cambria" w:eastAsia="Cambria" w:hAnsi="Cambria" w:cs="Cambria"/>
+          <w:sz w:val="18"/>
+          <w:szCs w:val="18"/>
+        </w:rPr>
+        <w:t xml:space="preserve"> careful levels of from extraordinarily river times letter seventeen rainfall, crossing a described of the ferry</w:t>
+      </w:r>
+    </w:p>
+    <w:p>
+      <w:r>
+        <w:rPr>
+          <w:rFonts w:ascii="Cambria" w:eastAsia="Cambria" w:hAnsi="Cambria" w:cs="Cambria"/>
+        </w:rPr>
+        <w:t xml:space="preserve">seventeen rainfall, crossing a described of the ferry valley measurements and the </w:t>
+      </w:r>
+      <w:proofErr w:type="spellStart"/>
+      <w:r>
+        <w:rPr>
+          <w:rFonts w:ascii="Cambria" w:eastAsia="Cambria" w:hAnsi="Cambria" w:cs="Cambria"/>
+        </w:rPr>
+        <w:t>the</w:t>
+      </w:r>
+      <w:proofErr w:type="spellEnd"/>
+      <w:r>
+        <w:rPr>
+          <w:rFonts w:ascii="Cambria" w:eastAsia="Cambria" w:hAnsi="Cambria" w:cs="Cambria"/>
+        </w:rPr>
+        <w:t xml:space="preserve"> careful levels of from extraordinarily river times letter seventeen rainfall, crossing a described of the ferry valley measurements and the </w:t>
+      </w:r>
+      <w:proofErr w:type="spellStart"/>
+      <w:r>
+        <w:rPr>
+          <w:rFonts w:ascii="Cambria" w:eastAsia="Cambria" w:hAnsi="Cambria" w:cs="Cambria"/>
+        </w:rPr>
+        <w:t>the</w:t>
+      </w:r>
+      <w:proofErr w:type="spellEnd"/>
+      <w:r>
+        <w:rPr>
+          <w:rFonts w:ascii="Cambria" w:eastAsia="Cambria" w:hAnsi="Cambria" w:cs="Cambria"/>
+        </w:rPr>
+        <w:t xml:space="preserve"> careful levels of from extraordinarily river times letter seventeen rainfall, crossing a described of the ferry valley measurements and the </w:t>
+      </w:r>
+      <w:proofErr w:type="spellStart"/>
+      <w:r>
+        <w:rPr>
+          <w:rFonts w:ascii="Cambria" w:eastAsia="Cambria" w:hAnsi="Cambria" w:cs="Cambria"/>
+        </w:rPr>
+        <w:t>the</w:t>
+      </w:r>
+      <w:proofErr w:type="spellEnd"/>
+      <w:r>
+        <w:rPr>
+          <w:rFonts w:ascii="Cambria" w:eastAsia="Cambria" w:hAnsi="Cambria" w:cs="Cambria"/>
+        </w:rPr>
+        <w:t xml:space="preserve"> careful levels of from extraordinarily river times letter seventeen rainfall, crossing a described of the ferry valley measurements and the </w:t>
+      </w:r>
+      <w:proofErr w:type="spellStart"/>
+      <w:r>
+        <w:rPr>
+          <w:rFonts w:ascii="Cambria" w:eastAsia="Cambria" w:hAnsi="Cambria" w:cs="Cambria"/>
+        </w:rPr>
+        <w:t>the</w:t>
+      </w:r>
+      <w:proofErr w:type="spellEnd"/>
+      <w:r>
+        <w:rPr>
+          <w:rFonts w:ascii="Cambria" w:eastAsia="Cambria" w:hAnsi="Cambria" w:cs="Cambria"/>
+        </w:rPr>
+        <w:t xml:space="preserve"> careful levels of from extraordinarily river times letter seventeen rainfall</w:t>
+      </w:r>
+      <w:r>
+        <w:rPr>
+          <w:rFonts w:ascii="Cambria" w:eastAsia="Cambria" w:hAnsi="Cambria" w:cs="Cambria"/>
+        </w:rPr>
+        <w:t xml:space="preserve">, crossing a described of the ferry valley measurements and the </w:t>
+      </w:r>
+      <w:proofErr w:type="spellStart"/>
+      <w:r>
+        <w:rPr>
+          <w:rFonts w:ascii="Cambria" w:eastAsia="Cambria" w:hAnsi="Cambria" w:cs="Cambria"/>
+        </w:rPr>
+        <w:t>the</w:t>
+      </w:r>
+      <w:proofErr w:type="spellEnd"/>
+      <w:r>
+        <w:rPr>
+          <w:rFonts w:ascii="Cambria" w:eastAsia="Cambria" w:hAnsi="Cambria" w:cs="Cambria"/>
+        </w:rPr>
+        <w:t xml:space="preserve"> careful levels of from extraordinarily river times letter seventeen rainfall, crossing a described of the ferry valley measurements and the </w:t>
+      </w:r>
+      <w:proofErr w:type="spellStart"/>
+      <w:r>
+        <w:rPr>
+          <w:rFonts w:ascii="Cambria" w:eastAsia="Cambria" w:hAnsi="Cambria" w:cs="Cambria"/>
+        </w:rPr>
+        <w:t>the</w:t>
+      </w:r>
+      <w:proofErr w:type="spellEnd"/>
+      <w:r>
+        <w:rPr>
+          <w:rFonts w:ascii="Cambria" w:eastAsia="Cambria" w:hAnsi="Cambria" w:cs="Cambria"/>
+        </w:rPr>
+        <w:t xml:space="preserve"> careful levels</w:t>
+      </w:r>
+    </w:p>
+    <w:p>
+      <w:r>
+        <w:rPr>
+          <w:rFonts w:ascii="Cambria" w:eastAsia="Cambria" w:hAnsi="Cambria" w:cs="Cambria"/>
+          <w:sz w:val="28"/>
+          <w:szCs w:val="28"/>
+        </w:rPr>
+        <w:t xml:space="preserve">measurements and the </w:t>
+      </w:r>
+      <w:proofErr w:type="spellStart"/>
+      <w:r>
+        <w:rPr>
+          <w:rFonts w:ascii="Cambria" w:eastAsia="Cambria" w:hAnsi="Cambria" w:cs="Cambria"/>
+          <w:sz w:val="28"/>
+          <w:szCs w:val="28"/>
+        </w:rPr>
+        <w:t>the</w:t>
+      </w:r>
+      <w:proofErr w:type="spellEnd"/>
+      <w:r>
+        <w:rPr>
+          <w:rFonts w:ascii="Cambria" w:eastAsia="Cambria" w:hAnsi="Cambria" w:cs="Cambria"/>
+          <w:sz w:val="28"/>
+          <w:szCs w:val="28"/>
+        </w:rPr>
+        <w:t xml:space="preserve"> careful levels of from extraordinarily river times letter seventeen rainfall, crossing a described of the ferry valley measurements and the </w:t>
+      </w:r>
+      <w:proofErr w:type="spellStart"/>
+      <w:r>
+        <w:rPr>
+          <w:rFonts w:ascii="Cambria" w:eastAsia="Cambria" w:hAnsi="Cambria" w:cs="Cambria"/>
+          <w:sz w:val="28"/>
+          <w:szCs w:val="28"/>
+        </w:rPr>
+        <w:t>the</w:t>
+      </w:r>
+      <w:proofErr w:type="spellEnd"/>
+      <w:r>
+        <w:rPr>
+          <w:rFonts w:ascii="Cambria" w:eastAsia="Cambria" w:hAnsi="Cambria" w:cs="Cambria"/>
+          <w:sz w:val="28"/>
+          <w:szCs w:val="28"/>
+        </w:rPr>
+        <w:t xml:space="preserve"> careful levels of from extraordinarily river times letter seventeen rainfall, crossing a described of the ferry valley measurements and the </w:t>
+      </w:r>
+      <w:proofErr w:type="spellStart"/>
+      <w:r>
+        <w:rPr>
+          <w:rFonts w:ascii="Cambria" w:eastAsia="Cambria" w:hAnsi="Cambria" w:cs="Cambria"/>
+          <w:sz w:val="28"/>
+          <w:szCs w:val="28"/>
+        </w:rPr>
+        <w:t>the</w:t>
+      </w:r>
+      <w:proofErr w:type="spellEnd"/>
+      <w:r>
+        <w:rPr>
+          <w:rFonts w:ascii="Cambria" w:eastAsia="Cambria" w:hAnsi="Cambria" w:cs="Cambria"/>
+          <w:sz w:val="28"/>
+          <w:szCs w:val="28"/>
+        </w:rPr>
+        <w:t xml:space="preserve"> careful levels of from extraordinarily river times letter seventeen rainfall, crossing a described of the ferry valley measurements and the </w:t>
+      </w:r>
+      <w:proofErr w:type="spellStart"/>
+      <w:r>
+        <w:rPr>
+          <w:rFonts w:ascii="Cambria" w:eastAsia="Cambria" w:hAnsi="Cambria" w:cs="Cambria"/>
+          <w:sz w:val="28"/>
+          <w:szCs w:val="28"/>
+        </w:rPr>
+        <w:t>the</w:t>
+      </w:r>
+      <w:proofErr w:type="spellEnd"/>
+      <w:r>
+        <w:rPr>
+          <w:rFonts w:ascii="Cambria" w:eastAsia="Cambria" w:hAnsi="Cambria" w:cs="Cambria"/>
+          <w:sz w:val="28"/>
+          <w:szCs w:val="28"/>
+        </w:rPr>
+        <w:t xml:space="preserve"> careful levels of from extraordinarily river times letter seventeen rainfall</w:t>
+      </w:r>
+      <w:r>
+        <w:rPr>
+          <w:rFonts w:ascii="Cambria" w:eastAsia="Cambria" w:hAnsi="Cambria" w:cs="Cambria"/>
+          <w:sz w:val="28"/>
+          <w:szCs w:val="28"/>
+        </w:rPr>
+        <w:t xml:space="preserve">, crossing a described of the ferry valley measurements and the </w:t>
+      </w:r>
+      <w:proofErr w:type="spellStart"/>
+      <w:r>
+        <w:rPr>
+          <w:rFonts w:ascii="Cambria" w:eastAsia="Cambria" w:hAnsi="Cambria" w:cs="Cambria"/>
+          <w:sz w:val="28"/>
+          <w:szCs w:val="28"/>
+        </w:rPr>
+        <w:t>the</w:t>
+      </w:r>
+      <w:proofErr w:type="spellEnd"/>
+      <w:r>
+        <w:rPr>
+          <w:rFonts w:ascii="Cambria" w:eastAsia="Cambria" w:hAnsi="Cambria" w:cs="Cambria"/>
+          <w:sz w:val="28"/>
+          <w:szCs w:val="28"/>
+        </w:rPr>
+        <w:t xml:space="preserve"> careful levels of from extraordinarily river times letter seventeen rainfall, crossing a described of the ferry valley measurements and the </w:t>
+      </w:r>
+      <w:proofErr w:type="spellStart"/>
+      <w:r>
+        <w:rPr>
+          <w:rFonts w:ascii="Cambria" w:eastAsia="Cambria" w:hAnsi="Cambria" w:cs="Cambria"/>
+          <w:sz w:val="28"/>
+          <w:szCs w:val="28"/>
+        </w:rPr>
+        <w:t>the</w:t>
+      </w:r>
+      <w:proofErr w:type="spellEnd"/>
+      <w:r>
+        <w:rPr>
+          <w:rFonts w:ascii="Cambria" w:eastAsia="Cambria" w:hAnsi="Cambria" w:cs="Cambria"/>
+          <w:sz w:val="28"/>
+          <w:szCs w:val="28"/>
+        </w:rPr>
+        <w:t xml:space="preserve"> careful levels of from extraordinarily river times letter seventeen rainfall, crossing a described of the ferry valley measurements and the </w:t>
+      </w:r>
+      <w:proofErr w:type="spellStart"/>
+      <w:r>
+        <w:rPr>
+          <w:rFonts w:ascii="Cambria" w:eastAsia="Cambria" w:hAnsi="Cambria" w:cs="Cambria"/>
+          <w:sz w:val="28"/>
+          <w:szCs w:val="28"/>
+        </w:rPr>
+        <w:t>the</w:t>
+      </w:r>
+      <w:proofErr w:type="spellEnd"/>
+      <w:r>
+        <w:rPr>
+          <w:rFonts w:ascii="Cambria" w:eastAsia="Cambria" w:hAnsi="Cambria" w:cs="Cambria"/>
+          <w:sz w:val="28"/>
+          <w:szCs w:val="28"/>
+        </w:rPr>
+        <w:t xml:space="preserve"> careful levels of from extraordinarily river times letter seventeen rainfall, crossing a described of the ferry valley measurements and the </w:t>
+      </w:r>
+      <w:proofErr w:type="spellStart"/>
+      <w:r>
+        <w:rPr>
+          <w:rFonts w:ascii="Cambria" w:eastAsia="Cambria" w:hAnsi="Cambria" w:cs="Cambria"/>
+          <w:sz w:val="28"/>
+          <w:szCs w:val="28"/>
+        </w:rPr>
+        <w:t>the</w:t>
+      </w:r>
+      <w:proofErr w:type="spellEnd"/>
+      <w:r>
+        <w:rPr>
+          <w:rFonts w:ascii="Cambria" w:eastAsia="Cambria" w:hAnsi="Cambria" w:cs="Cambria"/>
+          <w:sz w:val="28"/>
+          <w:szCs w:val="28"/>
+        </w:rPr>
+        <w:t xml:space="preserve"> careful leve</w:t>
+      </w:r>
+      <w:r>
+        <w:rPr>
+          <w:rFonts w:ascii="Cambria" w:eastAsia="Cambria" w:hAnsi="Cambria" w:cs="Cambria"/>
+          <w:sz w:val="28"/>
+          <w:szCs w:val="28"/>
+        </w:rPr>
+        <w:t>ls of from extraordinarily river times letter seventeen</w:t>
+      </w:r>
+    </w:p>
+    <w:p>
+      <w:r>
+        <w:rPr>
+          <w:rFonts w:ascii="Cambria" w:eastAsia="Cambria" w:hAnsi="Cambria" w:cs="Cambria"/>
           <w:b/>
           <w:bCs/>
         </w:rPr>
         <w:lastRenderedPageBreak/>
-        <w:t>river times letter seventeen rainfall, crossing a described of the ferry valley measurements and the the careful levels of from extraordinarily river times letter seventeen rainfall, crossing a described of the ferry valley measurements and the the careful levels of from extraordinarily river times letter seventeen rainfall, crossing a described of the ferry valley measurements and the the careful levels of from extraordinarily river times letter seventeen rainfall, crossing a described of the</w:t>
+        <w:t xml:space="preserve">seventeen rainfall, crossing a described of the ferry valley measurements and the </w:t>
+      </w:r>
+      <w:proofErr w:type="spellStart"/>
+      <w:r>
+        <w:rPr>
+          <w:rFonts w:ascii="Cambria" w:eastAsia="Cambria" w:hAnsi="Cambria" w:cs="Cambria"/>
+          <w:b/>
+          <w:bCs/>
+        </w:rPr>
+        <w:t>the</w:t>
+      </w:r>
+      <w:proofErr w:type="spellEnd"/>
+      <w:r>
+        <w:rPr>
+          <w:rFonts w:ascii="Cambria" w:eastAsia="Cambria" w:hAnsi="Cambria" w:cs="Cambria"/>
+          <w:b/>
+          <w:bCs/>
+        </w:rPr>
+        <w:t xml:space="preserve"> careful levels of from extraordinarily river times letter seventeen rainfall, crossing a described of the ferry valley measurements and the </w:t>
+      </w:r>
+      <w:proofErr w:type="spellStart"/>
+      <w:r>
+        <w:rPr>
+          <w:rFonts w:ascii="Cambria" w:eastAsia="Cambria" w:hAnsi="Cambria" w:cs="Cambria"/>
+          <w:b/>
+          <w:bCs/>
+        </w:rPr>
+        <w:t>the</w:t>
+      </w:r>
+      <w:proofErr w:type="spellEnd"/>
+      <w:r>
+        <w:rPr>
+          <w:rFonts w:ascii="Cambria" w:eastAsia="Cambria" w:hAnsi="Cambria" w:cs="Cambria"/>
+          <w:b/>
+          <w:bCs/>
+        </w:rPr>
+        <w:t xml:space="preserve"> careful levels of from extraordinarily river times letter seventeen rainfall, crossing a described of the ferry valley measurements and the </w:t>
+      </w:r>
+      <w:proofErr w:type="spellStart"/>
+      <w:r>
+        <w:rPr>
+          <w:rFonts w:ascii="Cambria" w:eastAsia="Cambria" w:hAnsi="Cambria" w:cs="Cambria"/>
+          <w:b/>
+          <w:bCs/>
+        </w:rPr>
+        <w:t>the</w:t>
+      </w:r>
+      <w:proofErr w:type="spellEnd"/>
+      <w:r>
+        <w:rPr>
+          <w:rFonts w:ascii="Cambria" w:eastAsia="Cambria" w:hAnsi="Cambria" w:cs="Cambria"/>
+          <w:b/>
+          <w:bCs/>
+        </w:rPr>
+        <w:t xml:space="preserve"> careful levels of from extraordinarily river times letter seventeen rainfall, crossing a described of the ferry valley measurements and the </w:t>
+      </w:r>
+      <w:proofErr w:type="spellStart"/>
+      <w:r>
+        <w:rPr>
+          <w:rFonts w:ascii="Cambria" w:eastAsia="Cambria" w:hAnsi="Cambria" w:cs="Cambria"/>
+          <w:b/>
+          <w:bCs/>
+        </w:rPr>
+        <w:t>the</w:t>
+      </w:r>
+      <w:proofErr w:type="spellEnd"/>
+      <w:r>
+        <w:rPr>
+          <w:rFonts w:ascii="Cambria" w:eastAsia="Cambria" w:hAnsi="Cambria" w:cs="Cambria"/>
+          <w:b/>
+          <w:bCs/>
+        </w:rPr>
+        <w:t xml:space="preserve"> careful levels of from extraordinarily river times letter seventeen rainfall</w:t>
+      </w:r>
+      <w:r>
+        <w:rPr>
+          <w:rFonts w:ascii="Cambria" w:eastAsia="Cambria" w:hAnsi="Cambria" w:cs="Cambria"/>
+          <w:b/>
+          <w:bCs/>
+        </w:rPr>
+        <w:t xml:space="preserve">, crossing a described of the ferry valley measurements and the </w:t>
+      </w:r>
+      <w:proofErr w:type="spellStart"/>
+      <w:r>
+        <w:rPr>
+          <w:rFonts w:ascii="Cambria" w:eastAsia="Cambria" w:hAnsi="Cambria" w:cs="Cambria"/>
+          <w:b/>
+          <w:bCs/>
+        </w:rPr>
+        <w:t>the</w:t>
+      </w:r>
+      <w:proofErr w:type="spellEnd"/>
+      <w:r>
+        <w:rPr>
+          <w:rFonts w:ascii="Cambria" w:eastAsia="Cambria" w:hAnsi="Cambria" w:cs="Cambria"/>
+          <w:b/>
+          <w:bCs/>
+        </w:rPr>
+        <w:t xml:space="preserve"> careful levels of</w:t>
       </w:r>
     </w:p>
     <w:p>
       <w:pPr>
         <w:pStyle w:val="Heading1"/>
       </w:pPr>
+      <w:bookmarkStart w:id="2" w:name="_Toc3"/>
+      <w:r>
+        <w:t>Text in Arial</w:t>
+      </w:r>
+      <w:bookmarkEnd w:id="2"/>
+    </w:p>
+    <w:p>
+      <w:r>
+        <w:rPr>
+          <w:rFonts w:ascii="Arial" w:eastAsia="Arial" w:hAnsi="Arial" w:cs="Arial"/>
+          <w:sz w:val="18"/>
+          <w:szCs w:val="18"/>
+        </w:rPr>
+        <w:t xml:space="preserve">seventeen rainfall, crossing a described of the ferry valley measurements and the </w:t>
+      </w:r>
+      <w:proofErr w:type="spellStart"/>
+      <w:r>
+        <w:rPr>
+          <w:rFonts w:ascii="Arial" w:eastAsia="Arial" w:hAnsi="Arial" w:cs="Arial"/>
+          <w:sz w:val="18"/>
+          <w:szCs w:val="18"/>
+        </w:rPr>
+        <w:t>the</w:t>
+      </w:r>
+      <w:proofErr w:type="spellEnd"/>
+      <w:r>
+        <w:rPr>
+          <w:rFonts w:ascii="Arial" w:eastAsia="Arial" w:hAnsi="Arial" w:cs="Arial"/>
+          <w:sz w:val="18"/>
+          <w:szCs w:val="18"/>
+        </w:rPr>
+        <w:t xml:space="preserve"> careful levels of from extraordinarily river times letter seventeen rainfall, crossing a described of the ferry valley measurements and the </w:t>
+      </w:r>
+      <w:proofErr w:type="spellStart"/>
+      <w:r>
+        <w:rPr>
+          <w:rFonts w:ascii="Arial" w:eastAsia="Arial" w:hAnsi="Arial" w:cs="Arial"/>
+          <w:sz w:val="18"/>
+          <w:szCs w:val="18"/>
+        </w:rPr>
+        <w:t>the</w:t>
+      </w:r>
+      <w:proofErr w:type="spellEnd"/>
+      <w:r>
+        <w:rPr>
+          <w:rFonts w:ascii="Arial" w:eastAsia="Arial" w:hAnsi="Arial" w:cs="Arial"/>
+          <w:sz w:val="18"/>
+          <w:szCs w:val="18"/>
+        </w:rPr>
+        <w:t xml:space="preserve"> careful levels of from extraordinarily river times letter seventeen rainfall, crossing a described of the ferry valley measurements and the </w:t>
+      </w:r>
+      <w:proofErr w:type="spellStart"/>
+      <w:r>
+        <w:rPr>
+          <w:rFonts w:ascii="Arial" w:eastAsia="Arial" w:hAnsi="Arial" w:cs="Arial"/>
+          <w:sz w:val="18"/>
+          <w:szCs w:val="18"/>
+        </w:rPr>
+        <w:t>the</w:t>
+      </w:r>
+      <w:proofErr w:type="spellEnd"/>
+      <w:r>
+        <w:rPr>
+          <w:rFonts w:ascii="Arial" w:eastAsia="Arial" w:hAnsi="Arial" w:cs="Arial"/>
+          <w:sz w:val="18"/>
+          <w:szCs w:val="18"/>
+        </w:rPr>
+        <w:t xml:space="preserve"> careful levels of from extraordinarily river times letter seventeen rainfall, crossing a described of the ferry valley measurements and the </w:t>
+      </w:r>
+      <w:proofErr w:type="spellStart"/>
+      <w:r>
+        <w:rPr>
+          <w:rFonts w:ascii="Arial" w:eastAsia="Arial" w:hAnsi="Arial" w:cs="Arial"/>
+          <w:sz w:val="18"/>
+          <w:szCs w:val="18"/>
+        </w:rPr>
+        <w:t>the</w:t>
+      </w:r>
+      <w:proofErr w:type="spellEnd"/>
+      <w:r>
+        <w:rPr>
+          <w:rFonts w:ascii="Arial" w:eastAsia="Arial" w:hAnsi="Arial" w:cs="Arial"/>
+          <w:sz w:val="18"/>
+          <w:szCs w:val="18"/>
+        </w:rPr>
+        <w:t xml:space="preserve"> careful levels of from</w:t>
+      </w:r>
+    </w:p>
+    <w:p>
+      <w:r>
+        <w:rPr>
+          <w:rFonts w:ascii="Arial" w:eastAsia="Arial" w:hAnsi="Arial" w:cs="Arial"/>
+        </w:rPr>
+        <w:t xml:space="preserve">measurements and the </w:t>
+      </w:r>
+      <w:proofErr w:type="spellStart"/>
+      <w:r>
+        <w:rPr>
+          <w:rFonts w:ascii="Arial" w:eastAsia="Arial" w:hAnsi="Arial" w:cs="Arial"/>
+        </w:rPr>
+        <w:t>the</w:t>
+      </w:r>
+      <w:proofErr w:type="spellEnd"/>
+      <w:r>
+        <w:rPr>
+          <w:rFonts w:ascii="Arial" w:eastAsia="Arial" w:hAnsi="Arial" w:cs="Arial"/>
+        </w:rPr>
+        <w:t xml:space="preserve"> careful levels of from extraordinarily river times letter seventeen rainfall, crossing a described of the ferry valley measurements and the </w:t>
+      </w:r>
+      <w:proofErr w:type="spellStart"/>
+      <w:r>
+        <w:rPr>
+          <w:rFonts w:ascii="Arial" w:eastAsia="Arial" w:hAnsi="Arial" w:cs="Arial"/>
+        </w:rPr>
+        <w:t>the</w:t>
+      </w:r>
+      <w:proofErr w:type="spellEnd"/>
+      <w:r>
+        <w:rPr>
+          <w:rFonts w:ascii="Arial" w:eastAsia="Arial" w:hAnsi="Arial" w:cs="Arial"/>
+        </w:rPr>
+        <w:t xml:space="preserve"> careful levels of from extraordinarily river times letter seventeen rainfall, crossing a described of the ferry valley measurements and the </w:t>
+      </w:r>
+      <w:proofErr w:type="spellStart"/>
+      <w:r>
+        <w:rPr>
+          <w:rFonts w:ascii="Arial" w:eastAsia="Arial" w:hAnsi="Arial" w:cs="Arial"/>
+        </w:rPr>
+        <w:t>the</w:t>
+      </w:r>
+      <w:proofErr w:type="spellEnd"/>
+      <w:r>
+        <w:rPr>
+          <w:rFonts w:ascii="Arial" w:eastAsia="Arial" w:hAnsi="Arial" w:cs="Arial"/>
+        </w:rPr>
+        <w:t xml:space="preserve"> careful levels of from extraordinarily river times letter seventeen rainfall, crossing a described of the ferry valley measurements and the </w:t>
+      </w:r>
+      <w:proofErr w:type="spellStart"/>
+      <w:r>
+        <w:rPr>
+          <w:rFonts w:ascii="Arial" w:eastAsia="Arial" w:hAnsi="Arial" w:cs="Arial"/>
+        </w:rPr>
+        <w:t>the</w:t>
+      </w:r>
+      <w:proofErr w:type="spellEnd"/>
+      <w:r>
+        <w:rPr>
+          <w:rFonts w:ascii="Arial" w:eastAsia="Arial" w:hAnsi="Arial" w:cs="Arial"/>
+        </w:rPr>
+        <w:t xml:space="preserve"> careful levels of from extraordinarily river times letter seventeen rainfall</w:t>
+      </w:r>
+      <w:r>
+        <w:rPr>
+          <w:rFonts w:ascii="Arial" w:eastAsia="Arial" w:hAnsi="Arial" w:cs="Arial"/>
+        </w:rPr>
+        <w:t xml:space="preserve">, crossing a described of the ferry valley measurements and the </w:t>
+      </w:r>
+      <w:proofErr w:type="spellStart"/>
+      <w:r>
+        <w:rPr>
+          <w:rFonts w:ascii="Arial" w:eastAsia="Arial" w:hAnsi="Arial" w:cs="Arial"/>
+        </w:rPr>
+        <w:t>the</w:t>
+      </w:r>
+      <w:proofErr w:type="spellEnd"/>
+      <w:r>
+        <w:rPr>
+          <w:rFonts w:ascii="Arial" w:eastAsia="Arial" w:hAnsi="Arial" w:cs="Arial"/>
+        </w:rPr>
+        <w:t xml:space="preserve"> careful levels of from extraordinarily river times letter seventeen rainfall, crossing a described of the ferry valley measurements and the </w:t>
+      </w:r>
+      <w:proofErr w:type="spellStart"/>
+      <w:r>
+        <w:rPr>
+          <w:rFonts w:ascii="Arial" w:eastAsia="Arial" w:hAnsi="Arial" w:cs="Arial"/>
+        </w:rPr>
+        <w:t>the</w:t>
+      </w:r>
+      <w:proofErr w:type="spellEnd"/>
+      <w:r>
+        <w:rPr>
+          <w:rFonts w:ascii="Arial" w:eastAsia="Arial" w:hAnsi="Arial" w:cs="Arial"/>
+        </w:rPr>
+        <w:t xml:space="preserve"> careful levels of from extraordinarily river times letter seventeen rainfall, crossing</w:t>
+      </w:r>
+    </w:p>
+    <w:p>
+      <w:r>
+        <w:rPr>
+          <w:rFonts w:ascii="Arial" w:eastAsia="Arial" w:hAnsi="Arial" w:cs="Arial"/>
+          <w:sz w:val="28"/>
+          <w:szCs w:val="28"/>
+        </w:rPr>
+        <w:t xml:space="preserve">river times letter seventeen rainfall, crossing a described of the ferry valley measurements and the </w:t>
+      </w:r>
+      <w:proofErr w:type="spellStart"/>
+      <w:r>
+        <w:rPr>
+          <w:rFonts w:ascii="Arial" w:eastAsia="Arial" w:hAnsi="Arial" w:cs="Arial"/>
+          <w:sz w:val="28"/>
+          <w:szCs w:val="28"/>
+        </w:rPr>
+        <w:t>the</w:t>
+      </w:r>
+      <w:proofErr w:type="spellEnd"/>
+      <w:r>
+        <w:rPr>
+          <w:rFonts w:ascii="Arial" w:eastAsia="Arial" w:hAnsi="Arial" w:cs="Arial"/>
+          <w:sz w:val="28"/>
+          <w:szCs w:val="28"/>
+        </w:rPr>
+        <w:t xml:space="preserve"> careful levels of from extraordinarily river times letter seventeen rainfall, crossing a described of the ferry valley measurements and the </w:t>
+      </w:r>
+      <w:proofErr w:type="spellStart"/>
+      <w:r>
+        <w:rPr>
+          <w:rFonts w:ascii="Arial" w:eastAsia="Arial" w:hAnsi="Arial" w:cs="Arial"/>
+          <w:sz w:val="28"/>
+          <w:szCs w:val="28"/>
+        </w:rPr>
+        <w:t>the</w:t>
+      </w:r>
+      <w:proofErr w:type="spellEnd"/>
+      <w:r>
+        <w:rPr>
+          <w:rFonts w:ascii="Arial" w:eastAsia="Arial" w:hAnsi="Arial" w:cs="Arial"/>
+          <w:sz w:val="28"/>
+          <w:szCs w:val="28"/>
+        </w:rPr>
+        <w:t xml:space="preserve"> careful levels of from extraordinarily river times letter seventeen rainfall, crossing a described of the ferry valley measurements and the </w:t>
+      </w:r>
+      <w:proofErr w:type="spellStart"/>
+      <w:r>
+        <w:rPr>
+          <w:rFonts w:ascii="Arial" w:eastAsia="Arial" w:hAnsi="Arial" w:cs="Arial"/>
+          <w:sz w:val="28"/>
+          <w:szCs w:val="28"/>
+        </w:rPr>
+        <w:t>the</w:t>
+      </w:r>
+      <w:proofErr w:type="spellEnd"/>
+      <w:r>
+        <w:rPr>
+          <w:rFonts w:ascii="Arial" w:eastAsia="Arial" w:hAnsi="Arial" w:cs="Arial"/>
+          <w:sz w:val="28"/>
+          <w:szCs w:val="28"/>
+        </w:rPr>
+        <w:t xml:space="preserve"> careful levels of from extraordinarily river times letter seventeen rainfall, crossing a described of the ferry valley measurements and the </w:t>
+      </w:r>
+      <w:proofErr w:type="spellStart"/>
+      <w:r>
+        <w:rPr>
+          <w:rFonts w:ascii="Arial" w:eastAsia="Arial" w:hAnsi="Arial" w:cs="Arial"/>
+          <w:sz w:val="28"/>
+          <w:szCs w:val="28"/>
+        </w:rPr>
+        <w:t>the</w:t>
+      </w:r>
+      <w:proofErr w:type="spellEnd"/>
+      <w:r>
+        <w:rPr>
+          <w:rFonts w:ascii="Arial" w:eastAsia="Arial" w:hAnsi="Arial" w:cs="Arial"/>
+          <w:sz w:val="28"/>
+          <w:szCs w:val="28"/>
+        </w:rPr>
+        <w:t xml:space="preserve"> careful levels of from extraordinarily river times letter seventeen rainfall</w:t>
+      </w:r>
+      <w:r>
+        <w:rPr>
+          <w:rFonts w:ascii="Arial" w:eastAsia="Arial" w:hAnsi="Arial" w:cs="Arial"/>
+          <w:sz w:val="28"/>
+          <w:szCs w:val="28"/>
+        </w:rPr>
+        <w:t xml:space="preserve">, crossing a described of the ferry valley measurements and the </w:t>
+      </w:r>
+      <w:proofErr w:type="spellStart"/>
+      <w:r>
+        <w:rPr>
+          <w:rFonts w:ascii="Arial" w:eastAsia="Arial" w:hAnsi="Arial" w:cs="Arial"/>
+          <w:sz w:val="28"/>
+          <w:szCs w:val="28"/>
+        </w:rPr>
+        <w:t>the</w:t>
+      </w:r>
+      <w:proofErr w:type="spellEnd"/>
+      <w:r>
+        <w:rPr>
+          <w:rFonts w:ascii="Arial" w:eastAsia="Arial" w:hAnsi="Arial" w:cs="Arial"/>
+          <w:sz w:val="28"/>
+          <w:szCs w:val="28"/>
+        </w:rPr>
+        <w:t xml:space="preserve"> careful levels of from extraordinarily river times letter seventeen rainfall, crossing a described of the ferry valley measurements and the </w:t>
+      </w:r>
+      <w:proofErr w:type="spellStart"/>
+      <w:r>
+        <w:rPr>
+          <w:rFonts w:ascii="Arial" w:eastAsia="Arial" w:hAnsi="Arial" w:cs="Arial"/>
+          <w:sz w:val="28"/>
+          <w:szCs w:val="28"/>
+        </w:rPr>
+        <w:t>the</w:t>
+      </w:r>
+      <w:proofErr w:type="spellEnd"/>
+      <w:r>
+        <w:rPr>
+          <w:rFonts w:ascii="Arial" w:eastAsia="Arial" w:hAnsi="Arial" w:cs="Arial"/>
+          <w:sz w:val="28"/>
+          <w:szCs w:val="28"/>
+        </w:rPr>
+        <w:t xml:space="preserve"> careful levels of from extraordinarily river times letter seventeen rainfall, crossing a described of the ferry valley measurements and the </w:t>
+      </w:r>
+      <w:proofErr w:type="spellStart"/>
+      <w:r>
+        <w:rPr>
+          <w:rFonts w:ascii="Arial" w:eastAsia="Arial" w:hAnsi="Arial" w:cs="Arial"/>
+          <w:sz w:val="28"/>
+          <w:szCs w:val="28"/>
+        </w:rPr>
+        <w:t>the</w:t>
+      </w:r>
+      <w:proofErr w:type="spellEnd"/>
+      <w:r>
+        <w:rPr>
+          <w:rFonts w:ascii="Arial" w:eastAsia="Arial" w:hAnsi="Arial" w:cs="Arial"/>
+          <w:sz w:val="28"/>
+          <w:szCs w:val="28"/>
+        </w:rPr>
+        <w:t xml:space="preserve"> careful levels of from extraordinarily river times letter seventeen rainfall, crossing a described of the ferry valley measurements</w:t>
+      </w:r>
+    </w:p>
+    <w:p>
+      <w:r>
+        <w:rPr>
+          <w:rFonts w:ascii="Arial" w:eastAsia="Arial" w:hAnsi="Arial" w:cs="Arial"/>
+          <w:b/>
+          <w:bCs/>
+        </w:rPr>
+        <w:t xml:space="preserve">river times letter seventeen rainfall, crossing a described of the ferry valley measurements and the </w:t>
+      </w:r>
+      <w:proofErr w:type="spellStart"/>
+      <w:r>
+        <w:rPr>
+          <w:rFonts w:ascii="Arial" w:eastAsia="Arial" w:hAnsi="Arial" w:cs="Arial"/>
+          <w:b/>
+          <w:bCs/>
+        </w:rPr>
+        <w:t>the</w:t>
+      </w:r>
+      <w:proofErr w:type="spellEnd"/>
+      <w:r>
+        <w:rPr>
+          <w:rFonts w:ascii="Arial" w:eastAsia="Arial" w:hAnsi="Arial" w:cs="Arial"/>
+          <w:b/>
+          <w:bCs/>
+        </w:rPr>
+        <w:t xml:space="preserve"> careful levels of from extraordinarily river times letter seventeen rainfall, crossing a described of the ferry valley measurements and the </w:t>
+      </w:r>
+      <w:proofErr w:type="spellStart"/>
+      <w:r>
+        <w:rPr>
+          <w:rFonts w:ascii="Arial" w:eastAsia="Arial" w:hAnsi="Arial" w:cs="Arial"/>
+          <w:b/>
+          <w:bCs/>
+        </w:rPr>
+        <w:t>the</w:t>
+      </w:r>
+      <w:proofErr w:type="spellEnd"/>
+      <w:r>
+        <w:rPr>
+          <w:rFonts w:ascii="Arial" w:eastAsia="Arial" w:hAnsi="Arial" w:cs="Arial"/>
+          <w:b/>
+          <w:bCs/>
+        </w:rPr>
+        <w:t xml:space="preserve"> careful levels of from extraordinarily river times letter seventeen rainfall, crossing a described of the ferry valley measurements and the </w:t>
+      </w:r>
+      <w:proofErr w:type="spellStart"/>
+      <w:r>
+        <w:rPr>
+          <w:rFonts w:ascii="Arial" w:eastAsia="Arial" w:hAnsi="Arial" w:cs="Arial"/>
+          <w:b/>
+          <w:bCs/>
+        </w:rPr>
+        <w:t>the</w:t>
+      </w:r>
+      <w:proofErr w:type="spellEnd"/>
+      <w:r>
+        <w:rPr>
+          <w:rFonts w:ascii="Arial" w:eastAsia="Arial" w:hAnsi="Arial" w:cs="Arial"/>
+          <w:b/>
+          <w:bCs/>
+        </w:rPr>
+        <w:t xml:space="preserve"> careful levels of from </w:t>
+      </w:r>
+      <w:r>
+        <w:rPr>
+          <w:rFonts w:ascii="Arial" w:eastAsia="Arial" w:hAnsi="Arial" w:cs="Arial"/>
+          <w:b/>
+          <w:bCs/>
+        </w:rPr>
+        <w:lastRenderedPageBreak/>
+        <w:t xml:space="preserve">extraordinarily river times letter seventeen rainfall, crossing a described of the ferry valley measurements and the </w:t>
+      </w:r>
+      <w:proofErr w:type="spellStart"/>
+      <w:r>
+        <w:rPr>
+          <w:rFonts w:ascii="Arial" w:eastAsia="Arial" w:hAnsi="Arial" w:cs="Arial"/>
+          <w:b/>
+          <w:bCs/>
+        </w:rPr>
+        <w:t>the</w:t>
+      </w:r>
+      <w:proofErr w:type="spellEnd"/>
+      <w:r>
+        <w:rPr>
+          <w:rFonts w:ascii="Arial" w:eastAsia="Arial" w:hAnsi="Arial" w:cs="Arial"/>
+          <w:b/>
+          <w:bCs/>
+        </w:rPr>
+        <w:t xml:space="preserve"> careful levels of from extraordinarily river times letter seventeen rainfall</w:t>
+      </w:r>
+      <w:r>
+        <w:rPr>
+          <w:rFonts w:ascii="Arial" w:eastAsia="Arial" w:hAnsi="Arial" w:cs="Arial"/>
+          <w:b/>
+          <w:bCs/>
+        </w:rPr>
+        <w:t xml:space="preserve">, crossing a described of the ferry valley measurements and the </w:t>
+      </w:r>
+      <w:proofErr w:type="spellStart"/>
+      <w:r>
+        <w:rPr>
+          <w:rFonts w:ascii="Arial" w:eastAsia="Arial" w:hAnsi="Arial" w:cs="Arial"/>
+          <w:b/>
+          <w:bCs/>
+        </w:rPr>
+        <w:t>the</w:t>
+      </w:r>
+      <w:proofErr w:type="spellEnd"/>
+    </w:p>
+    <w:p>
+      <w:pPr>
+        <w:pStyle w:val="Heading1"/>
+      </w:pPr>
+      <w:bookmarkStart w:id="3" w:name="_Toc4"/>
+      <w:r>
+        <w:t>Text in Times New Roman</w:t>
+      </w:r>
+      <w:bookmarkEnd w:id="3"/>
+    </w:p>
+    <w:p>
+      <w:r>
+        <w:rPr>
+          <w:rFonts w:ascii="Times New Roman" w:eastAsia="Times New Roman" w:hAnsi="Times New Roman" w:cs="Times New Roman"/>
+          <w:sz w:val="18"/>
+          <w:szCs w:val="18"/>
+        </w:rPr>
+        <w:t xml:space="preserve">measurements and the </w:t>
+      </w:r>
+      <w:proofErr w:type="spellStart"/>
+      <w:r>
+        <w:rPr>
+          <w:rFonts w:ascii="Times New Roman" w:eastAsia="Times New Roman" w:hAnsi="Times New Roman" w:cs="Times New Roman"/>
+          <w:sz w:val="18"/>
+          <w:szCs w:val="18"/>
+        </w:rPr>
+        <w:t>the</w:t>
+      </w:r>
+      <w:proofErr w:type="spellEnd"/>
+      <w:r>
+        <w:rPr>
+          <w:rFonts w:ascii="Times New Roman" w:eastAsia="Times New Roman" w:hAnsi="Times New Roman" w:cs="Times New Roman"/>
+          <w:sz w:val="18"/>
+          <w:szCs w:val="18"/>
+        </w:rPr>
+        <w:t xml:space="preserve"> careful levels of from extraordinarily river times letter seventeen rainfall, crossing a described of the ferry valley measurements and the </w:t>
+      </w:r>
+      <w:proofErr w:type="spellStart"/>
+      <w:r>
+        <w:rPr>
+          <w:rFonts w:ascii="Times New Roman" w:eastAsia="Times New Roman" w:hAnsi="Times New Roman" w:cs="Times New Roman"/>
+          <w:sz w:val="18"/>
+          <w:szCs w:val="18"/>
+        </w:rPr>
+        <w:t>the</w:t>
+      </w:r>
+      <w:proofErr w:type="spellEnd"/>
+      <w:r>
+        <w:rPr>
+          <w:rFonts w:ascii="Times New Roman" w:eastAsia="Times New Roman" w:hAnsi="Times New Roman" w:cs="Times New Roman"/>
+          <w:sz w:val="18"/>
+          <w:szCs w:val="18"/>
+        </w:rPr>
+        <w:t xml:space="preserve"> careful levels of from extraordinarily river times letter seventeen rainfall, crossing a described of the ferry valley measurements and the </w:t>
+      </w:r>
+      <w:proofErr w:type="spellStart"/>
+      <w:r>
+        <w:rPr>
+          <w:rFonts w:ascii="Times New Roman" w:eastAsia="Times New Roman" w:hAnsi="Times New Roman" w:cs="Times New Roman"/>
+          <w:sz w:val="18"/>
+          <w:szCs w:val="18"/>
+        </w:rPr>
+        <w:t>the</w:t>
+      </w:r>
+      <w:proofErr w:type="spellEnd"/>
+      <w:r>
+        <w:rPr>
+          <w:rFonts w:ascii="Times New Roman" w:eastAsia="Times New Roman" w:hAnsi="Times New Roman" w:cs="Times New Roman"/>
+          <w:sz w:val="18"/>
+          <w:szCs w:val="18"/>
+        </w:rPr>
+        <w:t xml:space="preserve"> careful levels of from extraordinarily river times letter seventeen rainfall, crossing a described of the ferry valley measurements and the </w:t>
+      </w:r>
+      <w:proofErr w:type="spellStart"/>
+      <w:r>
+        <w:rPr>
+          <w:rFonts w:ascii="Times New Roman" w:eastAsia="Times New Roman" w:hAnsi="Times New Roman" w:cs="Times New Roman"/>
+          <w:sz w:val="18"/>
+          <w:szCs w:val="18"/>
+        </w:rPr>
+        <w:t>the</w:t>
+      </w:r>
+      <w:proofErr w:type="spellEnd"/>
+      <w:r>
+        <w:rPr>
+          <w:rFonts w:ascii="Times New Roman" w:eastAsia="Times New Roman" w:hAnsi="Times New Roman" w:cs="Times New Roman"/>
+          <w:sz w:val="18"/>
+          <w:szCs w:val="18"/>
+        </w:rPr>
+        <w:t xml:space="preserve"> careful levels of from extraordinarily river times letter seventeen rainfall</w:t>
+      </w:r>
+      <w:r>
+        <w:rPr>
+          <w:rFonts w:ascii="Times New Roman" w:eastAsia="Times New Roman" w:hAnsi="Times New Roman" w:cs="Times New Roman"/>
+          <w:sz w:val="18"/>
+          <w:szCs w:val="18"/>
+        </w:rPr>
+        <w:t>, crossing a described</w:t>
+      </w:r>
+    </w:p>
+    <w:p>
+      <w:r>
+        <w:rPr>
+          <w:rFonts w:ascii="Times New Roman" w:eastAsia="Times New Roman" w:hAnsi="Times New Roman" w:cs="Times New Roman"/>
+        </w:rPr>
+        <w:t xml:space="preserve">river times letter seventeen rainfall, crossing a described of the ferry valley measurements and the </w:t>
+      </w:r>
+      <w:proofErr w:type="spellStart"/>
+      <w:r>
+        <w:rPr>
+          <w:rFonts w:ascii="Times New Roman" w:eastAsia="Times New Roman" w:hAnsi="Times New Roman" w:cs="Times New Roman"/>
+        </w:rPr>
+        <w:t>the</w:t>
+      </w:r>
+      <w:proofErr w:type="spellEnd"/>
+      <w:r>
+        <w:rPr>
+          <w:rFonts w:ascii="Times New Roman" w:eastAsia="Times New Roman" w:hAnsi="Times New Roman" w:cs="Times New Roman"/>
+        </w:rPr>
+        <w:t xml:space="preserve"> careful levels of from extraordinarily river times letter seventeen rainfall, crossing a described of the ferry valley measurements and the </w:t>
+      </w:r>
+      <w:proofErr w:type="spellStart"/>
+      <w:r>
+        <w:rPr>
+          <w:rFonts w:ascii="Times New Roman" w:eastAsia="Times New Roman" w:hAnsi="Times New Roman" w:cs="Times New Roman"/>
+        </w:rPr>
+        <w:t>the</w:t>
+      </w:r>
+      <w:proofErr w:type="spellEnd"/>
+      <w:r>
+        <w:rPr>
+          <w:rFonts w:ascii="Times New Roman" w:eastAsia="Times New Roman" w:hAnsi="Times New Roman" w:cs="Times New Roman"/>
+        </w:rPr>
+        <w:t xml:space="preserve"> careful levels of from extraordinarily river times letter seventeen rainfall, crossing a described of the ferry valley measurements and the </w:t>
+      </w:r>
+      <w:proofErr w:type="spellStart"/>
+      <w:r>
+        <w:rPr>
+          <w:rFonts w:ascii="Times New Roman" w:eastAsia="Times New Roman" w:hAnsi="Times New Roman" w:cs="Times New Roman"/>
+        </w:rPr>
+        <w:t>the</w:t>
+      </w:r>
+      <w:proofErr w:type="spellEnd"/>
+      <w:r>
+        <w:rPr>
+          <w:rFonts w:ascii="Times New Roman" w:eastAsia="Times New Roman" w:hAnsi="Times New Roman" w:cs="Times New Roman"/>
+        </w:rPr>
+        <w:t xml:space="preserve"> careful levels of from extraordinarily river times letter seventeen rainfall, crossing a described of the ferry valley measurements and the </w:t>
+      </w:r>
+      <w:proofErr w:type="spellStart"/>
+      <w:r>
+        <w:rPr>
+          <w:rFonts w:ascii="Times New Roman" w:eastAsia="Times New Roman" w:hAnsi="Times New Roman" w:cs="Times New Roman"/>
+        </w:rPr>
+        <w:t>the</w:t>
+      </w:r>
+      <w:proofErr w:type="spellEnd"/>
+      <w:r>
+        <w:rPr>
+          <w:rFonts w:ascii="Times New Roman" w:eastAsia="Times New Roman" w:hAnsi="Times New Roman" w:cs="Times New Roman"/>
+        </w:rPr>
+        <w:t xml:space="preserve"> careful levels of from extraordinarily river times letter seventeen rainfall</w:t>
+      </w:r>
+      <w:r>
+        <w:rPr>
+          <w:rFonts w:ascii="Times New Roman" w:eastAsia="Times New Roman" w:hAnsi="Times New Roman" w:cs="Times New Roman"/>
+        </w:rPr>
+        <w:t xml:space="preserve">, crossing a described of the ferry valley measurements and the </w:t>
+      </w:r>
+      <w:proofErr w:type="spellStart"/>
+      <w:r>
+        <w:rPr>
+          <w:rFonts w:ascii="Times New Roman" w:eastAsia="Times New Roman" w:hAnsi="Times New Roman" w:cs="Times New Roman"/>
+        </w:rPr>
+        <w:t>the</w:t>
+      </w:r>
+      <w:proofErr w:type="spellEnd"/>
+      <w:r>
+        <w:rPr>
+          <w:rFonts w:ascii="Times New Roman" w:eastAsia="Times New Roman" w:hAnsi="Times New Roman" w:cs="Times New Roman"/>
+        </w:rPr>
+        <w:t xml:space="preserve"> careful levels of from extraordinarily river times letter seventeen rainfall, crossing a described of the ferry valley measurements and the</w:t>
+      </w:r>
+    </w:p>
+    <w:p>
+      <w:r>
+        <w:rPr>
+          <w:rFonts w:ascii="Times New Roman" w:eastAsia="Times New Roman" w:hAnsi="Times New Roman" w:cs="Times New Roman"/>
+          <w:sz w:val="28"/>
+          <w:szCs w:val="28"/>
+        </w:rPr>
+        <w:t xml:space="preserve">the ferry valley measurements and the </w:t>
+      </w:r>
+      <w:proofErr w:type="spellStart"/>
+      <w:r>
+        <w:rPr>
+          <w:rFonts w:ascii="Times New Roman" w:eastAsia="Times New Roman" w:hAnsi="Times New Roman" w:cs="Times New Roman"/>
+          <w:sz w:val="28"/>
+          <w:szCs w:val="28"/>
+        </w:rPr>
+        <w:t>the</w:t>
+      </w:r>
+      <w:proofErr w:type="spellEnd"/>
+      <w:r>
+        <w:rPr>
+          <w:rFonts w:ascii="Times New Roman" w:eastAsia="Times New Roman" w:hAnsi="Times New Roman" w:cs="Times New Roman"/>
+          <w:sz w:val="28"/>
+          <w:szCs w:val="28"/>
+        </w:rPr>
+        <w:t xml:space="preserve"> careful levels of from extraordinarily river times letter seventeen rainfall, crossing a described of the ferry valley measurements and the </w:t>
+      </w:r>
+      <w:proofErr w:type="spellStart"/>
+      <w:r>
+        <w:rPr>
+          <w:rFonts w:ascii="Times New Roman" w:eastAsia="Times New Roman" w:hAnsi="Times New Roman" w:cs="Times New Roman"/>
+          <w:sz w:val="28"/>
+          <w:szCs w:val="28"/>
+        </w:rPr>
+        <w:t>the</w:t>
+      </w:r>
+      <w:proofErr w:type="spellEnd"/>
+      <w:r>
+        <w:rPr>
+          <w:rFonts w:ascii="Times New Roman" w:eastAsia="Times New Roman" w:hAnsi="Times New Roman" w:cs="Times New Roman"/>
+          <w:sz w:val="28"/>
+          <w:szCs w:val="28"/>
+        </w:rPr>
+        <w:t xml:space="preserve"> careful levels of from extraordinarily river times letter seventeen rainfall, crossing a described of the ferry valley measurements and the </w:t>
+      </w:r>
+      <w:proofErr w:type="spellStart"/>
+      <w:r>
+        <w:rPr>
+          <w:rFonts w:ascii="Times New Roman" w:eastAsia="Times New Roman" w:hAnsi="Times New Roman" w:cs="Times New Roman"/>
+          <w:sz w:val="28"/>
+          <w:szCs w:val="28"/>
+        </w:rPr>
+        <w:t>the</w:t>
+      </w:r>
+      <w:proofErr w:type="spellEnd"/>
+      <w:r>
+        <w:rPr>
+          <w:rFonts w:ascii="Times New Roman" w:eastAsia="Times New Roman" w:hAnsi="Times New Roman" w:cs="Times New Roman"/>
+          <w:sz w:val="28"/>
+          <w:szCs w:val="28"/>
+        </w:rPr>
+        <w:t xml:space="preserve"> careful levels of from extraordinarily river times letter seventeen rainfall, crossing a described of the ferry valley measurements and the </w:t>
+      </w:r>
+      <w:proofErr w:type="spellStart"/>
+      <w:r>
+        <w:rPr>
+          <w:rFonts w:ascii="Times New Roman" w:eastAsia="Times New Roman" w:hAnsi="Times New Roman" w:cs="Times New Roman"/>
+          <w:sz w:val="28"/>
+          <w:szCs w:val="28"/>
+        </w:rPr>
+        <w:t>the</w:t>
+      </w:r>
+      <w:proofErr w:type="spellEnd"/>
+      <w:r>
+        <w:rPr>
+          <w:rFonts w:ascii="Times New Roman" w:eastAsia="Times New Roman" w:hAnsi="Times New Roman" w:cs="Times New Roman"/>
+          <w:sz w:val="28"/>
+          <w:szCs w:val="28"/>
+        </w:rPr>
+        <w:t xml:space="preserve"> careful levels of from extraordinarily river times letter seventeen rainfall</w:t>
+      </w:r>
+      <w:r>
+        <w:rPr>
+          <w:rFonts w:ascii="Times New Roman" w:eastAsia="Times New Roman" w:hAnsi="Times New Roman" w:cs="Times New Roman"/>
+          <w:sz w:val="28"/>
+          <w:szCs w:val="28"/>
+        </w:rPr>
+        <w:t xml:space="preserve">, crossing a described of the ferry valley measurements and the </w:t>
+      </w:r>
+      <w:proofErr w:type="spellStart"/>
+      <w:r>
+        <w:rPr>
+          <w:rFonts w:ascii="Times New Roman" w:eastAsia="Times New Roman" w:hAnsi="Times New Roman" w:cs="Times New Roman"/>
+          <w:sz w:val="28"/>
+          <w:szCs w:val="28"/>
+        </w:rPr>
+        <w:t>the</w:t>
+      </w:r>
+      <w:proofErr w:type="spellEnd"/>
+      <w:r>
+        <w:rPr>
+          <w:rFonts w:ascii="Times New Roman" w:eastAsia="Times New Roman" w:hAnsi="Times New Roman" w:cs="Times New Roman"/>
+          <w:sz w:val="28"/>
+          <w:szCs w:val="28"/>
+        </w:rPr>
+        <w:t xml:space="preserve"> careful levels of from extraordinarily river times letter seventeen rainfall, crossing a described of the ferry valley measurements and the </w:t>
+      </w:r>
+      <w:proofErr w:type="spellStart"/>
+      <w:r>
+        <w:rPr>
+          <w:rFonts w:ascii="Times New Roman" w:eastAsia="Times New Roman" w:hAnsi="Times New Roman" w:cs="Times New Roman"/>
+          <w:sz w:val="28"/>
+          <w:szCs w:val="28"/>
+        </w:rPr>
+        <w:t>the</w:t>
+      </w:r>
+      <w:proofErr w:type="spellEnd"/>
+      <w:r>
+        <w:rPr>
+          <w:rFonts w:ascii="Times New Roman" w:eastAsia="Times New Roman" w:hAnsi="Times New Roman" w:cs="Times New Roman"/>
+          <w:sz w:val="28"/>
+          <w:szCs w:val="28"/>
+        </w:rPr>
+        <w:t xml:space="preserve"> careful levels of from extraordinarily river times letter seventeen rainfall, crossing a described of the ferry valley measurements and the </w:t>
+      </w:r>
+      <w:proofErr w:type="spellStart"/>
+      <w:r>
+        <w:rPr>
+          <w:rFonts w:ascii="Times New Roman" w:eastAsia="Times New Roman" w:hAnsi="Times New Roman" w:cs="Times New Roman"/>
+          <w:sz w:val="28"/>
+          <w:szCs w:val="28"/>
+        </w:rPr>
+        <w:t>the</w:t>
+      </w:r>
+      <w:proofErr w:type="spellEnd"/>
+      <w:r>
+        <w:rPr>
+          <w:rFonts w:ascii="Times New Roman" w:eastAsia="Times New Roman" w:hAnsi="Times New Roman" w:cs="Times New Roman"/>
+          <w:sz w:val="28"/>
+          <w:szCs w:val="28"/>
+        </w:rPr>
+        <w:t xml:space="preserve"> careful levels of from extraordinarily river times letter seventeen rainfall, crossing a described of the ferry valley measurements and the </w:t>
+      </w:r>
+      <w:proofErr w:type="spellStart"/>
+      <w:r>
+        <w:rPr>
+          <w:rFonts w:ascii="Times New Roman" w:eastAsia="Times New Roman" w:hAnsi="Times New Roman" w:cs="Times New Roman"/>
+          <w:sz w:val="28"/>
+          <w:szCs w:val="28"/>
+        </w:rPr>
+        <w:t>the</w:t>
+      </w:r>
+      <w:proofErr w:type="spellEnd"/>
+      <w:r>
+        <w:rPr>
+          <w:rFonts w:ascii="Times New Roman" w:eastAsia="Times New Roman" w:hAnsi="Times New Roman" w:cs="Times New Roman"/>
+          <w:sz w:val="28"/>
+          <w:szCs w:val="28"/>
+        </w:rPr>
+        <w:t xml:space="preserve"> careful leve</w:t>
+      </w:r>
+      <w:r>
+        <w:rPr>
+          <w:rFonts w:ascii="Times New Roman" w:eastAsia="Times New Roman" w:hAnsi="Times New Roman" w:cs="Times New Roman"/>
+          <w:sz w:val="28"/>
+          <w:szCs w:val="28"/>
+        </w:rPr>
+        <w:t>ls of from extraordinarily river</w:t>
+      </w:r>
+    </w:p>
+    <w:p>
+      <w:r>
+        <w:rPr>
+          <w:rFonts w:ascii="Times New Roman" w:eastAsia="Times New Roman" w:hAnsi="Times New Roman" w:cs="Times New Roman"/>
+          <w:b/>
+          <w:bCs/>
+        </w:rPr>
+        <w:t xml:space="preserve">of from extraordinarily river times letter seventeen rainfall, crossing a described of the ferry valley measurements and the </w:t>
+      </w:r>
+      <w:proofErr w:type="spellStart"/>
+      <w:r>
+        <w:rPr>
+          <w:rFonts w:ascii="Times New Roman" w:eastAsia="Times New Roman" w:hAnsi="Times New Roman" w:cs="Times New Roman"/>
+          <w:b/>
+          <w:bCs/>
+        </w:rPr>
+        <w:t>the</w:t>
+      </w:r>
+      <w:proofErr w:type="spellEnd"/>
+      <w:r>
+        <w:rPr>
+          <w:rFonts w:ascii="Times New Roman" w:eastAsia="Times New Roman" w:hAnsi="Times New Roman" w:cs="Times New Roman"/>
+          <w:b/>
+          <w:bCs/>
+        </w:rPr>
+        <w:t xml:space="preserve"> careful levels of from extraordinarily river times letter seventeen rainfall, crossing a described of the ferry valley measurements and the </w:t>
+      </w:r>
+      <w:proofErr w:type="spellStart"/>
+      <w:r>
+        <w:rPr>
+          <w:rFonts w:ascii="Times New Roman" w:eastAsia="Times New Roman" w:hAnsi="Times New Roman" w:cs="Times New Roman"/>
+          <w:b/>
+          <w:bCs/>
+        </w:rPr>
+        <w:t>the</w:t>
+      </w:r>
+      <w:proofErr w:type="spellEnd"/>
+      <w:r>
+        <w:rPr>
+          <w:rFonts w:ascii="Times New Roman" w:eastAsia="Times New Roman" w:hAnsi="Times New Roman" w:cs="Times New Roman"/>
+          <w:b/>
+          <w:bCs/>
+        </w:rPr>
+        <w:t xml:space="preserve"> careful levels of from extraordinarily river times letter seventeen rainfall, crossing a described of the ferry valley measurements and the </w:t>
+      </w:r>
+      <w:proofErr w:type="spellStart"/>
+      <w:r>
+        <w:rPr>
+          <w:rFonts w:ascii="Times New Roman" w:eastAsia="Times New Roman" w:hAnsi="Times New Roman" w:cs="Times New Roman"/>
+          <w:b/>
+          <w:bCs/>
+        </w:rPr>
+        <w:t>the</w:t>
+      </w:r>
+      <w:proofErr w:type="spellEnd"/>
+      <w:r>
+        <w:rPr>
+          <w:rFonts w:ascii="Times New Roman" w:eastAsia="Times New Roman" w:hAnsi="Times New Roman" w:cs="Times New Roman"/>
+          <w:b/>
+          <w:bCs/>
+        </w:rPr>
+        <w:t xml:space="preserve"> careful levels of from extraordinarily river times letter seventeen rainfall, crossing a described of the ferry valley measurements and the </w:t>
+      </w:r>
+      <w:proofErr w:type="spellStart"/>
+      <w:r>
+        <w:rPr>
+          <w:rFonts w:ascii="Times New Roman" w:eastAsia="Times New Roman" w:hAnsi="Times New Roman" w:cs="Times New Roman"/>
+          <w:b/>
+          <w:bCs/>
+        </w:rPr>
+        <w:t>the</w:t>
+      </w:r>
+      <w:proofErr w:type="spellEnd"/>
+      <w:r>
+        <w:rPr>
+          <w:rFonts w:ascii="Times New Roman" w:eastAsia="Times New Roman" w:hAnsi="Times New Roman" w:cs="Times New Roman"/>
+          <w:b/>
+          <w:bCs/>
+        </w:rPr>
+        <w:t xml:space="preserve"> careful levels of from extraordinarily river times letter seventeen rainfall</w:t>
+      </w:r>
+      <w:r>
+        <w:rPr>
+          <w:rFonts w:ascii="Times New Roman" w:eastAsia="Times New Roman" w:hAnsi="Times New Roman" w:cs="Times New Roman"/>
+          <w:b/>
+          <w:bCs/>
+        </w:rPr>
+        <w:t>, crossing a described of the ferry valley measurements</w:t>
+      </w:r>
+    </w:p>
+    <w:p>
+      <w:pPr>
+        <w:pStyle w:val="Heading1"/>
+      </w:pPr>
+      <w:bookmarkStart w:id="4" w:name="_Toc5"/>
+      <w:r>
+        <w:t>Text in Courier New</w:t>
+      </w:r>
+      <w:bookmarkEnd w:id="4"/>
+    </w:p>
+    <w:p>
+      <w:r>
+        <w:rPr>
+          <w:rFonts w:ascii="Courier New" w:eastAsia="Courier New" w:hAnsi="Courier New" w:cs="Courier New"/>
+          <w:sz w:val="18"/>
+          <w:szCs w:val="18"/>
+        </w:rPr>
+        <w:t xml:space="preserve">river times letter seventeen rainfall, crossing a described of the ferry valley measurements and the </w:t>
+      </w:r>
+      <w:proofErr w:type="spellStart"/>
+      <w:r>
+        <w:rPr>
+          <w:rFonts w:ascii="Courier New" w:eastAsia="Courier New" w:hAnsi="Courier New" w:cs="Courier New"/>
+          <w:sz w:val="18"/>
+          <w:szCs w:val="18"/>
+        </w:rPr>
+        <w:t>the</w:t>
+      </w:r>
+      <w:proofErr w:type="spellEnd"/>
+      <w:r>
+        <w:rPr>
+          <w:rFonts w:ascii="Courier New" w:eastAsia="Courier New" w:hAnsi="Courier New" w:cs="Courier New"/>
+          <w:sz w:val="18"/>
+          <w:szCs w:val="18"/>
+        </w:rPr>
+        <w:t xml:space="preserve"> careful levels of from extraordinarily river times letter </w:t>
+      </w:r>
+      <w:r>
+        <w:rPr>
+          <w:rFonts w:ascii="Courier New" w:eastAsia="Courier New" w:hAnsi="Courier New" w:cs="Courier New"/>
+          <w:sz w:val="18"/>
+          <w:szCs w:val="18"/>
+        </w:rPr>
+        <w:lastRenderedPageBreak/>
+        <w:t xml:space="preserve">seventeen rainfall, crossing a described of the ferry valley measurements and the </w:t>
+      </w:r>
+      <w:proofErr w:type="spellStart"/>
+      <w:r>
+        <w:rPr>
+          <w:rFonts w:ascii="Courier New" w:eastAsia="Courier New" w:hAnsi="Courier New" w:cs="Courier New"/>
+          <w:sz w:val="18"/>
+          <w:szCs w:val="18"/>
+        </w:rPr>
+        <w:t>the</w:t>
+      </w:r>
+      <w:proofErr w:type="spellEnd"/>
+      <w:r>
+        <w:rPr>
+          <w:rFonts w:ascii="Courier New" w:eastAsia="Courier New" w:hAnsi="Courier New" w:cs="Courier New"/>
+          <w:sz w:val="18"/>
+          <w:szCs w:val="18"/>
+        </w:rPr>
+        <w:t xml:space="preserve"> careful levels of from extraordinarily river times letter seventeen rainfall, crossing a described of the ferry valley measurements and the </w:t>
+      </w:r>
+      <w:proofErr w:type="spellStart"/>
+      <w:r>
+        <w:rPr>
+          <w:rFonts w:ascii="Courier New" w:eastAsia="Courier New" w:hAnsi="Courier New" w:cs="Courier New"/>
+          <w:sz w:val="18"/>
+          <w:szCs w:val="18"/>
+        </w:rPr>
+        <w:t>the</w:t>
+      </w:r>
+      <w:proofErr w:type="spellEnd"/>
+      <w:r>
+        <w:rPr>
+          <w:rFonts w:ascii="Courier New" w:eastAsia="Courier New" w:hAnsi="Courier New" w:cs="Courier New"/>
+          <w:sz w:val="18"/>
+          <w:szCs w:val="18"/>
+        </w:rPr>
+        <w:t xml:space="preserve"> careful levels of from extraordinarily river times letter seventeen rainfall, crossing a described of the ferry valley measurements and the </w:t>
+      </w:r>
+      <w:proofErr w:type="spellStart"/>
+      <w:r>
+        <w:rPr>
+          <w:rFonts w:ascii="Courier New" w:eastAsia="Courier New" w:hAnsi="Courier New" w:cs="Courier New"/>
+          <w:sz w:val="18"/>
+          <w:szCs w:val="18"/>
+        </w:rPr>
+        <w:t>the</w:t>
+      </w:r>
+      <w:proofErr w:type="spellEnd"/>
+      <w:r>
+        <w:rPr>
+          <w:rFonts w:ascii="Courier New" w:eastAsia="Courier New" w:hAnsi="Courier New" w:cs="Courier New"/>
+          <w:sz w:val="18"/>
+          <w:szCs w:val="18"/>
+        </w:rPr>
+        <w:t xml:space="preserve"> careful</w:t>
+      </w:r>
+    </w:p>
+    <w:p>
+      <w:r>
+        <w:rPr>
+          <w:rFonts w:ascii="Courier New" w:eastAsia="Courier New" w:hAnsi="Courier New" w:cs="Courier New"/>
+        </w:rPr>
+        <w:t xml:space="preserve">the ferry valley measurements and the </w:t>
+      </w:r>
+      <w:proofErr w:type="spellStart"/>
+      <w:r>
+        <w:rPr>
+          <w:rFonts w:ascii="Courier New" w:eastAsia="Courier New" w:hAnsi="Courier New" w:cs="Courier New"/>
+        </w:rPr>
+        <w:t>the</w:t>
+      </w:r>
+      <w:proofErr w:type="spellEnd"/>
+      <w:r>
+        <w:rPr>
+          <w:rFonts w:ascii="Courier New" w:eastAsia="Courier New" w:hAnsi="Courier New" w:cs="Courier New"/>
+        </w:rPr>
+        <w:t xml:space="preserve"> careful levels of from extraordinarily river times letter seventeen rainfall, crossing a described of the ferry valley measurements and the </w:t>
+      </w:r>
+      <w:proofErr w:type="spellStart"/>
+      <w:r>
+        <w:rPr>
+          <w:rFonts w:ascii="Courier New" w:eastAsia="Courier New" w:hAnsi="Courier New" w:cs="Courier New"/>
+        </w:rPr>
+        <w:t>the</w:t>
+      </w:r>
+      <w:proofErr w:type="spellEnd"/>
+      <w:r>
+        <w:rPr>
+          <w:rFonts w:ascii="Courier New" w:eastAsia="Courier New" w:hAnsi="Courier New" w:cs="Courier New"/>
+        </w:rPr>
+        <w:t xml:space="preserve"> careful levels of from extraordinarily river times letter seventeen rainfall, crossing a described of the ferry valley measurements and the </w:t>
+      </w:r>
+      <w:proofErr w:type="spellStart"/>
+      <w:r>
+        <w:rPr>
+          <w:rFonts w:ascii="Courier New" w:eastAsia="Courier New" w:hAnsi="Courier New" w:cs="Courier New"/>
+        </w:rPr>
+        <w:t>the</w:t>
+      </w:r>
+      <w:proofErr w:type="spellEnd"/>
+      <w:r>
+        <w:rPr>
+          <w:rFonts w:ascii="Courier New" w:eastAsia="Courier New" w:hAnsi="Courier New" w:cs="Courier New"/>
+        </w:rPr>
+        <w:t xml:space="preserve"> careful levels of from extraordinarily river times letter seventeen rainfall, crossing a described of the ferry valley measurements and the </w:t>
+      </w:r>
+      <w:proofErr w:type="spellStart"/>
+      <w:r>
+        <w:rPr>
+          <w:rFonts w:ascii="Courier New" w:eastAsia="Courier New" w:hAnsi="Courier New" w:cs="Courier New"/>
+        </w:rPr>
+        <w:t>the</w:t>
+      </w:r>
+      <w:proofErr w:type="spellEnd"/>
+      <w:r>
+        <w:rPr>
+          <w:rFonts w:ascii="Courier New" w:eastAsia="Courier New" w:hAnsi="Courier New" w:cs="Courier New"/>
+        </w:rPr>
+        <w:t xml:space="preserve"> careful levels of from extraordinarily river times letter seventeen rainfall</w:t>
+      </w:r>
+      <w:r>
+        <w:rPr>
+          <w:rFonts w:ascii="Courier New" w:eastAsia="Courier New" w:hAnsi="Courier New" w:cs="Courier New"/>
+        </w:rPr>
+        <w:t xml:space="preserve">, crossing a described of the ferry valley measurements and the </w:t>
+      </w:r>
+      <w:proofErr w:type="spellStart"/>
+      <w:r>
+        <w:rPr>
+          <w:rFonts w:ascii="Courier New" w:eastAsia="Courier New" w:hAnsi="Courier New" w:cs="Courier New"/>
+        </w:rPr>
+        <w:t>the</w:t>
+      </w:r>
+      <w:proofErr w:type="spellEnd"/>
+      <w:r>
+        <w:rPr>
+          <w:rFonts w:ascii="Courier New" w:eastAsia="Courier New" w:hAnsi="Courier New" w:cs="Courier New"/>
+        </w:rPr>
+        <w:t xml:space="preserve"> careful levels of from extraordinarily river times letter seventeen rainfall, crossing a described of the ferry valley measurements and the </w:t>
+      </w:r>
+      <w:proofErr w:type="spellStart"/>
+      <w:r>
+        <w:rPr>
+          <w:rFonts w:ascii="Courier New" w:eastAsia="Courier New" w:hAnsi="Courier New" w:cs="Courier New"/>
+        </w:rPr>
+        <w:t>the</w:t>
+      </w:r>
+      <w:proofErr w:type="spellEnd"/>
+      <w:r>
+        <w:rPr>
+          <w:rFonts w:ascii="Courier New" w:eastAsia="Courier New" w:hAnsi="Courier New" w:cs="Courier New"/>
+        </w:rPr>
+        <w:t xml:space="preserve"> careful levels of from extraordinarily river times letter</w:t>
+      </w:r>
+    </w:p>
+    <w:p>
+      <w:r>
+        <w:rPr>
+          <w:rFonts w:ascii="Courier New" w:eastAsia="Courier New" w:hAnsi="Courier New" w:cs="Courier New"/>
+          <w:sz w:val="28"/>
+          <w:szCs w:val="28"/>
+        </w:rPr>
+        <w:t xml:space="preserve">of from extraordinarily river times letter seventeen rainfall, crossing a described of the ferry valley measurements and the </w:t>
+      </w:r>
+      <w:proofErr w:type="spellStart"/>
+      <w:r>
+        <w:rPr>
+          <w:rFonts w:ascii="Courier New" w:eastAsia="Courier New" w:hAnsi="Courier New" w:cs="Courier New"/>
+          <w:sz w:val="28"/>
+          <w:szCs w:val="28"/>
+        </w:rPr>
+        <w:t>the</w:t>
+      </w:r>
+      <w:proofErr w:type="spellEnd"/>
+      <w:r>
+        <w:rPr>
+          <w:rFonts w:ascii="Courier New" w:eastAsia="Courier New" w:hAnsi="Courier New" w:cs="Courier New"/>
+          <w:sz w:val="28"/>
+          <w:szCs w:val="28"/>
+        </w:rPr>
+        <w:t xml:space="preserve"> careful levels of from extraordinarily river times letter seventeen rainfall, crossing a described of the ferry valley measurements and the </w:t>
+      </w:r>
+      <w:proofErr w:type="spellStart"/>
+      <w:r>
+        <w:rPr>
+          <w:rFonts w:ascii="Courier New" w:eastAsia="Courier New" w:hAnsi="Courier New" w:cs="Courier New"/>
+          <w:sz w:val="28"/>
+          <w:szCs w:val="28"/>
+        </w:rPr>
+        <w:t>the</w:t>
+      </w:r>
+      <w:proofErr w:type="spellEnd"/>
+      <w:r>
+        <w:rPr>
+          <w:rFonts w:ascii="Courier New" w:eastAsia="Courier New" w:hAnsi="Courier New" w:cs="Courier New"/>
+          <w:sz w:val="28"/>
+          <w:szCs w:val="28"/>
+        </w:rPr>
+        <w:t xml:space="preserve"> careful levels of from extraordinarily river times letter seventeen rainfall, crossing a described of the ferry valley measurements and the </w:t>
+      </w:r>
+      <w:proofErr w:type="spellStart"/>
+      <w:r>
+        <w:rPr>
+          <w:rFonts w:ascii="Courier New" w:eastAsia="Courier New" w:hAnsi="Courier New" w:cs="Courier New"/>
+          <w:sz w:val="28"/>
+          <w:szCs w:val="28"/>
+        </w:rPr>
+        <w:t>the</w:t>
+      </w:r>
+      <w:proofErr w:type="spellEnd"/>
+      <w:r>
+        <w:rPr>
+          <w:rFonts w:ascii="Courier New" w:eastAsia="Courier New" w:hAnsi="Courier New" w:cs="Courier New"/>
+          <w:sz w:val="28"/>
+          <w:szCs w:val="28"/>
+        </w:rPr>
+        <w:t xml:space="preserve"> careful levels of from extraordinarily river times letter seventeen rainfall, crossing a described of the ferry valley measurements and the </w:t>
+      </w:r>
+      <w:proofErr w:type="spellStart"/>
+      <w:r>
+        <w:rPr>
+          <w:rFonts w:ascii="Courier New" w:eastAsia="Courier New" w:hAnsi="Courier New" w:cs="Courier New"/>
+          <w:sz w:val="28"/>
+          <w:szCs w:val="28"/>
+        </w:rPr>
+        <w:t>the</w:t>
+      </w:r>
+      <w:proofErr w:type="spellEnd"/>
+      <w:r>
+        <w:rPr>
+          <w:rFonts w:ascii="Courier New" w:eastAsia="Courier New" w:hAnsi="Courier New" w:cs="Courier New"/>
+          <w:sz w:val="28"/>
+          <w:szCs w:val="28"/>
+        </w:rPr>
+        <w:t xml:space="preserve"> careful levels of from extraordinarily river times letter seventeen rainfall</w:t>
+      </w:r>
+      <w:r>
+        <w:rPr>
+          <w:rFonts w:ascii="Courier New" w:eastAsia="Courier New" w:hAnsi="Courier New" w:cs="Courier New"/>
+          <w:sz w:val="28"/>
+          <w:szCs w:val="28"/>
+        </w:rPr>
+        <w:t xml:space="preserve">, crossing a described of the ferry valley measurements and the </w:t>
+      </w:r>
+      <w:proofErr w:type="spellStart"/>
+      <w:r>
+        <w:rPr>
+          <w:rFonts w:ascii="Courier New" w:eastAsia="Courier New" w:hAnsi="Courier New" w:cs="Courier New"/>
+          <w:sz w:val="28"/>
+          <w:szCs w:val="28"/>
+        </w:rPr>
+        <w:t>the</w:t>
+      </w:r>
+      <w:proofErr w:type="spellEnd"/>
+      <w:r>
+        <w:rPr>
+          <w:rFonts w:ascii="Courier New" w:eastAsia="Courier New" w:hAnsi="Courier New" w:cs="Courier New"/>
+          <w:sz w:val="28"/>
+          <w:szCs w:val="28"/>
+        </w:rPr>
+        <w:t xml:space="preserve"> careful levels of from extraordinarily river times letter seventeen rainfall, crossing a described of the ferry valley measurements and the </w:t>
+      </w:r>
+      <w:proofErr w:type="spellStart"/>
+      <w:r>
+        <w:rPr>
+          <w:rFonts w:ascii="Courier New" w:eastAsia="Courier New" w:hAnsi="Courier New" w:cs="Courier New"/>
+          <w:sz w:val="28"/>
+          <w:szCs w:val="28"/>
+        </w:rPr>
+        <w:t>the</w:t>
+      </w:r>
+      <w:proofErr w:type="spellEnd"/>
+      <w:r>
+        <w:rPr>
+          <w:rFonts w:ascii="Courier New" w:eastAsia="Courier New" w:hAnsi="Courier New" w:cs="Courier New"/>
+          <w:sz w:val="28"/>
+          <w:szCs w:val="28"/>
+        </w:rPr>
+        <w:t xml:space="preserve"> careful levels of from extraordinarily river times letter seventeen rainfall, crossing a described of the ferry valley measurements and the </w:t>
+      </w:r>
+      <w:proofErr w:type="spellStart"/>
+      <w:r>
+        <w:rPr>
+          <w:rFonts w:ascii="Courier New" w:eastAsia="Courier New" w:hAnsi="Courier New" w:cs="Courier New"/>
+          <w:sz w:val="28"/>
+          <w:szCs w:val="28"/>
+        </w:rPr>
+        <w:t>the</w:t>
+      </w:r>
+      <w:proofErr w:type="spellEnd"/>
+      <w:r>
+        <w:rPr>
+          <w:rFonts w:ascii="Courier New" w:eastAsia="Courier New" w:hAnsi="Courier New" w:cs="Courier New"/>
+          <w:sz w:val="28"/>
+          <w:szCs w:val="28"/>
+        </w:rPr>
+        <w:t xml:space="preserve"> careful levels of from extraordinarily river times letter seventeen rainfall, crossing a described of the</w:t>
+      </w:r>
+    </w:p>
+    <w:p>
+      <w:r>
+        <w:rPr>
+          <w:rFonts w:ascii="Courier New" w:eastAsia="Courier New" w:hAnsi="Courier New" w:cs="Courier New"/>
+          <w:b/>
+          <w:bCs/>
+        </w:rPr>
+        <w:t xml:space="preserve">the careful levels of from extraordinarily river times letter seventeen rainfall, crossing a described of the ferry valley measurements and the </w:t>
+      </w:r>
+      <w:proofErr w:type="spellStart"/>
+      <w:r>
+        <w:rPr>
+          <w:rFonts w:ascii="Courier New" w:eastAsia="Courier New" w:hAnsi="Courier New" w:cs="Courier New"/>
+          <w:b/>
+          <w:bCs/>
+        </w:rPr>
+        <w:t>the</w:t>
+      </w:r>
+      <w:proofErr w:type="spellEnd"/>
+      <w:r>
+        <w:rPr>
+          <w:rFonts w:ascii="Courier New" w:eastAsia="Courier New" w:hAnsi="Courier New" w:cs="Courier New"/>
+          <w:b/>
+          <w:bCs/>
+        </w:rPr>
+        <w:t xml:space="preserve"> careful levels of from extraordinarily </w:t>
+      </w:r>
+      <w:r>
+        <w:rPr>
+          <w:rFonts w:ascii="Courier New" w:eastAsia="Courier New" w:hAnsi="Courier New" w:cs="Courier New"/>
+          <w:b/>
+          <w:bCs/>
+        </w:rPr>
+        <w:lastRenderedPageBreak/>
+        <w:t xml:space="preserve">river times letter seventeen rainfall, crossing a described of the ferry valley measurements and the </w:t>
+      </w:r>
+      <w:proofErr w:type="spellStart"/>
+      <w:r>
+        <w:rPr>
+          <w:rFonts w:ascii="Courier New" w:eastAsia="Courier New" w:hAnsi="Courier New" w:cs="Courier New"/>
+          <w:b/>
+          <w:bCs/>
+        </w:rPr>
+        <w:t>the</w:t>
+      </w:r>
+      <w:proofErr w:type="spellEnd"/>
+      <w:r>
+        <w:rPr>
+          <w:rFonts w:ascii="Courier New" w:eastAsia="Courier New" w:hAnsi="Courier New" w:cs="Courier New"/>
+          <w:b/>
+          <w:bCs/>
+        </w:rPr>
+        <w:t xml:space="preserve"> careful levels of from extraordinarily river times letter seventeen rainfall, crossing a described of the ferry valley measurements and the </w:t>
+      </w:r>
+      <w:proofErr w:type="spellStart"/>
+      <w:r>
+        <w:rPr>
+          <w:rFonts w:ascii="Courier New" w:eastAsia="Courier New" w:hAnsi="Courier New" w:cs="Courier New"/>
+          <w:b/>
+          <w:bCs/>
+        </w:rPr>
+        <w:t>the</w:t>
+      </w:r>
+      <w:proofErr w:type="spellEnd"/>
+      <w:r>
+        <w:rPr>
+          <w:rFonts w:ascii="Courier New" w:eastAsia="Courier New" w:hAnsi="Courier New" w:cs="Courier New"/>
+          <w:b/>
+          <w:bCs/>
+        </w:rPr>
+        <w:t xml:space="preserve"> careful levels of from extraordinarily river times letter seventeen rainfall, crossing a described of the ferry valley measurements and the </w:t>
+      </w:r>
+      <w:proofErr w:type="spellStart"/>
+      <w:r>
+        <w:rPr>
+          <w:rFonts w:ascii="Courier New" w:eastAsia="Courier New" w:hAnsi="Courier New" w:cs="Courier New"/>
+          <w:b/>
+          <w:bCs/>
+        </w:rPr>
+        <w:t>the</w:t>
+      </w:r>
+      <w:proofErr w:type="spellEnd"/>
+      <w:r>
+        <w:rPr>
+          <w:rFonts w:ascii="Courier New" w:eastAsia="Courier New" w:hAnsi="Courier New" w:cs="Courier New"/>
+          <w:b/>
+          <w:bCs/>
+        </w:rPr>
+        <w:t xml:space="preserve"> careful levels of from extraordinarily river times letter seventeen rainfall</w:t>
+      </w:r>
+      <w:r>
+        <w:rPr>
+          <w:rFonts w:ascii="Courier New" w:eastAsia="Courier New" w:hAnsi="Courier New" w:cs="Courier New"/>
+          <w:b/>
+          <w:bCs/>
+        </w:rPr>
+        <w:t>, crossing a described of the</w:t>
+      </w:r>
+    </w:p>
+    <w:p>
+      <w:pPr>
+        <w:pStyle w:val="Heading1"/>
+      </w:pPr>
       <w:bookmarkStart w:id="5" w:name="_Toc6"/>
       <w:r>
         <w:t>Line spacing</w:t>
@@ -639,7 +2522,66 @@
         <w:spacing w:line="360" w:lineRule="auto"/>
       </w:pPr>
       <w:r>
-        <w:t>the careful levels of from extraordinarily river times letter seventeen rainfall, crossing a described of the ferry valley measurements and the the careful levels of from extraordinarily river times letter seventeen rainfall, crossing a described of the ferry valley measurements and the the careful levels of from extraordinarily river times letter seventeen rainfall, crossing a described of the ferry valley measurements and the the careful levels of from extraordinarily river times letter seventeen rainfall, crossing a described of the ferry valley measurements and the the careful levels of from extraordinarily river times letter seventeen rainfall, crossing a described of the ferry valley measurements and the the careful levels of from extraordinarily river times letter seventeen rainfall, crossing a described of the ferry valley measurements and the the careful levels of from extraordinarily river times letter seventeen rainfall, crossing a described of the ferry valley measurements and the the careful levels of from extraordinarily river times letter seventeen rainfall, crossing a</w:t>
+        <w:t xml:space="preserve">the careful levels of from extraordinarily river times letter seventeen rainfall, crossing a described of the ferry valley measurements and the </w:t>
+      </w:r>
+      <w:proofErr w:type="spellStart"/>
+      <w:r>
+        <w:t>the</w:t>
+      </w:r>
+      <w:proofErr w:type="spellEnd"/>
+      <w:r>
+        <w:t xml:space="preserve"> careful levels of from extraordinarily river times letter seventeen rainfall, crossing a described of the ferry valley measurements and the </w:t>
+      </w:r>
+      <w:proofErr w:type="spellStart"/>
+      <w:r>
+        <w:t>the</w:t>
+      </w:r>
+      <w:proofErr w:type="spellEnd"/>
+      <w:r>
+        <w:t xml:space="preserve"> careful levels of from extraordinarily river times letter seventeen rainfall, crossing a described of the ferry valley measurements and the </w:t>
+      </w:r>
+      <w:proofErr w:type="spellStart"/>
+      <w:r>
+        <w:t>the</w:t>
+      </w:r>
+      <w:proofErr w:type="spellEnd"/>
+      <w:r>
+        <w:t xml:space="preserve"> careful levels of from extraordinarily river times letter seventeen rainfall, crossing a described of the ferry valley measurements and the </w:t>
+      </w:r>
+      <w:proofErr w:type="spellStart"/>
+      <w:r>
+        <w:t>the</w:t>
+      </w:r>
+      <w:proofErr w:type="spellEnd"/>
+      <w:r>
+        <w:t xml:space="preserve"> careful levels of from extraordinarily river times letter seventeen rainfall</w:t>
+      </w:r>
+      <w:r>
+        <w:t xml:space="preserve">, crossing a described of the ferry valley measurements and the </w:t>
+      </w:r>
+      <w:proofErr w:type="spellStart"/>
+      <w:r>
+        <w:t>the</w:t>
+      </w:r>
+      <w:proofErr w:type="spellEnd"/>
+      <w:r>
+        <w:t xml:space="preserve"> careful levels of from extraordinarily river times letter seventeen rainfall, crossing a described of the ferry valley measurements and the </w:t>
+      </w:r>
+      <w:proofErr w:type="spellStart"/>
+      <w:r>
+        <w:t>the</w:t>
+      </w:r>
+      <w:proofErr w:type="spellEnd"/>
+      <w:r>
+        <w:t xml:space="preserve"> careful levels of from extraordinarily river times letter seventeen rainfall, crossing a described of the ferry valley measurements and the </w:t>
+      </w:r>
+      <w:proofErr w:type="spellStart"/>
+      <w:r>
+        <w:t>the</w:t>
+      </w:r>
+      <w:proofErr w:type="spellEnd"/>
+      <w:r>
+        <w:t xml:space="preserve"> careful levels of from extraordinarily river times letter seventeen rainfall, crossing a</w:t>
       </w:r>
     </w:p>
     <w:p>
@@ -647,7 +2589,58 @@
         <w:spacing w:line="480" w:lineRule="auto"/>
       </w:pPr>
       <w:r>
-        <w:t>seventeen rainfall, crossing a described of the ferry valley measurements and the the careful levels of from extraordinarily river times letter seventeen rainfall, crossing a described of the ferry valley measurements and the the careful levels of from extraordinarily river times letter seventeen rainfall, crossing a described of the ferry valley measurements and the the careful levels of from extraordinarily river times letter seventeen rainfall, crossing a described of the ferry valley measurements and the the careful levels of from extraordinarily river times letter seventeen rainfall, crossing a described of the ferry valley measurements and the the careful levels of from extraordinarily river times letter seventeen rainfall, crossing a described of the ferry valley measurements and the the careful levels</w:t>
+        <w:t xml:space="preserve">seventeen rainfall, crossing a described of the ferry valley measurements and the </w:t>
+      </w:r>
+      <w:proofErr w:type="spellStart"/>
+      <w:r>
+        <w:t>the</w:t>
+      </w:r>
+      <w:proofErr w:type="spellEnd"/>
+      <w:r>
+        <w:t xml:space="preserve"> careful levels of from extraordinarily river times letter seventeen rainfall, crossing a described of the ferry valley measurements and the </w:t>
+      </w:r>
+      <w:proofErr w:type="spellStart"/>
+      <w:r>
+        <w:t>the</w:t>
+      </w:r>
+      <w:proofErr w:type="spellEnd"/>
+      <w:r>
+        <w:t xml:space="preserve"> careful levels of from extraordinarily river times letter seventeen rainfall, crossing a described of the ferry valley measurements and the </w:t>
+      </w:r>
+      <w:proofErr w:type="spellStart"/>
+      <w:r>
+        <w:t>the</w:t>
+      </w:r>
+      <w:proofErr w:type="spellEnd"/>
+      <w:r>
+        <w:t xml:space="preserve"> careful levels of from extraordinarily river times letter seventeen rainfall, crossing a described of the ferry valley measurements and the </w:t>
+      </w:r>
+      <w:proofErr w:type="spellStart"/>
+      <w:r>
+        <w:t>the</w:t>
+      </w:r>
+      <w:proofErr w:type="spellEnd"/>
+      <w:r>
+        <w:t xml:space="preserve"> careful levels of from extraordinarily river times letter seventeen rainfall</w:t>
+      </w:r>
+      <w:r>
+        <w:t xml:space="preserve">, crossing a described of the ferry valley measurements and the </w:t>
+      </w:r>
+      <w:proofErr w:type="spellStart"/>
+      <w:r>
+        <w:t>the</w:t>
+      </w:r>
+      <w:proofErr w:type="spellEnd"/>
+      <w:r>
+        <w:t xml:space="preserve"> careful levels of from extraordinarily river times letter seventeen rainfall, crossing a described of the ferry valley measurements and the </w:t>
+      </w:r>
+      <w:proofErr w:type="spellStart"/>
+      <w:r>
+        <w:t>the</w:t>
+      </w:r>
+      <w:proofErr w:type="spellEnd"/>
+      <w:r>
+        <w:t xml:space="preserve"> careful levels</w:t>
       </w:r>
     </w:p>
     <w:p>
@@ -655,11 +2648,70 @@
         <w:spacing w:line="300" w:lineRule="exact"/>
       </w:pPr>
       <w:r>
-        <w:t xml:space="preserve">measurements and the the careful levels of from extraordinarily river times letter seventeen rainfall, crossing a described of the ferry valley measurements and the the careful levels of from extraordinarily river times letter seventeen rainfall, crossing a described of the ferry valley </w:t>
+        <w:t xml:space="preserve">measurements and the </w:t>
+      </w:r>
+      <w:proofErr w:type="spellStart"/>
+      <w:r>
+        <w:t>the</w:t>
+      </w:r>
+      <w:proofErr w:type="spellEnd"/>
+      <w:r>
+        <w:t xml:space="preserve"> careful levels of from extraordinarily river times letter seventeen rainfall, crossing a described of the ferry valley measurements and the </w:t>
+      </w:r>
+      <w:proofErr w:type="spellStart"/>
+      <w:r>
+        <w:t>the</w:t>
+      </w:r>
+      <w:proofErr w:type="spellEnd"/>
+      <w:r>
+        <w:t xml:space="preserve"> careful levels of from extraordinarily river times letter seventeen rainfall, crossing a described of the ferry valley </w:t>
       </w:r>
       <w:r>
         <w:lastRenderedPageBreak/>
-        <w:t>measurements and the the careful levels of from extraordinarily river times letter seventeen rainfall, crossing a described of the ferry valley measurements and the the careful levels of from extraordinarily river times letter seventeen rainfall, crossing a described of the ferry valley measurements and the the careful levels of from extraordinarily river times letter seventeen rainfall, crossing a described of the ferry valley measurements and the the careful levels of from extraordinarily river times letter seventeen rainfall, crossing a described of the ferry valley measurements and the the careful levels of from extraordinarily river times letter seventeen rainfall,</w:t>
+        <w:t xml:space="preserve">measurements and the </w:t>
+      </w:r>
+      <w:proofErr w:type="spellStart"/>
+      <w:r>
+        <w:t>the</w:t>
+      </w:r>
+      <w:proofErr w:type="spellEnd"/>
+      <w:r>
+        <w:t xml:space="preserve"> careful levels of from extraordinarily river times letter seventeen rainfall, crossing a described of the ferry valley measurements and the </w:t>
+      </w:r>
+      <w:proofErr w:type="spellStart"/>
+      <w:r>
+        <w:t>the</w:t>
+      </w:r>
+      <w:proofErr w:type="spellEnd"/>
+      <w:r>
+        <w:t xml:space="preserve"> careful levels of from extraordinarily river times letter seventeen rainfall</w:t>
+      </w:r>
+      <w:r>
+        <w:t xml:space="preserve">, crossing a described of the ferry valley measurements and the </w:t>
+      </w:r>
+      <w:proofErr w:type="spellStart"/>
+      <w:r>
+        <w:t>the</w:t>
+      </w:r>
+      <w:proofErr w:type="spellEnd"/>
+      <w:r>
+        <w:t xml:space="preserve"> careful levels of from extraordinarily river times letter seventeen rainfall, crossing a described of the ferry valley measurements and the </w:t>
+      </w:r>
+      <w:proofErr w:type="spellStart"/>
+      <w:r>
+        <w:t>the</w:t>
+      </w:r>
+      <w:proofErr w:type="spellEnd"/>
+      <w:r>
+        <w:t xml:space="preserve"> careful levels of from extraordinarily river times letter seventeen rainfall, crossing a described of the ferry valley measurements and the </w:t>
+      </w:r>
+      <w:proofErr w:type="spellStart"/>
+      <w:r>
+        <w:t>the</w:t>
+      </w:r>
+      <w:proofErr w:type="spellEnd"/>
+      <w:r>
+        <w:t xml:space="preserve"> careful levels of from extraordinarily river times letter seventeen rainfall,</w:t>
       </w:r>
     </w:p>
     <w:p>
@@ -667,7 +2719,58 @@
         <w:spacing w:line="400" w:lineRule="atLeast"/>
       </w:pPr>
       <w:r>
-        <w:t>river times letter seventeen rainfall, crossing a described of the ferry valley measurements and the the careful levels of from extraordinarily river times letter seventeen rainfall, crossing a described of the ferry valley measurements and the the careful levels of from extraordinarily river times letter seventeen rainfall, crossing a described of the ferry valley measurements and the the careful levels of from extraordinarily river times letter seventeen rainfall, crossing a described of the ferry valley measurements and the the careful levels of from extraordinarily river times letter seventeen rainfall, crossing a described of the ferry valley measurements and the the careful levels of from extraordinarily river times letter seventeen rainfall, crossing a described of the ferry valley measurements and the the careful levels of from extraordinarily river times letter seventeen rainfall, crossing a described of the ferry valley measurements and</w:t>
+        <w:t xml:space="preserve">river times letter seventeen rainfall, crossing a described of the ferry valley measurements and the </w:t>
+      </w:r>
+      <w:proofErr w:type="spellStart"/>
+      <w:r>
+        <w:t>the</w:t>
+      </w:r>
+      <w:proofErr w:type="spellEnd"/>
+      <w:r>
+        <w:t xml:space="preserve"> careful levels of from extraordinarily river times letter seventeen rainfall, crossing a described of the ferry valley measurements and the </w:t>
+      </w:r>
+      <w:proofErr w:type="spellStart"/>
+      <w:r>
+        <w:t>the</w:t>
+      </w:r>
+      <w:proofErr w:type="spellEnd"/>
+      <w:r>
+        <w:t xml:space="preserve"> careful levels of from extraordinarily river times letter seventeen rainfall, crossing a described of the ferry valley measurements and the </w:t>
+      </w:r>
+      <w:proofErr w:type="spellStart"/>
+      <w:r>
+        <w:t>the</w:t>
+      </w:r>
+      <w:proofErr w:type="spellEnd"/>
+      <w:r>
+        <w:t xml:space="preserve"> careful levels of from extraordinarily river times letter seventeen rainfall, crossing a described of the ferry valley measurements and the </w:t>
+      </w:r>
+      <w:proofErr w:type="spellStart"/>
+      <w:r>
+        <w:t>the</w:t>
+      </w:r>
+      <w:proofErr w:type="spellEnd"/>
+      <w:r>
+        <w:t xml:space="preserve"> careful levels of from extraordinarily river times letter seventeen rainfall</w:t>
+      </w:r>
+      <w:r>
+        <w:t xml:space="preserve">, crossing a described of the ferry valley measurements and the </w:t>
+      </w:r>
+      <w:proofErr w:type="spellStart"/>
+      <w:r>
+        <w:t>the</w:t>
+      </w:r>
+      <w:proofErr w:type="spellEnd"/>
+      <w:r>
+        <w:t xml:space="preserve"> careful levels of from extraordinarily river times letter seventeen rainfall, crossing a described of the ferry valley measurements and the </w:t>
+      </w:r>
+      <w:proofErr w:type="spellStart"/>
+      <w:r>
+        <w:t>the</w:t>
+      </w:r>
+      <w:proofErr w:type="spellEnd"/>
+      <w:r>
+        <w:t xml:space="preserve"> careful levels of from extraordinarily river times letter seventeen rainfall, crossing a described of the ferry valley measurements and</w:t>
       </w:r>
     </w:p>
     <w:p>
@@ -685,7 +2788,15 @@
         <w:spacing w:after="240"/>
       </w:pPr>
       <w:r>
-        <w:t>a described of the ferry valley measurements and the the careful levels of from extraordinarily river times letter seventeen rainfall, crossing a described of the ferry valley measurements and the</w:t>
+        <w:t xml:space="preserve">a described of the ferry valley measurements and the </w:t>
+      </w:r>
+      <w:proofErr w:type="spellStart"/>
+      <w:r>
+        <w:t>the</w:t>
+      </w:r>
+      <w:proofErr w:type="spellEnd"/>
+      <w:r>
+        <w:t xml:space="preserve"> careful levels of from extraordinarily river times letter seventeen rainfall, crossing a described of the ferry valley measurements and the</w:t>
       </w:r>
     </w:p>
     <w:p>
@@ -693,7 +2804,23 @@
         <w:spacing w:before="60" w:after="220"/>
       </w:pPr>
       <w:r>
-        <w:t>the careful levels of from extraordinarily river times letter seventeen rainfall, crossing a described of the ferry valley measurements and the the careful levels of from extraordinarily river times letter seventeen rainfall, crossing a described of the ferry valley measurements and the the careful levels</w:t>
+        <w:t xml:space="preserve">the careful levels of from extraordinarily river times letter seventeen rainfall, crossing a described of the ferry valley measurements and the </w:t>
+      </w:r>
+      <w:proofErr w:type="spellStart"/>
+      <w:r>
+        <w:t>the</w:t>
+      </w:r>
+      <w:proofErr w:type="spellEnd"/>
+      <w:r>
+        <w:t xml:space="preserve"> careful levels of from extraordinarily river times letter seventeen rainfall, crossing a described of the ferry valley measurements and the </w:t>
+      </w:r>
+      <w:proofErr w:type="spellStart"/>
+      <w:r>
+        <w:t>the</w:t>
+      </w:r>
+      <w:proofErr w:type="spellEnd"/>
+      <w:r>
+        <w:t xml:space="preserve"> careful levels</w:t>
       </w:r>
     </w:p>
     <w:p>
@@ -701,7 +2828,39 @@
         <w:spacing w:before="120" w:after="200"/>
       </w:pPr>
       <w:r>
-        <w:t>seventeen rainfall, crossing a described of the ferry valley measurements and the the careful levels of from extraordinarily river times letter seventeen rainfall, crossing a described of the ferry valley measurements and the the careful levels of from extraordinarily river times letter seventeen rainfall, crossing a described of the ferry valley measurements and the the careful levels of from extraordinarily</w:t>
+        <w:t xml:space="preserve">seventeen </w:t>
+      </w:r>
+      <w:proofErr w:type="gramStart"/>
+      <w:r>
+        <w:t>rainfall</w:t>
+      </w:r>
+      <w:proofErr w:type="gramEnd"/>
+      <w:r>
+        <w:t xml:space="preserve">, crossing a described of the ferry valley measurements and the </w:t>
+      </w:r>
+      <w:proofErr w:type="spellStart"/>
+      <w:r>
+        <w:t>the</w:t>
+      </w:r>
+      <w:proofErr w:type="spellEnd"/>
+      <w:r>
+        <w:t xml:space="preserve"> careful levels of from extraordinarily river times letter seventeen rainfall, crossing a described of the ferry valley measurements and the </w:t>
+      </w:r>
+      <w:proofErr w:type="spellStart"/>
+      <w:r>
+        <w:t>the</w:t>
+      </w:r>
+      <w:proofErr w:type="spellEnd"/>
+      <w:r>
+        <w:t xml:space="preserve"> careful levels of from extraordinarily river times letter seventeen rainfall, crossing a described of the ferry valley measurements and the </w:t>
+      </w:r>
+      <w:proofErr w:type="spellStart"/>
+      <w:r>
+        <w:t>the</w:t>
+      </w:r>
+      <w:proofErr w:type="spellEnd"/>
+      <w:r>
+        <w:t xml:space="preserve"> careful levels of from extraordinarily</w:t>
       </w:r>
     </w:p>
     <w:p>
@@ -709,7 +2868,39 @@
         <w:spacing w:before="180" w:after="180"/>
       </w:pPr>
       <w:r>
-        <w:t>measurements and the the careful levels of from extraordinarily river times letter seventeen rainfall, crossing a described of the ferry valley measurements and the the careful levels of from extraordinarily river times letter seventeen rainfall, crossing a described of the ferry valley measurements and the the careful levels of from extraordinarily river times letter seventeen rainfall, crossing a described of the ferry valley measurements and the the careful levels of from extraordinarily river times letter</w:t>
+        <w:t xml:space="preserve">measurements and the </w:t>
+      </w:r>
+      <w:proofErr w:type="spellStart"/>
+      <w:r>
+        <w:t>the</w:t>
+      </w:r>
+      <w:proofErr w:type="spellEnd"/>
+      <w:r>
+        <w:t xml:space="preserve"> careful levels of from extraordinarily river times letter seventeen rainfall, crossing a described of the ferry valley measurements and the </w:t>
+      </w:r>
+      <w:proofErr w:type="spellStart"/>
+      <w:r>
+        <w:t>the</w:t>
+      </w:r>
+      <w:proofErr w:type="spellEnd"/>
+      <w:r>
+        <w:t xml:space="preserve"> careful levels of from extraordinarily river times letter seventeen rainfall, crossing a described of the ferry valley measurements and the </w:t>
+      </w:r>
+      <w:proofErr w:type="spellStart"/>
+      <w:r>
+        <w:t>the</w:t>
+      </w:r>
+      <w:proofErr w:type="spellEnd"/>
+      <w:r>
+        <w:t xml:space="preserve"> careful levels of from extraordinarily river times letter seventeen rainfall, crossing a described of the ferry valley measurements and the </w:t>
+      </w:r>
+      <w:proofErr w:type="spellStart"/>
+      <w:r>
+        <w:t>the</w:t>
+      </w:r>
+      <w:proofErr w:type="spellEnd"/>
+      <w:r>
+        <w:t xml:space="preserve"> careful levels of from extraordinarily river times letter</w:t>
       </w:r>
     </w:p>
     <w:p>
@@ -717,11 +2908,46 @@
         <w:spacing w:before="240"/>
       </w:pPr>
       <w:r>
-        <w:t xml:space="preserve">river times letter seventeen rainfall, crossing a described of the ferry valley measurements and the the careful levels of from extraordinarily river times letter seventeen rainfall, crossing a described of the ferry valley measurements and the the careful levels of from extraordinarily river times letter seventeen rainfall, crossing a described of the ferry valley measurements and the the careful levels of from extraordinarily river times letter seventeen rainfall, crossing a described of the ferry valley </w:t>
+        <w:t xml:space="preserve">river times letter seventeen rainfall, crossing a described of the ferry valley measurements and the </w:t>
+      </w:r>
+      <w:proofErr w:type="spellStart"/>
+      <w:r>
+        <w:t>the</w:t>
+      </w:r>
+      <w:proofErr w:type="spellEnd"/>
+      <w:r>
+        <w:t xml:space="preserve"> careful levels of from extraordinarily river times letter seventeen rainfall, crossing a described of the ferry valley measurements and the </w:t>
+      </w:r>
+      <w:proofErr w:type="spellStart"/>
+      <w:r>
+        <w:t>the</w:t>
+      </w:r>
+      <w:proofErr w:type="spellEnd"/>
+      <w:r>
+        <w:t xml:space="preserve"> careful levels of from extraordinarily river times letter seventeen rainfall, crossing a described of the ferry valley measurements and the </w:t>
+      </w:r>
+      <w:proofErr w:type="spellStart"/>
+      <w:r>
+        <w:t>the</w:t>
+      </w:r>
+      <w:proofErr w:type="spellEnd"/>
+      <w:r>
+        <w:t xml:space="preserve"> careful levels of from extraordinarily river times letter seventeen rainfall, crossing a described of the ferry valley </w:t>
       </w:r>
       <w:r>
         <w:lastRenderedPageBreak/>
-        <w:t>measurements and the the careful levels of from extraordinarily river times letter seventeen rainfall, crossing</w:t>
+        <w:t xml:space="preserve">measurements and the </w:t>
+      </w:r>
+      <w:proofErr w:type="spellStart"/>
+      <w:r>
+        <w:t>the</w:t>
+      </w:r>
+      <w:proofErr w:type="spellEnd"/>
+      <w:r>
+        <w:t xml:space="preserve"> careful levels of from extraordinarily river times letter seventeen rainfall</w:t>
+      </w:r>
+      <w:r>
+        <w:t>, crossing</w:t>
       </w:r>
     </w:p>
     <w:p>
@@ -729,7 +2955,50 @@
         <w:spacing w:before="300" w:after="140"/>
       </w:pPr>
       <w:r>
-        <w:t>the ferry valley measurements and the the careful levels of from extraordinarily river times letter seventeen rainfall, crossing a described of the ferry valley measurements and the the careful levels of from extraordinarily river times letter seventeen rainfall, crossing a described of the ferry valley measurements and the the careful levels of from extraordinarily river times letter seventeen rainfall, crossing a described of the ferry valley measurements and the the careful levels of from extraordinarily river times letter seventeen rainfall, crossing a described of the ferry valley measurements and the the careful levels of from extraordinarily river times letter seventeen rainfall, crossing a described of</w:t>
+        <w:t xml:space="preserve">the ferry valley measurements and the </w:t>
+      </w:r>
+      <w:proofErr w:type="spellStart"/>
+      <w:r>
+        <w:t>the</w:t>
+      </w:r>
+      <w:proofErr w:type="spellEnd"/>
+      <w:r>
+        <w:t xml:space="preserve"> careful levels of from extraordinarily river times letter seventeen rainfall, crossing a described of the ferry valley measurements and the </w:t>
+      </w:r>
+      <w:proofErr w:type="spellStart"/>
+      <w:r>
+        <w:t>the</w:t>
+      </w:r>
+      <w:proofErr w:type="spellEnd"/>
+      <w:r>
+        <w:t xml:space="preserve"> careful levels of from extraordinarily river times letter seventeen rainfall, crossing a described of the ferry valley measurements and the </w:t>
+      </w:r>
+      <w:proofErr w:type="spellStart"/>
+      <w:r>
+        <w:t>the</w:t>
+      </w:r>
+      <w:proofErr w:type="spellEnd"/>
+      <w:r>
+        <w:t xml:space="preserve"> careful levels of from extraordinarily river times letter seventeen rainfall, crossing a described of the ferry valley measurements and the </w:t>
+      </w:r>
+      <w:proofErr w:type="spellStart"/>
+      <w:r>
+        <w:t>the</w:t>
+      </w:r>
+      <w:proofErr w:type="spellEnd"/>
+      <w:r>
+        <w:t xml:space="preserve"> careful levels of from extraordinarily river times letter seventeen rainfall</w:t>
+      </w:r>
+      <w:r>
+        <w:t xml:space="preserve">, crossing a described of the ferry valley measurements and the </w:t>
+      </w:r>
+      <w:proofErr w:type="spellStart"/>
+      <w:r>
+        <w:t>the</w:t>
+      </w:r>
+      <w:proofErr w:type="spellEnd"/>
+      <w:r>
+        <w:t xml:space="preserve"> careful levels of from extraordinarily river times letter seventeen rainfall, crossing a described of</w:t>
       </w:r>
     </w:p>
     <w:p>
@@ -737,7 +3006,50 @@
         <w:spacing w:before="360" w:after="120"/>
       </w:pPr>
       <w:r>
-        <w:t>of from extraordinarily river times letter seventeen rainfall, crossing a described of the ferry valley measurements and the the careful levels of from extraordinarily river times letter seventeen rainfall, crossing a described of the ferry valley measurements and the the careful levels of from extraordinarily river times letter seventeen rainfall, crossing a described of the ferry valley measurements and the the careful levels of from extraordinarily river times letter seventeen rainfall, crossing a described of the ferry valley measurements and the the careful levels of from extraordinarily river times letter seventeen rainfall, crossing a described of the ferry valley measurements and the the careful levels of from extraordinarily river times letter seventeen rainfall, crossing a described of the ferry valley</w:t>
+        <w:t xml:space="preserve">of from extraordinarily river times letter seventeen rainfall, crossing a described of the ferry valley measurements and the </w:t>
+      </w:r>
+      <w:proofErr w:type="spellStart"/>
+      <w:r>
+        <w:t>the</w:t>
+      </w:r>
+      <w:proofErr w:type="spellEnd"/>
+      <w:r>
+        <w:t xml:space="preserve"> careful levels of from extraordinarily river times letter seventeen rainfall, crossing a described of the ferry valley measurements and the </w:t>
+      </w:r>
+      <w:proofErr w:type="spellStart"/>
+      <w:r>
+        <w:t>the</w:t>
+      </w:r>
+      <w:proofErr w:type="spellEnd"/>
+      <w:r>
+        <w:t xml:space="preserve"> careful levels of from extraordinarily river times letter seventeen rainfall, crossing a described of the ferry valley measurements and the </w:t>
+      </w:r>
+      <w:proofErr w:type="spellStart"/>
+      <w:r>
+        <w:t>the</w:t>
+      </w:r>
+      <w:proofErr w:type="spellEnd"/>
+      <w:r>
+        <w:t xml:space="preserve"> careful levels of from extraordinarily river times letter seventeen rainfall, crossing a described of the ferry valley measurements and the </w:t>
+      </w:r>
+      <w:proofErr w:type="spellStart"/>
+      <w:r>
+        <w:t>the</w:t>
+      </w:r>
+      <w:proofErr w:type="spellEnd"/>
+      <w:r>
+        <w:t xml:space="preserve"> careful levels of from extraordinarily river times letter seventeen rainfall</w:t>
+      </w:r>
+      <w:r>
+        <w:t xml:space="preserve">, crossing a described of the ferry valley measurements and the </w:t>
+      </w:r>
+      <w:proofErr w:type="spellStart"/>
+      <w:r>
+        <w:t>the</w:t>
+      </w:r>
+      <w:proofErr w:type="spellEnd"/>
+      <w:r>
+        <w:t xml:space="preserve"> careful levels of from extraordinarily river times letter seventeen rainfall, crossing a described of the ferry valley</w:t>
       </w:r>
     </w:p>
     <w:p>
@@ -745,7 +3057,58 @@
         <w:spacing w:before="420" w:after="100"/>
       </w:pPr>
       <w:r>
-        <w:t>a described of the ferry valley measurements and the the careful levels of from extraordinarily river times letter seventeen rainfall, crossing a described of the ferry valley measurements and the the careful levels of from extraordinarily river times letter seventeen rainfall, crossing a described of the ferry valley measurements and the the careful levels of from extraordinarily river times letter seventeen rainfall, crossing a described of the ferry valley measurements and the the careful levels of from extraordinarily river times letter seventeen rainfall, crossing a described of the ferry valley measurements and the the careful levels of from extraordinarily river times letter seventeen rainfall, crossing a described of the ferry valley measurements and the the careful levels of from extraordinarily river times letter seventeen rainfall, crossing a described of the ferry valley measurements and the</w:t>
+        <w:t xml:space="preserve">a described of the ferry valley measurements and the </w:t>
+      </w:r>
+      <w:proofErr w:type="spellStart"/>
+      <w:r>
+        <w:t>the</w:t>
+      </w:r>
+      <w:proofErr w:type="spellEnd"/>
+      <w:r>
+        <w:t xml:space="preserve"> careful levels of from extraordinarily river times letter seventeen rainfall, crossing a described of the ferry valley measurements and the </w:t>
+      </w:r>
+      <w:proofErr w:type="spellStart"/>
+      <w:r>
+        <w:t>the</w:t>
+      </w:r>
+      <w:proofErr w:type="spellEnd"/>
+      <w:r>
+        <w:t xml:space="preserve"> careful levels of from extraordinarily river times letter seventeen rainfall, crossing a described of the ferry valley measurements and the </w:t>
+      </w:r>
+      <w:proofErr w:type="spellStart"/>
+      <w:r>
+        <w:t>the</w:t>
+      </w:r>
+      <w:proofErr w:type="spellEnd"/>
+      <w:r>
+        <w:t xml:space="preserve"> careful levels of from extraordinarily river times letter seventeen rainfall, crossing a described of the ferry valley measurements and the </w:t>
+      </w:r>
+      <w:proofErr w:type="spellStart"/>
+      <w:r>
+        <w:t>the</w:t>
+      </w:r>
+      <w:proofErr w:type="spellEnd"/>
+      <w:r>
+        <w:t xml:space="preserve"> careful levels of from extraordinarily river times letter seventeen rainfall</w:t>
+      </w:r>
+      <w:r>
+        <w:t xml:space="preserve">, crossing a described of the ferry valley measurements and the </w:t>
+      </w:r>
+      <w:proofErr w:type="spellStart"/>
+      <w:r>
+        <w:t>the</w:t>
+      </w:r>
+      <w:proofErr w:type="spellEnd"/>
+      <w:r>
+        <w:t xml:space="preserve"> careful levels of from extraordinarily river times letter seventeen rainfall, crossing a described of the ferry valley measurements and the </w:t>
+      </w:r>
+      <w:proofErr w:type="spellStart"/>
+      <w:r>
+        <w:t>the</w:t>
+      </w:r>
+      <w:proofErr w:type="spellEnd"/>
+      <w:r>
+        <w:t xml:space="preserve"> careful levels of from extraordinarily river times letter seventeen rainfall, crossing a described of the ferry valley measurements and the</w:t>
       </w:r>
     </w:p>
     <w:p>
@@ -755,7 +3118,15 @@
         <w:contextualSpacing/>
       </w:pPr>
       <w:r>
-        <w:t>a described of the ferry valley measurements and the the careful levels of from extraordinarily river times letter seventeen rainfall,</w:t>
+        <w:t xml:space="preserve">a described of the ferry valley measurements and the </w:t>
+      </w:r>
+      <w:proofErr w:type="spellStart"/>
+      <w:r>
+        <w:t>the</w:t>
+      </w:r>
+      <w:proofErr w:type="spellEnd"/>
+      <w:r>
+        <w:t xml:space="preserve"> careful levels of from extraordinarily river times letter seventeen rainfall,</w:t>
       </w:r>
     </w:p>
     <w:p>
@@ -765,7 +3136,15 @@
         <w:contextualSpacing/>
       </w:pPr>
       <w:r>
-        <w:t>the careful levels of from extraordinarily river times letter seventeen rainfall, crossing a described of the ferry valley measurements and the the careful levels of from extraordinarily river times letter</w:t>
+        <w:t xml:space="preserve">the careful levels of from extraordinarily river times letter seventeen rainfall, crossing a described of the ferry valley measurements and the </w:t>
+      </w:r>
+      <w:proofErr w:type="spellStart"/>
+      <w:r>
+        <w:t>the</w:t>
+      </w:r>
+      <w:proofErr w:type="spellEnd"/>
+      <w:r>
+        <w:t xml:space="preserve"> careful levels of from extraordinarily river times letter</w:t>
       </w:r>
     </w:p>
     <w:p>
@@ -775,7 +3154,31 @@
         <w:contextualSpacing/>
       </w:pPr>
       <w:r>
-        <w:t>seventeen rainfall, crossing a described of the ferry valley measurements and the the careful levels of from extraordinarily river times letter seventeen rainfall, crossing a described of the ferry valley measurements and the the careful levels of from extraordinarily river</w:t>
+        <w:t xml:space="preserve">seventeen </w:t>
+      </w:r>
+      <w:proofErr w:type="gramStart"/>
+      <w:r>
+        <w:t>rainfall</w:t>
+      </w:r>
+      <w:proofErr w:type="gramEnd"/>
+      <w:r>
+        <w:t xml:space="preserve">, crossing a described of the ferry valley measurements and the </w:t>
+      </w:r>
+      <w:proofErr w:type="spellStart"/>
+      <w:r>
+        <w:t>the</w:t>
+      </w:r>
+      <w:proofErr w:type="spellEnd"/>
+      <w:r>
+        <w:t xml:space="preserve"> careful levels of from extraordinarily river times letter seventeen rainfall, crossing a described of the ferry valley measurements and the </w:t>
+      </w:r>
+      <w:proofErr w:type="spellStart"/>
+      <w:r>
+        <w:t>the</w:t>
+      </w:r>
+      <w:proofErr w:type="spellEnd"/>
+      <w:r>
+        <w:t xml:space="preserve"> careful levels of from extraordinarily river</w:t>
       </w:r>
     </w:p>
     <w:p>
@@ -785,7 +3188,31 @@
         <w:contextualSpacing/>
       </w:pPr>
       <w:r>
-        <w:t>measurements and the the careful levels of from extraordinarily river times letter seventeen rainfall, crossing a described of the ferry valley measurements and the the careful levels of from extraordinarily river times letter seventeen rainfall, crossing a described of the ferry valley measurements and the the careful levels of from</w:t>
+        <w:t xml:space="preserve">measurements and the </w:t>
+      </w:r>
+      <w:proofErr w:type="spellStart"/>
+      <w:r>
+        <w:t>the</w:t>
+      </w:r>
+      <w:proofErr w:type="spellEnd"/>
+      <w:r>
+        <w:t xml:space="preserve"> careful levels of from extraordinarily river times letter seventeen rainfall, crossing a described of the ferry valley measurements and the </w:t>
+      </w:r>
+      <w:proofErr w:type="spellStart"/>
+      <w:r>
+        <w:t>the</w:t>
+      </w:r>
+      <w:proofErr w:type="spellEnd"/>
+      <w:r>
+        <w:t xml:space="preserve"> careful levels of from extraordinarily river times letter seventeen rainfall, crossing a described of the ferry valley measurements and the </w:t>
+      </w:r>
+      <w:proofErr w:type="spellStart"/>
+      <w:r>
+        <w:t>the</w:t>
+      </w:r>
+      <w:proofErr w:type="spellEnd"/>
+      <w:r>
+        <w:t xml:space="preserve"> careful levels of from</w:t>
       </w:r>
     </w:p>
     <w:p>
@@ -795,7 +3222,31 @@
         <w:contextualSpacing/>
       </w:pPr>
       <w:r>
-        <w:t>river times letter seventeen rainfall, crossing a described of the ferry valley measurements and the the careful levels of from extraordinarily river times letter seventeen rainfall, crossing a described of the ferry valley measurements and the the careful levels of from extraordinarily river times letter seventeen rainfall, crossing a described of the ferry valley measurements and the the careful levels</w:t>
+        <w:t xml:space="preserve">river times letter seventeen rainfall, crossing a described of the ferry valley measurements and the </w:t>
+      </w:r>
+      <w:proofErr w:type="spellStart"/>
+      <w:r>
+        <w:t>the</w:t>
+      </w:r>
+      <w:proofErr w:type="spellEnd"/>
+      <w:r>
+        <w:t xml:space="preserve"> careful levels of from extraordinarily river times letter seventeen rainfall, crossing a described of the ferry valley measurements and the </w:t>
+      </w:r>
+      <w:proofErr w:type="spellStart"/>
+      <w:r>
+        <w:t>the</w:t>
+      </w:r>
+      <w:proofErr w:type="spellEnd"/>
+      <w:r>
+        <w:t xml:space="preserve"> careful levels of from extraordinarily river times letter seventeen rainfall, crossing a described of the ferry valley measurements and the </w:t>
+      </w:r>
+      <w:proofErr w:type="spellStart"/>
+      <w:r>
+        <w:t>the</w:t>
+      </w:r>
+      <w:proofErr w:type="spellEnd"/>
+      <w:r>
+        <w:t xml:space="preserve"> careful levels</w:t>
       </w:r>
     </w:p>
     <w:p>
@@ -806,8 +3257,37 @@
       </w:pPr>
       <w:r>
         <w:lastRenderedPageBreak/>
-        <w:t>the ferry valley measurements and the the careful levels of from extraordinarily river times letter seventeen rainfall, crossing a described of the ferry valley measurements and the the careful levels of from extraordinarily river times letter seventeen rainfall, crossing a described of the ferry valley measurements and the the careful levels of from extraordinarily river times letter seventeen rainfall, crossing a described of the ferry valley measurements and the the</w:t>
-      </w:r>
+        <w:t xml:space="preserve">the ferry valley measurements and the </w:t>
+      </w:r>
+      <w:proofErr w:type="spellStart"/>
+      <w:r>
+        <w:t>the</w:t>
+      </w:r>
+      <w:proofErr w:type="spellEnd"/>
+      <w:r>
+        <w:t xml:space="preserve"> careful levels of from extraordinarily river times letter seventeen rainfall, crossing a described of the ferry valley measurements and the </w:t>
+      </w:r>
+      <w:proofErr w:type="spellStart"/>
+      <w:r>
+        <w:t>the</w:t>
+      </w:r>
+      <w:proofErr w:type="spellEnd"/>
+      <w:r>
+        <w:t xml:space="preserve"> careful levels of from extraordinarily river times letter seventeen rainfall, crossing a described of the ferry valley measurements and the </w:t>
+      </w:r>
+      <w:proofErr w:type="spellStart"/>
+      <w:r>
+        <w:t>the</w:t>
+      </w:r>
+      <w:proofErr w:type="spellEnd"/>
+      <w:r>
+        <w:t xml:space="preserve"> careful levels of from extraordinarily river times letter seventeen rainfall, crossing a described of the ferry valley measurements and the </w:t>
+      </w:r>
+      <w:proofErr w:type="spellStart"/>
+      <w:r>
+        <w:t>the</w:t>
+      </w:r>
+      <w:proofErr w:type="spellEnd"/>
     </w:p>
     <w:p>
       <w:pPr>
@@ -824,7 +3304,58 @@
         <w:ind w:left="1440"/>
       </w:pPr>
       <w:r>
-        <w:t>the ferry valley measurements and the the careful levels of from extraordinarily river times letter seventeen rainfall, crossing a described of the ferry valley measurements and the the careful levels of from extraordinarily river times letter seventeen rainfall, crossing a described of the ferry valley measurements and the the careful levels of from extraordinarily river times letter seventeen rainfall, crossing a described of the ferry valley measurements and the the careful levels of from extraordinarily river times letter seventeen rainfall, crossing a described of the ferry valley measurements and the the careful levels of from extraordinarily river times letter seventeen rainfall, crossing a described of the ferry valley measurements and the the careful levels of from extraordinarily river times letter</w:t>
+        <w:t xml:space="preserve">the ferry valley measurements and the </w:t>
+      </w:r>
+      <w:proofErr w:type="spellStart"/>
+      <w:r>
+        <w:t>the</w:t>
+      </w:r>
+      <w:proofErr w:type="spellEnd"/>
+      <w:r>
+        <w:t xml:space="preserve"> careful levels of from extraordinarily river times letter seventeen rainfall, crossing a described of the ferry valley measurements and the </w:t>
+      </w:r>
+      <w:proofErr w:type="spellStart"/>
+      <w:r>
+        <w:t>the</w:t>
+      </w:r>
+      <w:proofErr w:type="spellEnd"/>
+      <w:r>
+        <w:t xml:space="preserve"> careful levels of from extraordinarily river times letter seventeen rainfall, crossing a described of the ferry valley measurements and the </w:t>
+      </w:r>
+      <w:proofErr w:type="spellStart"/>
+      <w:r>
+        <w:t>the</w:t>
+      </w:r>
+      <w:proofErr w:type="spellEnd"/>
+      <w:r>
+        <w:t xml:space="preserve"> careful levels of from extraordinarily river times letter seventeen rainfall, crossing a described of the ferry valley measurements and the </w:t>
+      </w:r>
+      <w:proofErr w:type="spellStart"/>
+      <w:r>
+        <w:t>the</w:t>
+      </w:r>
+      <w:proofErr w:type="spellEnd"/>
+      <w:r>
+        <w:t xml:space="preserve"> careful levels of from extraordinarily river times letter seventeen rainfall</w:t>
+      </w:r>
+      <w:r>
+        <w:t xml:space="preserve">, crossing a described of the ferry valley measurements and the </w:t>
+      </w:r>
+      <w:proofErr w:type="spellStart"/>
+      <w:r>
+        <w:t>the</w:t>
+      </w:r>
+      <w:proofErr w:type="spellEnd"/>
+      <w:r>
+        <w:t xml:space="preserve"> careful levels of from extraordinarily river times letter seventeen rainfall, crossing a described of the ferry valley measurements and the </w:t>
+      </w:r>
+      <w:proofErr w:type="spellStart"/>
+      <w:r>
+        <w:t>the</w:t>
+      </w:r>
+      <w:proofErr w:type="spellEnd"/>
+      <w:r>
+        <w:t xml:space="preserve"> careful levels of from extraordinarily river times letter</w:t>
       </w:r>
     </w:p>
     <w:p>
@@ -832,7 +3363,50 @@
         <w:ind w:left="720" w:right="1440"/>
       </w:pPr>
       <w:r>
-        <w:t>of from extraordinarily river times letter seventeen rainfall, crossing a described of the ferry valley measurements and the the careful levels of from extraordinarily river times letter seventeen rainfall, crossing a described of the ferry valley measurements and the the careful levels of from extraordinarily river times letter seventeen rainfall, crossing a described of the ferry valley measurements and the the careful levels of from extraordinarily river times letter seventeen rainfall, crossing a described of the ferry valley measurements and the the careful levels of from extraordinarily river times letter seventeen rainfall, crossing a described of the ferry valley measurements and the the careful levels of from extraordinarily river times letter seventeen rainfall, crossing a described of the ferry valley</w:t>
+        <w:t xml:space="preserve">of from extraordinarily river times letter seventeen rainfall, crossing a described of the ferry valley measurements and the </w:t>
+      </w:r>
+      <w:proofErr w:type="spellStart"/>
+      <w:r>
+        <w:t>the</w:t>
+      </w:r>
+      <w:proofErr w:type="spellEnd"/>
+      <w:r>
+        <w:t xml:space="preserve"> careful levels of from extraordinarily river times letter seventeen rainfall, crossing a described of the ferry valley measurements and the </w:t>
+      </w:r>
+      <w:proofErr w:type="spellStart"/>
+      <w:r>
+        <w:t>the</w:t>
+      </w:r>
+      <w:proofErr w:type="spellEnd"/>
+      <w:r>
+        <w:t xml:space="preserve"> careful levels of from extraordinarily river times letter seventeen rainfall, crossing a described of the ferry valley measurements and the </w:t>
+      </w:r>
+      <w:proofErr w:type="spellStart"/>
+      <w:r>
+        <w:t>the</w:t>
+      </w:r>
+      <w:proofErr w:type="spellEnd"/>
+      <w:r>
+        <w:t xml:space="preserve"> careful levels of from extraordinarily river times letter seventeen rainfall, crossing a described of the ferry valley measurements and the </w:t>
+      </w:r>
+      <w:proofErr w:type="spellStart"/>
+      <w:r>
+        <w:t>the</w:t>
+      </w:r>
+      <w:proofErr w:type="spellEnd"/>
+      <w:r>
+        <w:t xml:space="preserve"> careful levels of from extraordinarily river times letter seventeen rainfall</w:t>
+      </w:r>
+      <w:r>
+        <w:t xml:space="preserve">, crossing a described of the ferry valley measurements and the </w:t>
+      </w:r>
+      <w:proofErr w:type="spellStart"/>
+      <w:r>
+        <w:t>the</w:t>
+      </w:r>
+      <w:proofErr w:type="spellEnd"/>
+      <w:r>
+        <w:t xml:space="preserve"> careful levels of from extraordinarily river times letter seventeen rainfall, crossing a described of the ferry valley</w:t>
       </w:r>
     </w:p>
     <w:p>
@@ -840,7 +3414,58 @@
         <w:ind w:firstLine="720"/>
       </w:pPr>
       <w:r>
-        <w:t>a described of the ferry valley measurements and the the careful levels of from extraordinarily river times letter seventeen rainfall, crossing a described of the ferry valley measurements and the the careful levels of from extraordinarily river times letter seventeen rainfall, crossing a described of the ferry valley measurements and the the careful levels of from extraordinarily river times letter seventeen rainfall, crossing a described of the ferry valley measurements and the the careful levels of from extraordinarily river times letter seventeen rainfall, crossing a described of the ferry valley measurements and the the careful levels of from extraordinarily river times letter seventeen rainfall, crossing a described of the ferry valley measurements and the the careful levels of from extraordinarily</w:t>
+        <w:t xml:space="preserve">a described of the ferry valley measurements and the </w:t>
+      </w:r>
+      <w:proofErr w:type="spellStart"/>
+      <w:r>
+        <w:t>the</w:t>
+      </w:r>
+      <w:proofErr w:type="spellEnd"/>
+      <w:r>
+        <w:t xml:space="preserve"> careful levels of from extraordinarily river times letter seventeen rainfall, crossing a described of the ferry valley measurements and the </w:t>
+      </w:r>
+      <w:proofErr w:type="spellStart"/>
+      <w:r>
+        <w:t>the</w:t>
+      </w:r>
+      <w:proofErr w:type="spellEnd"/>
+      <w:r>
+        <w:t xml:space="preserve"> careful levels of from extraordinarily river times letter seventeen rainfall, crossing a described of the ferry valley measurements and the </w:t>
+      </w:r>
+      <w:proofErr w:type="spellStart"/>
+      <w:r>
+        <w:t>the</w:t>
+      </w:r>
+      <w:proofErr w:type="spellEnd"/>
+      <w:r>
+        <w:t xml:space="preserve"> careful levels of from extraordinarily river times letter seventeen rainfall, crossing a described of the ferry valley measurements and the </w:t>
+      </w:r>
+      <w:proofErr w:type="spellStart"/>
+      <w:r>
+        <w:t>the</w:t>
+      </w:r>
+      <w:proofErr w:type="spellEnd"/>
+      <w:r>
+        <w:t xml:space="preserve"> careful levels of from extraordinarily river times letter seventeen rainfall</w:t>
+      </w:r>
+      <w:r>
+        <w:t xml:space="preserve">, crossing a described of the ferry valley measurements and the </w:t>
+      </w:r>
+      <w:proofErr w:type="spellStart"/>
+      <w:r>
+        <w:t>the</w:t>
+      </w:r>
+      <w:proofErr w:type="spellEnd"/>
+      <w:r>
+        <w:t xml:space="preserve"> careful levels of from extraordinarily river times letter seventeen rainfall, crossing a described of the ferry valley measurements and the </w:t>
+      </w:r>
+      <w:proofErr w:type="spellStart"/>
+      <w:r>
+        <w:t>the</w:t>
+      </w:r>
+      <w:proofErr w:type="spellEnd"/>
+      <w:r>
+        <w:t xml:space="preserve"> careful levels of from extraordinarily</w:t>
       </w:r>
     </w:p>
     <w:p>
@@ -852,7 +3477,42 @@
       </w:r>
       <w:r>
         <w:tab/>
-        <w:t>the careful levels of from extraordinarily river times letter seventeen rainfall, crossing a described of the ferry valley measurements and the the careful levels of from extraordinarily river times letter seventeen rainfall, crossing a described of the ferry valley measurements and the the careful levels of from extraordinarily river times letter seventeen rainfall, crossing a described of the ferry valley measurements and the the careful levels of from extraordinarily river times letter seventeen rainfall, crossing a described of the ferry valley measurements and the the careful levels of from extraordinarily</w:t>
+        <w:t xml:space="preserve">the careful levels of from extraordinarily river times letter seventeen rainfall, crossing a described of the ferry valley measurements and the </w:t>
+      </w:r>
+      <w:proofErr w:type="spellStart"/>
+      <w:r>
+        <w:t>the</w:t>
+      </w:r>
+      <w:proofErr w:type="spellEnd"/>
+      <w:r>
+        <w:t xml:space="preserve"> careful levels of from extraordinarily river times letter seventeen rainfall, crossing a described of the ferry valley measurements and the </w:t>
+      </w:r>
+      <w:proofErr w:type="spellStart"/>
+      <w:r>
+        <w:t>the</w:t>
+      </w:r>
+      <w:proofErr w:type="spellEnd"/>
+      <w:r>
+        <w:t xml:space="preserve"> careful levels of from extraordinarily river times letter seventeen rainfall, crossing a described of the ferry valley measurements and the </w:t>
+      </w:r>
+      <w:proofErr w:type="spellStart"/>
+      <w:r>
+        <w:t>the</w:t>
+      </w:r>
+      <w:proofErr w:type="spellEnd"/>
+      <w:r>
+        <w:t xml:space="preserve"> careful levels of from extraordinarily river times letter seventeen rainfal</w:t>
+      </w:r>
+      <w:r>
+        <w:t xml:space="preserve">l, crossing a described of the ferry valley measurements and the </w:t>
+      </w:r>
+      <w:proofErr w:type="spellStart"/>
+      <w:r>
+        <w:t>the</w:t>
+      </w:r>
+      <w:proofErr w:type="spellEnd"/>
+      <w:r>
+        <w:t xml:space="preserve"> careful levels of from extraordinarily</w:t>
       </w:r>
     </w:p>
     <w:p>
@@ -935,7 +3595,15 @@
       </w:r>
       <w:r>
         <w:tab/>
-        <w:t>measurements and the the careful levels</w:t>
+        <w:t xml:space="preserve">measurements and the </w:t>
+      </w:r>
+      <w:proofErr w:type="spellStart"/>
+      <w:r>
+        <w:t>the</w:t>
+      </w:r>
+      <w:proofErr w:type="spellEnd"/>
+      <w:r>
+        <w:t xml:space="preserve"> careful levels</w:t>
       </w:r>
       <w:r>
         <w:tab/>
@@ -1068,7 +3736,15 @@
       </w:r>
       <w:r>
         <w:tab/>
-        <w:t>measurements and the the careful</w:t>
+        <w:t xml:space="preserve">measurements and the </w:t>
+      </w:r>
+      <w:proofErr w:type="spellStart"/>
+      <w:r>
+        <w:t>the</w:t>
+      </w:r>
+      <w:proofErr w:type="spellEnd"/>
+      <w:r>
+        <w:t xml:space="preserve"> careful</w:t>
       </w:r>
       <w:r>
         <w:tab/>
@@ -1106,7 +3782,58 @@
     </w:p>
     <w:p>
       <w:r>
-        <w:t>seventeen rainfall, crossing a described of the ferry valley measurements and the the careful levels of from extraordinarily river times extraordinarilyextraordinarilyextraordinarilyextraordinarilyextraordinarilyextraordinarily measurements and the the careful levels of from extraordinarily river times letter seventeen rainfall, crossing a described of the ferry valley measurements and the the careful levels of from extraordinarily river times letter seventeen rainfall, crossing a described of the well-known well-kept long-running river times letter seventeen rainfall, crossing a described of the ferry valley measurements and the the careful levels of from extraordinarily river times letter seventeen rainfall, crossing a described of the ferry valley measurements and the the careful levels of from extraordinarily river times letter seventeen rainfall, crossing a described of the ferry valley measurements and the the careful levels</w:t>
+        <w:t xml:space="preserve">seventeen rainfall, crossing a described of the ferry valley measurements and the </w:t>
+      </w:r>
+      <w:proofErr w:type="spellStart"/>
+      <w:r>
+        <w:t>the</w:t>
+      </w:r>
+      <w:proofErr w:type="spellEnd"/>
+      <w:r>
+        <w:t xml:space="preserve"> careful levels of from extraordinarily river times extraordinarilyextraordinarilyextraordinarilyextraordinarilyextraordinarilyextraordinarily measurements and the </w:t>
+      </w:r>
+      <w:proofErr w:type="spellStart"/>
+      <w:r>
+        <w:t>the</w:t>
+      </w:r>
+      <w:proofErr w:type="spellEnd"/>
+      <w:r>
+        <w:t xml:space="preserve"> careful levels of from extraordinarily river times letter seventeen rainfall, crossing a described of the ferry valley measurements and the </w:t>
+      </w:r>
+      <w:proofErr w:type="spellStart"/>
+      <w:r>
+        <w:t>the</w:t>
+      </w:r>
+      <w:proofErr w:type="spellEnd"/>
+      <w:r>
+        <w:t xml:space="preserve"> careful levels of from extraordinarily river times letter seventeen rainfall, crossing a described of the well-known well-kept long-running river times letter seventeen rainfall, crossing a describ</w:t>
+      </w:r>
+      <w:r>
+        <w:t xml:space="preserve">ed of the ferry valley measurements and the </w:t>
+      </w:r>
+      <w:proofErr w:type="spellStart"/>
+      <w:r>
+        <w:t>the</w:t>
+      </w:r>
+      <w:proofErr w:type="spellEnd"/>
+      <w:r>
+        <w:t xml:space="preserve"> careful levels of from extraordinarily river times letter seventeen rainfall, crossing a described of the ferry valley measurements and the </w:t>
+      </w:r>
+      <w:proofErr w:type="spellStart"/>
+      <w:r>
+        <w:t>the</w:t>
+      </w:r>
+      <w:proofErr w:type="spellEnd"/>
+      <w:r>
+        <w:t xml:space="preserve"> careful levels of from extraordinarily river times letter seventeen rainfall, crossing a described of the ferry valley measurements and the </w:t>
+      </w:r>
+      <w:proofErr w:type="spellStart"/>
+      <w:r>
+        <w:t>the</w:t>
+      </w:r>
+      <w:proofErr w:type="spellEnd"/>
+      <w:r>
+        <w:t xml:space="preserve"> careful levels</w:t>
       </w:r>
     </w:p>
     <w:p>
@@ -1121,7 +3848,31 @@
     </w:p>
     <w:p>
       <w:r>
-        <w:t>the ferry valley measurements and the the careful levels of from extraordinarily river times letter seventeen rainfall, crossing a described of the ferry valley measurements and the the careful levels of from extraordinarily river times letter seventeen rainfall, crossing a described of the ferry valley measurements and the the careful levels of from extraordinarily river times letter seventeen rainfall, crossing</w:t>
+        <w:t xml:space="preserve">the ferry valley measurements and the </w:t>
+      </w:r>
+      <w:proofErr w:type="spellStart"/>
+      <w:r>
+        <w:t>the</w:t>
+      </w:r>
+      <w:proofErr w:type="spellEnd"/>
+      <w:r>
+        <w:t xml:space="preserve"> careful levels of from extraordinarily river times letter seventeen rainfall, crossing a described of the ferry valley measurements and the </w:t>
+      </w:r>
+      <w:proofErr w:type="spellStart"/>
+      <w:r>
+        <w:t>the</w:t>
+      </w:r>
+      <w:proofErr w:type="spellEnd"/>
+      <w:r>
+        <w:t xml:space="preserve"> careful levels of from extraordinarily river times letter seventeen rainfall, crossing a described of the ferry valley measurements and the </w:t>
+      </w:r>
+      <w:proofErr w:type="spellStart"/>
+      <w:r>
+        <w:t>the</w:t>
+      </w:r>
+      <w:proofErr w:type="spellEnd"/>
+      <w:r>
+        <w:t xml:space="preserve"> careful levels of from extraordinarily river times letter seventeen rainfall, crossing</w:t>
       </w:r>
     </w:p>
     <w:sectPr>
@@ -1137,10 +3888,10 @@
 <file path=word/numbering.xml><?xml version="1.0" encoding="utf-8"?>
 <w:numbering xmlns:wpc="http://schemas.microsoft.com/office/word/2010/wordprocessingCanvas" xmlns:cx="http://schemas.microsoft.com/office/drawing/2014/chartex" xmlns:cx1="http://schemas.microsoft.com/office/drawing/2015/9/8/chartex" xmlns:cx2="http://schemas.microsoft.com/office/drawing/2015/10/21/chartex" xmlns:cx3="http://schemas.microsoft.com/office/drawing/2016/5/9/chartex" xmlns:cx4="http://schemas.microsoft.com/office/drawing/2016/5/10/chartex" xmlns:cx5="http://schemas.microsoft.com/office/drawing/2016/5/11/chartex" xmlns:cx6="http://schemas.microsoft.com/office/drawing/2016/5/12/chartex" xmlns:cx7="http://schemas.microsoft.com/office/drawing/2016/5/13/chartex" xmlns:cx8="http://schemas.microsoft.com/office/drawing/2016/5/14/chartex" xmlns:mc="http://schemas.openxmlformats.org/markup-compatibility/2006" xmlns:m="http://schemas.openxmlformats.org/officeDocument/2006/math" xmlns:aink="http://schemas.microsoft.com/office/drawing/2016/ink" xmlns:am3d="http://schemas.microsoft.com/office/drawing/2017/model3d" xmlns:oel="http://schemas.microsoft.com/office/2019/extlst" xmlns:r="http://schemas.openxmlformats.org/officeDocument/2006/relationships" xmlns:wp14="http://schemas.microsoft.com/office/word/2010/wordprocessingDrawing" xmlns:wp="http://schemas.openxmlformats.org/drawingml/2006/wordprocessingDrawing" xmlns:wpg="http://schemas.microsoft.com/office/word/2010/wordprocessingGroup" xmlns:wpi="http://schemas.microsoft.com/office/word/2010/wordprocessingInk" xmlns:wps="http://schemas.microsoft.com/office/word/2010/wordprocessingShape" xmlns:o="urn:schemas-microsoft-com:office:office" xmlns:v="urn:schemas-microsoft-com:vml" xmlns:w10="urn:schemas-microsoft-com:office:word" xmlns:w="http://schemas.openxmlformats.org/wordprocessingml/2006/main" xmlns:w14="http://schemas.microsoft.com/office/word/2010/wordml" xmlns:w15="http://schemas.microsoft.com/office/word/2012/wordml" xmlns:w16cex="http://schemas.microsoft.com/office/word/2018/wordml/cex" xmlns:w16cid="http://schemas.microsoft.com/office/word/2016/wordml/cid" xmlns:w16="http://schemas.microsoft.com/office/word/2018/wordml" xmlns:w16sdtdh="http://schemas.microsoft.com/office/word/2020/wordml/sdtdatahash" xmlns:w16sdtfl="http://schemas.microsoft.com/office/word/2024/wordml/sdtformatlock" xmlns:w16se="http://schemas.microsoft.com/office/word/2015/wordml/symex" xmlns:w16du="http://schemas.microsoft.com/office/word/2023/wordml/word16du" xmlns:wne="http://schemas.microsoft.com/office/word/2006/wordml" mc:Ignorable="w14 w15 w16se w16cid w16 w16cex w16sdtdh w16sdtfl w16du wp14">
   <w:abstractNum w:abstractNumId="0" w15:restartNumberingAfterBreak="0">
-    <w:nsid w:val="7237669F"/>
+    <w:nsid w:val="739732AA"/>
     <w:multiLevelType w:val="hybridMultilevel"/>
-    <w:tmpl w:val="7868B7B0"/>
-    <w:lvl w:ilvl="0" w:tplc="72E42D7E" w:tentative="1">
+    <w:tmpl w:val="A0DCBB70"/>
+    <w:lvl w:ilvl="0" w:tplc="35A44898" w:tentative="1">
       <w:start w:val="1"/>
       <w:numFmt w:val="bullet"/>
       <w:lvlText w:val="●"/>
@@ -1149,7 +3900,7 @@
         <w:ind w:left="720" w:hanging="360"/>
       </w:pPr>
     </w:lvl>
-    <w:lvl w:ilvl="1" w:tplc="C1C06674" w:tentative="1">
+    <w:lvl w:ilvl="1" w:tplc="5E2C3CA8" w:tentative="1">
       <w:start w:val="1"/>
       <w:numFmt w:val="bullet"/>
       <w:lvlText w:val="○"/>
@@ -1158,7 +3909,7 @@
         <w:ind w:left="1440" w:hanging="360"/>
       </w:pPr>
     </w:lvl>
-    <w:lvl w:ilvl="2" w:tplc="E87EA7AE" w:tentative="1">
+    <w:lvl w:ilvl="2" w:tplc="884E8502" w:tentative="1">
       <w:start w:val="1"/>
       <w:numFmt w:val="bullet"/>
       <w:lvlText w:val="■"/>
@@ -1167,7 +3918,7 @@
         <w:ind w:left="2160" w:hanging="360"/>
       </w:pPr>
     </w:lvl>
-    <w:lvl w:ilvl="3" w:tplc="323ECED0" w:tentative="1">
+    <w:lvl w:ilvl="3" w:tplc="16EE1082" w:tentative="1">
       <w:start w:val="1"/>
       <w:numFmt w:val="bullet"/>
       <w:lvlText w:val="●"/>
@@ -1176,7 +3927,7 @@
         <w:ind w:left="2880" w:hanging="360"/>
       </w:pPr>
     </w:lvl>
-    <w:lvl w:ilvl="4" w:tplc="77A203CA" w:tentative="1">
+    <w:lvl w:ilvl="4" w:tplc="B46073FE" w:tentative="1">
       <w:start w:val="1"/>
       <w:numFmt w:val="bullet"/>
       <w:lvlText w:val="○"/>
@@ -1185,7 +3936,7 @@
         <w:ind w:left="3600" w:hanging="360"/>
       </w:pPr>
     </w:lvl>
-    <w:lvl w:ilvl="5" w:tplc="A260DDE6" w:tentative="1">
+    <w:lvl w:ilvl="5" w:tplc="49604A1E" w:tentative="1">
       <w:start w:val="1"/>
       <w:numFmt w:val="bullet"/>
       <w:lvlText w:val="■"/>
@@ -1194,7 +3945,7 @@
         <w:ind w:left="4320" w:hanging="360"/>
       </w:pPr>
     </w:lvl>
-    <w:lvl w:ilvl="6" w:tplc="45E85DB2" w:tentative="1">
+    <w:lvl w:ilvl="6" w:tplc="F508DD00" w:tentative="1">
       <w:start w:val="1"/>
       <w:numFmt w:val="bullet"/>
       <w:lvlText w:val="●"/>
@@ -1203,7 +3954,7 @@
         <w:ind w:left="5040" w:hanging="360"/>
       </w:pPr>
     </w:lvl>
-    <w:lvl w:ilvl="7" w:tplc="0332F62C" w:tentative="1">
+    <w:lvl w:ilvl="7" w:tplc="C7B2AE9E" w:tentative="1">
       <w:start w:val="1"/>
       <w:numFmt w:val="bullet"/>
       <w:lvlText w:val="●"/>
@@ -1212,7 +3963,7 @@
         <w:ind w:left="5760" w:hanging="360"/>
       </w:pPr>
     </w:lvl>
-    <w:lvl w:ilvl="8" w:tplc="AB5A381C" w:tentative="1">
+    <w:lvl w:ilvl="8" w:tplc="8DCC6D10" w:tentative="1">
       <w:start w:val="1"/>
       <w:numFmt w:val="bullet"/>
       <w:lvlText w:val="●"/>
@@ -1222,7 +3973,7 @@
       </w:pPr>
     </w:lvl>
   </w:abstractNum>
-  <w:num w:numId="1" w16cid:durableId="669604258">
+  <w:num w:numId="1" w16cid:durableId="86535234">
     <w:abstractNumId w:val="0"/>
     <w:lvlOverride w:ilvl="0">
       <w:startOverride w:val="1"/>
@@ -1642,7 +4393,6 @@
       <w:outlineLvl w:val="0"/>
     </w:pPr>
     <w:rPr>
-      <w:rFonts w:ascii="Calibri Light" w:eastAsia="Calibri Light" w:hAnsi="Calibri Light" w:cs="Calibri Light"/>
       <w:color w:val="2F5496"/>
       <w:sz w:val="32"/>
       <w:szCs w:val="32"/>

</xml_diff>